<commit_message>
Finalize add the pseudocodes as well
</commit_message>
<xml_diff>
--- a/FC723 Portfolio Assessment 2 – Documentation/FC723 Portfolio Assessment 2 – P461989/Project Report.docx
+++ b/FC723 Portfolio Assessment 2 – Documentation/FC723 Portfolio Assessment 2 – P461989/Project Report.docx
@@ -277,6 +277,11 @@
     <w:p>
       <w:pPr>
         <w:pStyle w:val="ListParagraph"/>
+      </w:pPr>
+    </w:p>
+    <w:p>
+      <w:pPr>
+        <w:pStyle w:val="ListParagraph"/>
         <w:jc w:val="center"/>
       </w:pPr>
     </w:p>
@@ -376,6 +381,12 @@
         <w:jc w:val="center"/>
       </w:pPr>
     </w:p>
+    <w:p>
+      <w:pPr>
+        <w:pStyle w:val="ListParagraph"/>
+        <w:jc w:val="center"/>
+      </w:pPr>
+    </w:p>
     <w:p/>
     <w:p>
       <w:pPr>
@@ -389,7 +400,6 @@
         <w:rPr>
           <w:color w:val="A6A6A6" w:themeColor="background1" w:themeShade="A6"/>
         </w:rPr>
-        <w:lastRenderedPageBreak/>
         <w:t>ID:3075614 , Module: FC72</w:t>
       </w:r>
       <w:r>
@@ -522,7 +532,15 @@
         <w:t xml:space="preserve"> Transfer money</w:t>
       </w:r>
       <w:r>
-        <w:t>. All users have overdraft allowance that they can use when withdrawing money but not transfer money. If some one try to access account and entered the wrong password three times the account will locked out, which means no one can access the account or transfer to the account. The app store balance in another file in 2’complement but displayed to the users in decimal.</w:t>
+        <w:t xml:space="preserve">. All users have overdraft allowance that they can use when withdrawing money but not transfer money. If </w:t>
+      </w:r>
+      <w:proofErr w:type="spellStart"/>
+      <w:r>
+        <w:t>some one</w:t>
+      </w:r>
+      <w:proofErr w:type="spellEnd"/>
+      <w:r>
+        <w:t xml:space="preserve"> try to access account and entered the wrong password three times the account will locked out, which means no one can access the account or transfer to the account. The app store balance in another file in 2’complement but displayed to the users in decimal.</w:t>
       </w:r>
     </w:p>
     <w:p>
@@ -609,7 +627,21 @@
         <w:rPr>
           <w:color w:val="000000" w:themeColor="text1"/>
         </w:rPr>
-        <w:t>I began by drafting a brief pseudocode for each function to outline their implementation. Then, I proceeded to write the actual code.</w:t>
+        <w:t xml:space="preserve">I began by drafting a brief pseudocode for each function to outline their </w:t>
+      </w:r>
+      <w:bookmarkStart w:id="5" w:name="_Hlk190015952"/>
+      <w:r>
+        <w:rPr>
+          <w:color w:val="000000" w:themeColor="text1"/>
+        </w:rPr>
+        <w:t>implementation</w:t>
+      </w:r>
+      <w:bookmarkEnd w:id="5"/>
+      <w:r>
+        <w:rPr>
+          <w:color w:val="000000" w:themeColor="text1"/>
+        </w:rPr>
+        <w:t>. Then, I proceeded to write the actual code.</w:t>
       </w:r>
       <w:r>
         <w:rPr>
@@ -633,195 +665,11 @@
         <w:rPr>
           <w:color w:val="000000" w:themeColor="text1"/>
         </w:rPr>
-        <w:t xml:space="preserve">try to write only skeleton to see what I need to do, then try to write the code and play with it until I understand the path that I should work on. </w:t>
-      </w:r>
-      <w:r>
-        <w:rPr>
-          <w:color w:val="000000" w:themeColor="text1"/>
-        </w:rPr>
-        <w:t xml:space="preserve"> </w:t>
-      </w:r>
-    </w:p>
-    <w:p>
-      <w:pPr>
-        <w:pStyle w:val="ListParagraph"/>
-        <w:rPr>
-          <w:color w:val="000000" w:themeColor="text1"/>
-        </w:rPr>
-      </w:pPr>
-    </w:p>
-    <w:p>
-      <w:pPr>
-        <w:pStyle w:val="ListParagraph"/>
-        <w:rPr>
-          <w:color w:val="000000" w:themeColor="text1"/>
-        </w:rPr>
-      </w:pPr>
-    </w:p>
-    <w:p>
-      <w:pPr>
-        <w:pStyle w:val="ListParagraph"/>
-        <w:rPr>
-          <w:color w:val="000000" w:themeColor="text1"/>
-        </w:rPr>
-      </w:pPr>
-    </w:p>
-    <w:p>
-      <w:pPr>
-        <w:pStyle w:val="ListParagraph"/>
-        <w:rPr>
-          <w:color w:val="000000" w:themeColor="text1"/>
-        </w:rPr>
-      </w:pPr>
-    </w:p>
-    <w:p>
-      <w:pPr>
-        <w:pStyle w:val="ListParagraph"/>
-        <w:rPr>
-          <w:color w:val="000000" w:themeColor="text1"/>
-        </w:rPr>
-      </w:pPr>
-    </w:p>
-    <w:p>
-      <w:pPr>
-        <w:pStyle w:val="ListParagraph"/>
-        <w:rPr>
-          <w:color w:val="000000" w:themeColor="text1"/>
-        </w:rPr>
-      </w:pPr>
-    </w:p>
-    <w:p>
-      <w:pPr>
-        <w:pStyle w:val="ListParagraph"/>
-        <w:rPr>
-          <w:color w:val="000000" w:themeColor="text1"/>
-        </w:rPr>
-      </w:pPr>
-    </w:p>
-    <w:p>
-      <w:pPr>
-        <w:pStyle w:val="ListParagraph"/>
-        <w:rPr>
-          <w:color w:val="000000" w:themeColor="text1"/>
-        </w:rPr>
-      </w:pPr>
-    </w:p>
-    <w:p>
-      <w:pPr>
-        <w:pStyle w:val="ListParagraph"/>
-        <w:rPr>
-          <w:color w:val="000000" w:themeColor="text1"/>
-        </w:rPr>
-      </w:pPr>
-    </w:p>
-    <w:p>
-      <w:pPr>
-        <w:pStyle w:val="ListParagraph"/>
-        <w:rPr>
-          <w:color w:val="000000" w:themeColor="text1"/>
-        </w:rPr>
-      </w:pPr>
-    </w:p>
-    <w:p>
-      <w:pPr>
-        <w:pStyle w:val="ListParagraph"/>
-        <w:rPr>
-          <w:color w:val="000000" w:themeColor="text1"/>
-        </w:rPr>
-      </w:pPr>
-    </w:p>
-    <w:p>
-      <w:pPr>
-        <w:pStyle w:val="ListParagraph"/>
-        <w:rPr>
-          <w:color w:val="000000" w:themeColor="text1"/>
-        </w:rPr>
-      </w:pPr>
-    </w:p>
-    <w:p>
-      <w:pPr>
-        <w:pStyle w:val="ListParagraph"/>
-        <w:rPr>
-          <w:color w:val="000000" w:themeColor="text1"/>
-        </w:rPr>
-      </w:pPr>
-    </w:p>
-    <w:p>
-      <w:pPr>
-        <w:pStyle w:val="ListParagraph"/>
-        <w:rPr>
-          <w:color w:val="000000" w:themeColor="text1"/>
-        </w:rPr>
-      </w:pPr>
-    </w:p>
-    <w:p>
-      <w:pPr>
-        <w:pStyle w:val="ListParagraph"/>
-        <w:rPr>
-          <w:color w:val="000000" w:themeColor="text1"/>
-        </w:rPr>
-      </w:pPr>
-    </w:p>
-    <w:p>
-      <w:pPr>
-        <w:pStyle w:val="ListParagraph"/>
-        <w:rPr>
-          <w:color w:val="A6A6A6" w:themeColor="background1" w:themeShade="A6"/>
-        </w:rPr>
-      </w:pPr>
-      <w:bookmarkStart w:id="5" w:name="_Hlk189950142"/>
-      <w:r>
-        <w:rPr>
-          <w:color w:val="A6A6A6" w:themeColor="background1" w:themeShade="A6"/>
-        </w:rPr>
-        <w:lastRenderedPageBreak/>
-        <w:t>ID:3075614 , Module: FC72</w:t>
-      </w:r>
-      <w:r>
-        <w:rPr>
-          <w:color w:val="A6A6A6" w:themeColor="background1" w:themeShade="A6"/>
-        </w:rPr>
-        <w:t>3</w:t>
-      </w:r>
-      <w:r>
-        <w:rPr>
-          <w:color w:val="A6A6A6" w:themeColor="background1" w:themeShade="A6"/>
-        </w:rPr>
-        <w:t xml:space="preserve"> , </w:t>
-      </w:r>
-      <w:r>
-        <w:rPr>
-          <w:color w:val="A6A6A6" w:themeColor="background1" w:themeShade="A6"/>
-        </w:rPr>
-        <w:t>Sophie Norman</w:t>
-      </w:r>
-      <w:r>
-        <w:rPr>
-          <w:color w:val="A6A6A6" w:themeColor="background1" w:themeShade="A6"/>
-        </w:rPr>
-        <w:t>.</w:t>
-      </w:r>
-    </w:p>
-    <w:bookmarkEnd w:id="5"/>
-    <w:p>
-      <w:pPr>
-        <w:pStyle w:val="ListParagraph"/>
-        <w:rPr>
-          <w:color w:val="000000" w:themeColor="text1"/>
-        </w:rPr>
-      </w:pPr>
-    </w:p>
-    <w:p>
-      <w:pPr>
-        <w:pStyle w:val="ListParagraph"/>
-        <w:rPr>
-          <w:color w:val="000000" w:themeColor="text1"/>
-        </w:rPr>
-      </w:pPr>
-    </w:p>
-    <w:p>
-      <w:pPr>
-        <w:pStyle w:val="ListParagraph"/>
+        <w:t>try to write only skeleton to see what I need to do, then try to write the code and play with it until I understand the path that I should work on.</w:t>
+      </w:r>
+    </w:p>
+    <w:p>
+      <w:pPr>
         <w:rPr>
           <w:color w:val="000000" w:themeColor="text1"/>
         </w:rPr>
@@ -846,9 +694,68 @@
           <w:sz w:val="32"/>
           <w:szCs w:val="32"/>
         </w:rPr>
-        <w:t>How</w:t>
-      </w:r>
-      <w:r>
+        <w:t>Scalability.</w:t>
+      </w:r>
+    </w:p>
+    <w:p>
+      <w:pPr>
+        <w:pStyle w:val="ListParagraph"/>
+        <w:rPr>
+          <w:color w:val="000000" w:themeColor="text1"/>
+        </w:rPr>
+      </w:pPr>
+      <w:r>
+        <w:rPr>
+          <w:color w:val="000000" w:themeColor="text1"/>
+        </w:rPr>
+        <w:t xml:space="preserve">The app is scalable because of using the </w:t>
+      </w:r>
+      <w:proofErr w:type="gramStart"/>
+      <w:r>
+        <w:rPr>
+          <w:color w:val="000000" w:themeColor="text1"/>
+        </w:rPr>
+        <w:t>Object oriented</w:t>
+      </w:r>
+      <w:proofErr w:type="gramEnd"/>
+      <w:r>
+        <w:rPr>
+          <w:color w:val="000000" w:themeColor="text1"/>
+        </w:rPr>
+        <w:t xml:space="preserve"> programming approach, I Used constructor method and passed list of accounts (dictionaries) as an attribute, this will allow the app to get scalable. For </w:t>
+      </w:r>
+      <w:proofErr w:type="gramStart"/>
+      <w:r>
+        <w:rPr>
+          <w:color w:val="000000" w:themeColor="text1"/>
+        </w:rPr>
+        <w:t>example</w:t>
+      </w:r>
+      <w:proofErr w:type="gramEnd"/>
+      <w:r>
+        <w:rPr>
+          <w:color w:val="000000" w:themeColor="text1"/>
+        </w:rPr>
+        <w:t xml:space="preserve"> we could create another class and inherit the class </w:t>
+      </w:r>
+      <w:proofErr w:type="spellStart"/>
+      <w:r>
+        <w:rPr>
+          <w:color w:val="000000" w:themeColor="text1"/>
+        </w:rPr>
+        <w:t>BankingApp</w:t>
+      </w:r>
+      <w:proofErr w:type="spellEnd"/>
+      <w:r>
+        <w:rPr>
+          <w:color w:val="000000" w:themeColor="text1"/>
+        </w:rPr>
+        <w:t xml:space="preserve"> but passed a new list off special accounts for special clients add their special methods on the new class.</w:t>
+      </w:r>
+    </w:p>
+    <w:p>
+      <w:pPr>
+        <w:pStyle w:val="ListParagraph"/>
         <w:rPr>
           <w:b/>
           <w:bCs/>
@@ -856,9 +763,112 @@
           <w:sz w:val="32"/>
           <w:szCs w:val="32"/>
         </w:rPr>
-        <w:t xml:space="preserve"> </w:t>
-      </w:r>
-      <w:r>
+      </w:pPr>
+      <w:proofErr w:type="gramStart"/>
+      <w:r>
+        <w:rPr>
+          <w:color w:val="000000" w:themeColor="text1"/>
+        </w:rPr>
+        <w:t>So</w:t>
+      </w:r>
+      <w:proofErr w:type="gramEnd"/>
+      <w:r>
+        <w:rPr>
+          <w:color w:val="000000" w:themeColor="text1"/>
+        </w:rPr>
+        <w:t xml:space="preserve"> the special clients will get feature same as normal users and more.</w:t>
+      </w:r>
+    </w:p>
+    <w:p>
+      <w:pPr>
+        <w:rPr>
+          <w:color w:val="000000" w:themeColor="text1"/>
+        </w:rPr>
+      </w:pPr>
+    </w:p>
+    <w:p>
+      <w:pPr>
+        <w:rPr>
+          <w:color w:val="000000" w:themeColor="text1"/>
+        </w:rPr>
+      </w:pPr>
+    </w:p>
+    <w:p>
+      <w:pPr>
+        <w:pStyle w:val="ListParagraph"/>
+        <w:rPr>
+          <w:color w:val="000000" w:themeColor="text1"/>
+        </w:rPr>
+      </w:pPr>
+    </w:p>
+    <w:p>
+      <w:pPr>
+        <w:pStyle w:val="ListParagraph"/>
+        <w:rPr>
+          <w:color w:val="A6A6A6" w:themeColor="background1" w:themeShade="A6"/>
+        </w:rPr>
+      </w:pPr>
+      <w:bookmarkStart w:id="6" w:name="_Hlk189950142"/>
+      <w:r>
+        <w:rPr>
+          <w:color w:val="A6A6A6" w:themeColor="background1" w:themeShade="A6"/>
+        </w:rPr>
+        <w:lastRenderedPageBreak/>
+        <w:t>ID:3075614 , Module: FC72</w:t>
+      </w:r>
+      <w:r>
+        <w:rPr>
+          <w:color w:val="A6A6A6" w:themeColor="background1" w:themeShade="A6"/>
+        </w:rPr>
+        <w:t>3</w:t>
+      </w:r>
+      <w:r>
+        <w:rPr>
+          <w:color w:val="A6A6A6" w:themeColor="background1" w:themeShade="A6"/>
+        </w:rPr>
+        <w:t xml:space="preserve"> , </w:t>
+      </w:r>
+      <w:r>
+        <w:rPr>
+          <w:color w:val="A6A6A6" w:themeColor="background1" w:themeShade="A6"/>
+        </w:rPr>
+        <w:t>Sophie Norman</w:t>
+      </w:r>
+      <w:r>
+        <w:rPr>
+          <w:color w:val="A6A6A6" w:themeColor="background1" w:themeShade="A6"/>
+        </w:rPr>
+        <w:t>.</w:t>
+      </w:r>
+    </w:p>
+    <w:bookmarkEnd w:id="6"/>
+    <w:p>
+      <w:pPr>
+        <w:pStyle w:val="ListParagraph"/>
+        <w:rPr>
+          <w:color w:val="000000" w:themeColor="text1"/>
+        </w:rPr>
+      </w:pPr>
+    </w:p>
+    <w:p>
+      <w:pPr>
+        <w:pStyle w:val="ListParagraph"/>
+        <w:rPr>
+          <w:color w:val="000000" w:themeColor="text1"/>
+        </w:rPr>
+      </w:pPr>
+    </w:p>
+    <w:p>
+      <w:pPr>
+        <w:pStyle w:val="ListParagraph"/>
+        <w:rPr>
+          <w:color w:val="000000" w:themeColor="text1"/>
+        </w:rPr>
+      </w:pPr>
+    </w:p>
+    <w:p>
+      <w:pPr>
+        <w:pStyle w:val="ListParagraph"/>
         <w:rPr>
           <w:b/>
           <w:bCs/>
@@ -866,8 +876,7 @@
           <w:sz w:val="32"/>
           <w:szCs w:val="32"/>
         </w:rPr>
-        <w:t>does it works</w:t>
-      </w:r>
+      </w:pPr>
       <w:r>
         <w:rPr>
           <w:b/>
@@ -876,6 +885,48 @@
           <w:sz w:val="32"/>
           <w:szCs w:val="32"/>
         </w:rPr>
+        <w:t>How</w:t>
+      </w:r>
+      <w:r>
+        <w:rPr>
+          <w:b/>
+          <w:bCs/>
+          <w:color w:val="0E2841" w:themeColor="text2"/>
+          <w:sz w:val="32"/>
+          <w:szCs w:val="32"/>
+        </w:rPr>
+        <w:t xml:space="preserve"> </w:t>
+      </w:r>
+      <w:r>
+        <w:rPr>
+          <w:b/>
+          <w:bCs/>
+          <w:color w:val="0E2841" w:themeColor="text2"/>
+          <w:sz w:val="32"/>
+          <w:szCs w:val="32"/>
+        </w:rPr>
+        <w:t xml:space="preserve">does it </w:t>
+      </w:r>
+      <w:proofErr w:type="gramStart"/>
+      <w:r>
+        <w:rPr>
+          <w:b/>
+          <w:bCs/>
+          <w:color w:val="0E2841" w:themeColor="text2"/>
+          <w:sz w:val="32"/>
+          <w:szCs w:val="32"/>
+        </w:rPr>
+        <w:t>works</w:t>
+      </w:r>
+      <w:proofErr w:type="gramEnd"/>
+      <w:r>
+        <w:rPr>
+          <w:b/>
+          <w:bCs/>
+          <w:color w:val="0E2841" w:themeColor="text2"/>
+          <w:sz w:val="32"/>
+          <w:szCs w:val="32"/>
+        </w:rPr>
         <w:t>?</w:t>
       </w:r>
     </w:p>
@@ -889,6 +940,7 @@
           <w:szCs w:val="20"/>
         </w:rPr>
       </w:pPr>
+      <w:proofErr w:type="gramStart"/>
       <w:r>
         <w:rPr>
           <w:b/>
@@ -897,7 +949,62 @@
           <w:sz w:val="20"/>
           <w:szCs w:val="20"/>
         </w:rPr>
-        <w:t>First we start with the initial Menu. This menu options are Sign in, Log in and exit app. After the user choose an option the initial menu takes the information needed then let the user access the main app interface.</w:t>
+        <w:t>First</w:t>
+      </w:r>
+      <w:proofErr w:type="gramEnd"/>
+      <w:r>
+        <w:rPr>
+          <w:b/>
+          <w:bCs/>
+          <w:color w:val="000000" w:themeColor="text1"/>
+          <w:sz w:val="20"/>
+          <w:szCs w:val="20"/>
+        </w:rPr>
+        <w:t xml:space="preserve"> we start with the initial Menu. This menu options are Sign in, </w:t>
+      </w:r>
+      <w:proofErr w:type="gramStart"/>
+      <w:r>
+        <w:rPr>
+          <w:b/>
+          <w:bCs/>
+          <w:color w:val="000000" w:themeColor="text1"/>
+          <w:sz w:val="20"/>
+          <w:szCs w:val="20"/>
+        </w:rPr>
+        <w:t>Log</w:t>
+      </w:r>
+      <w:proofErr w:type="gramEnd"/>
+      <w:r>
+        <w:rPr>
+          <w:b/>
+          <w:bCs/>
+          <w:color w:val="000000" w:themeColor="text1"/>
+          <w:sz w:val="20"/>
+          <w:szCs w:val="20"/>
+        </w:rPr>
+        <w:t xml:space="preserve"> in and exit app. After the user choose an </w:t>
+      </w:r>
+      <w:proofErr w:type="gramStart"/>
+      <w:r>
+        <w:rPr>
+          <w:b/>
+          <w:bCs/>
+          <w:color w:val="000000" w:themeColor="text1"/>
+          <w:sz w:val="20"/>
+          <w:szCs w:val="20"/>
+        </w:rPr>
+        <w:t>option</w:t>
+      </w:r>
+      <w:proofErr w:type="gramEnd"/>
+      <w:r>
+        <w:rPr>
+          <w:b/>
+          <w:bCs/>
+          <w:color w:val="000000" w:themeColor="text1"/>
+          <w:sz w:val="20"/>
+          <w:szCs w:val="20"/>
+        </w:rPr>
+        <w:t xml:space="preserve"> the initial menu takes the information needed then let the user access the main app interface.</w:t>
       </w:r>
     </w:p>
     <w:p>
@@ -982,6 +1089,7 @@
           </wp:anchor>
         </w:drawing>
       </w:r>
+      <w:proofErr w:type="spellStart"/>
       <w:r>
         <w:rPr>
           <w:b/>
@@ -990,11 +1098,10 @@
           <w:sz w:val="20"/>
           <w:szCs w:val="20"/>
         </w:rPr>
-        <w:t>Initial_Menu(self):</w:t>
-      </w:r>
-    </w:p>
-    <w:p>
-      <w:pPr>
+        <w:t>Initial_Menu</w:t>
+      </w:r>
+      <w:proofErr w:type="spellEnd"/>
+      <w:r>
         <w:rPr>
           <w:b/>
           <w:bCs/>
@@ -1002,42 +1109,14 @@
           <w:sz w:val="20"/>
           <w:szCs w:val="20"/>
         </w:rPr>
-      </w:pPr>
-    </w:p>
-    <w:p>
-      <w:pPr>
-        <w:rPr>
-          <w:color w:val="000000" w:themeColor="text1"/>
-        </w:rPr>
-      </w:pPr>
-      <w:r>
-        <w:rPr>
-          <w:color w:val="000000" w:themeColor="text1"/>
-        </w:rPr>
-        <w:t>This function is triggered when the user selects option 1 (Sign In). Here, a new username is created after verifying its availability and ensuring it</w:t>
-      </w:r>
-      <w:r>
-        <w:rPr>
-          <w:color w:val="000000" w:themeColor="text1"/>
-        </w:rPr>
-        <w:t>s valid</w:t>
-      </w:r>
-      <w:r>
-        <w:rPr>
-          <w:color w:val="000000" w:themeColor="text1"/>
-        </w:rPr>
-        <w:t>. Next, a password is set, which must be between 8 and 16 characters long. Finally, the user must deposit an initial amount, ensuring the input is a valid integer.</w:t>
-      </w:r>
-      <w:r>
-        <w:rPr>
-          <w:color w:val="000000" w:themeColor="text1"/>
-        </w:rPr>
-        <w:t xml:space="preserve"> At any point when you choose an option you can enter space then enter to go back.</w:t>
-      </w:r>
-    </w:p>
-    <w:p>
-      <w:pPr>
-        <w:rPr>
+        <w:t>(self):</w:t>
+      </w:r>
+    </w:p>
+    <w:p>
+      <w:pPr>
+        <w:rPr>
+          <w:b/>
+          <w:bCs/>
           <w:color w:val="000000" w:themeColor="text1"/>
           <w:sz w:val="20"/>
           <w:szCs w:val="20"/>
@@ -1048,6 +1127,25 @@
       <w:pPr>
         <w:rPr>
           <w:color w:val="000000" w:themeColor="text1"/>
+        </w:rPr>
+      </w:pPr>
+      <w:r>
+        <w:rPr>
+          <w:color w:val="000000" w:themeColor="text1"/>
+        </w:rPr>
+        <w:t>This function is triggered when the user selects option 1 (Sign In). Here, a new username is created after verifying its availability and ensuring its valid. Next, a password is set, which must be between 8 and 16 characters long. Finally, the user must deposit an initial amount, ensuring the input is a valid integer.</w:t>
+      </w:r>
+      <w:r>
+        <w:rPr>
+          <w:color w:val="000000" w:themeColor="text1"/>
+        </w:rPr>
+        <w:t xml:space="preserve"> At any point when you choose an option you can enter space then enter to go back.</w:t>
+      </w:r>
+    </w:p>
+    <w:p>
+      <w:pPr>
+        <w:rPr>
+          <w:color w:val="000000" w:themeColor="text1"/>
           <w:sz w:val="20"/>
           <w:szCs w:val="20"/>
         </w:rPr>
@@ -1092,14 +1190,14 @@
     <w:p>
       <w:pPr>
         <w:rPr>
-          <w:b/>
-          <w:bCs/>
           <w:color w:val="000000" w:themeColor="text1"/>
           <w:sz w:val="20"/>
           <w:szCs w:val="20"/>
         </w:rPr>
       </w:pPr>
-      <w:r>
+    </w:p>
+    <w:p>
+      <w:pPr>
         <w:rPr>
           <w:b/>
           <w:bCs/>
@@ -1107,11 +1205,8 @@
           <w:sz w:val="20"/>
           <w:szCs w:val="20"/>
         </w:rPr>
-        <w:br w:type="textWrapping" w:clear="all"/>
-      </w:r>
-    </w:p>
-    <w:p>
-      <w:pPr>
+      </w:pPr>
+      <w:r>
         <w:rPr>
           <w:b/>
           <w:bCs/>
@@ -1119,7 +1214,8 @@
           <w:sz w:val="20"/>
           <w:szCs w:val="20"/>
         </w:rPr>
-      </w:pPr>
+        <w:br w:type="textWrapping" w:clear="all"/>
+      </w:r>
     </w:p>
     <w:p>
       <w:pPr>
@@ -1145,11 +1241,23 @@
     </w:p>
     <w:p>
       <w:pPr>
+        <w:rPr>
+          <w:b/>
+          <w:bCs/>
+          <w:color w:val="000000" w:themeColor="text1"/>
+          <w:sz w:val="20"/>
+          <w:szCs w:val="20"/>
+        </w:rPr>
+      </w:pPr>
+    </w:p>
+    <w:p>
+      <w:pPr>
         <w:pStyle w:val="ListParagraph"/>
         <w:rPr>
           <w:color w:val="A6A6A6" w:themeColor="background1" w:themeShade="A6"/>
         </w:rPr>
       </w:pPr>
+      <w:bookmarkStart w:id="7" w:name="_Hlk190010438"/>
       <w:r>
         <w:rPr>
           <w:color w:val="A6A6A6" w:themeColor="background1" w:themeShade="A6"/>
@@ -1182,6 +1290,7 @@
         <w:t>.</w:t>
       </w:r>
     </w:p>
+    <w:bookmarkEnd w:id="7"/>
     <w:p>
       <w:pPr>
         <w:rPr>
@@ -1274,6 +1383,7 @@
           </wp:anchor>
         </w:drawing>
       </w:r>
+      <w:proofErr w:type="spellStart"/>
       <w:r>
         <w:rPr>
           <w:b/>
@@ -1282,7 +1392,18 @@
           <w:sz w:val="20"/>
           <w:szCs w:val="20"/>
         </w:rPr>
-        <w:t>Initial_Menu():</w:t>
+        <w:t>Initial_Menu</w:t>
+      </w:r>
+      <w:proofErr w:type="spellEnd"/>
+      <w:r>
+        <w:rPr>
+          <w:b/>
+          <w:bCs/>
+          <w:color w:val="000000" w:themeColor="text1"/>
+          <w:sz w:val="20"/>
+          <w:szCs w:val="20"/>
+        </w:rPr>
+        <w:t>():</w:t>
       </w:r>
     </w:p>
     <w:p>
@@ -1301,20 +1422,38 @@
           <w:sz w:val="22"/>
           <w:szCs w:val="22"/>
         </w:rPr>
-        <w:t>When the user selects option 2 (Log In) to access an existing account, they must first enter their username. If the username does not exist in the system, they will be prompted to enter it again. If the username is found, the system checks whether the account is locked. If locked, the user is redirected to the main menu. Otherwise, they are prompted to enter their password. If the password is incorrect  they have up to three attempts to enter the correct one. After three failed attempts the account is locked. If the correct password is entered, the user gains access to the main</w:t>
-      </w:r>
-      <w:r>
-        <w:rPr>
-          <w:rFonts w:asciiTheme="majorHAnsi" w:hAnsiTheme="majorHAnsi"/>
-        </w:rPr>
-        <w:t xml:space="preserve"> </w:t>
-      </w:r>
+        <w:t xml:space="preserve">When the user selects option 2 (Log In) to access an existing account, they must first enter their username. If the username does not exist in the system, they will be prompted to enter it again. If the username is found, the system checks whether the account is locked. If locked, the user is redirected to the main menu. Otherwise, they are prompted to enter their password. If the password is </w:t>
+      </w:r>
+      <w:proofErr w:type="gramStart"/>
       <w:r>
         <w:rPr>
           <w:rFonts w:asciiTheme="majorHAnsi" w:hAnsiTheme="majorHAnsi"/>
           <w:sz w:val="22"/>
           <w:szCs w:val="22"/>
         </w:rPr>
+        <w:t>incorrect</w:t>
+      </w:r>
+      <w:proofErr w:type="gramEnd"/>
+      <w:r>
+        <w:rPr>
+          <w:rFonts w:asciiTheme="majorHAnsi" w:hAnsiTheme="majorHAnsi"/>
+          <w:sz w:val="22"/>
+          <w:szCs w:val="22"/>
+        </w:rPr>
+        <w:t xml:space="preserve">  they have up to three attempts to enter the correct one. After three failed attempts the account is locked. If the correct password is entered, the user gains access to the main</w:t>
+      </w:r>
+      <w:r>
+        <w:rPr>
+          <w:rFonts w:asciiTheme="majorHAnsi" w:hAnsiTheme="majorHAnsi"/>
+        </w:rPr>
+        <w:t xml:space="preserve"> </w:t>
+      </w:r>
+      <w:r>
+        <w:rPr>
+          <w:rFonts w:asciiTheme="majorHAnsi" w:hAnsiTheme="majorHAnsi"/>
+          <w:sz w:val="22"/>
+          <w:szCs w:val="22"/>
+        </w:rPr>
         <w:t>interface.</w:t>
       </w:r>
       <w:r>
@@ -1326,18 +1465,18 @@
         </w:rPr>
         <w:br w:type="textWrapping" w:clear="all"/>
       </w:r>
-      <w:r>
-        <w:rPr>
-          <w:rFonts w:asciiTheme="majorHAnsi" w:hAnsiTheme="majorHAnsi"/>
+    </w:p>
+    <w:p>
+      <w:pPr>
+        <w:rPr>
+          <w:b/>
+          <w:bCs/>
           <w:color w:val="000000" w:themeColor="text1"/>
           <w:sz w:val="20"/>
           <w:szCs w:val="20"/>
         </w:rPr>
-        <w:br w:type="textWrapping" w:clear="all"/>
-      </w:r>
-    </w:p>
-    <w:p>
-      <w:pPr>
+      </w:pPr>
+      <w:r>
         <w:rPr>
           <w:b/>
           <w:bCs/>
@@ -1345,7 +1484,8 @@
           <w:sz w:val="20"/>
           <w:szCs w:val="20"/>
         </w:rPr>
-      </w:pPr>
+        <w:t>Those are all menus in the app.</w:t>
+      </w:r>
     </w:p>
     <w:p>
       <w:pPr>
@@ -1357,7 +1497,9 @@
           <w:szCs w:val="20"/>
         </w:rPr>
       </w:pPr>
-      <w:r>
+    </w:p>
+    <w:p>
+      <w:pPr>
         <w:rPr>
           <w:b/>
           <w:bCs/>
@@ -1365,20 +1507,65 @@
           <w:sz w:val="20"/>
           <w:szCs w:val="20"/>
         </w:rPr>
-        <w:br w:type="textWrapping" w:clear="all"/>
-      </w:r>
-    </w:p>
-    <w:p>
-      <w:pPr>
-        <w:pStyle w:val="ListParagraph"/>
-        <w:rPr>
-          <w:color w:val="0E2841" w:themeColor="text2"/>
-        </w:rPr>
-      </w:pPr>
-    </w:p>
-    <w:p>
-      <w:pPr>
-        <w:pStyle w:val="ListParagraph"/>
+      </w:pPr>
+    </w:p>
+    <w:p>
+      <w:pPr>
+        <w:rPr>
+          <w:b/>
+          <w:bCs/>
+          <w:color w:val="000000" w:themeColor="text1"/>
+          <w:sz w:val="20"/>
+          <w:szCs w:val="20"/>
+        </w:rPr>
+      </w:pPr>
+    </w:p>
+    <w:p>
+      <w:pPr>
+        <w:rPr>
+          <w:b/>
+          <w:bCs/>
+          <w:color w:val="000000" w:themeColor="text1"/>
+          <w:sz w:val="20"/>
+          <w:szCs w:val="20"/>
+        </w:rPr>
+      </w:pPr>
+    </w:p>
+    <w:p>
+      <w:pPr>
+        <w:rPr>
+          <w:b/>
+          <w:bCs/>
+          <w:color w:val="000000" w:themeColor="text1"/>
+          <w:sz w:val="20"/>
+          <w:szCs w:val="20"/>
+        </w:rPr>
+      </w:pPr>
+    </w:p>
+    <w:p>
+      <w:pPr>
+        <w:rPr>
+          <w:b/>
+          <w:bCs/>
+          <w:color w:val="000000" w:themeColor="text1"/>
+          <w:sz w:val="20"/>
+          <w:szCs w:val="20"/>
+        </w:rPr>
+      </w:pPr>
+    </w:p>
+    <w:p>
+      <w:pPr>
+        <w:rPr>
+          <w:b/>
+          <w:bCs/>
+          <w:color w:val="000000" w:themeColor="text1"/>
+          <w:sz w:val="20"/>
+          <w:szCs w:val="20"/>
+        </w:rPr>
+      </w:pPr>
+    </w:p>
+    <w:p>
+      <w:pPr>
         <w:rPr>
           <w:color w:val="000000" w:themeColor="text1"/>
           <w:sz w:val="28"/>
@@ -1390,329 +1577,40 @@
       <w:pPr>
         <w:pStyle w:val="ListParagraph"/>
         <w:rPr>
-          <w:color w:val="000000" w:themeColor="text1"/>
-          <w:sz w:val="28"/>
-          <w:szCs w:val="28"/>
-        </w:rPr>
-      </w:pPr>
-    </w:p>
-    <w:p>
-      <w:pPr>
-        <w:pStyle w:val="ListParagraph"/>
-        <w:rPr>
-          <w:color w:val="000000" w:themeColor="text1"/>
-          <w:sz w:val="28"/>
-          <w:szCs w:val="28"/>
-        </w:rPr>
-      </w:pPr>
-    </w:p>
-    <w:p>
-      <w:pPr>
-        <w:pStyle w:val="ListParagraph"/>
-        <w:rPr>
-          <w:color w:val="000000" w:themeColor="text1"/>
-          <w:sz w:val="28"/>
-          <w:szCs w:val="28"/>
-        </w:rPr>
-      </w:pPr>
-    </w:p>
-    <w:p>
-      <w:pPr>
-        <w:pStyle w:val="ListParagraph"/>
-        <w:rPr>
-          <w:color w:val="000000" w:themeColor="text1"/>
-          <w:sz w:val="28"/>
-          <w:szCs w:val="28"/>
-        </w:rPr>
-      </w:pPr>
-    </w:p>
-    <w:p>
-      <w:pPr>
-        <w:pStyle w:val="ListParagraph"/>
-        <w:rPr>
-          <w:color w:val="000000" w:themeColor="text1"/>
-          <w:sz w:val="28"/>
-          <w:szCs w:val="28"/>
-        </w:rPr>
-      </w:pPr>
-    </w:p>
-    <w:p>
-      <w:pPr>
-        <w:pStyle w:val="ListParagraph"/>
-        <w:rPr>
-          <w:color w:val="000000" w:themeColor="text1"/>
-          <w:sz w:val="28"/>
-          <w:szCs w:val="28"/>
-        </w:rPr>
-      </w:pPr>
-    </w:p>
-    <w:p>
-      <w:pPr>
-        <w:pStyle w:val="ListParagraph"/>
-        <w:rPr>
-          <w:color w:val="000000" w:themeColor="text1"/>
-          <w:sz w:val="28"/>
-          <w:szCs w:val="28"/>
-        </w:rPr>
-      </w:pPr>
-    </w:p>
-    <w:p>
-      <w:pPr>
-        <w:pStyle w:val="ListParagraph"/>
-        <w:rPr>
-          <w:color w:val="000000" w:themeColor="text1"/>
-          <w:sz w:val="28"/>
-          <w:szCs w:val="28"/>
-        </w:rPr>
-      </w:pPr>
-    </w:p>
-    <w:p>
-      <w:pPr>
-        <w:rPr>
-          <w:color w:val="000000" w:themeColor="text1"/>
-          <w:sz w:val="28"/>
-          <w:szCs w:val="28"/>
-        </w:rPr>
-      </w:pPr>
-    </w:p>
-    <w:p>
-      <w:pPr>
-        <w:rPr>
-          <w:color w:val="000000" w:themeColor="text1"/>
-          <w:sz w:val="28"/>
-          <w:szCs w:val="28"/>
-        </w:rPr>
-      </w:pPr>
-    </w:p>
-    <w:p>
-      <w:pPr>
-        <w:rPr>
-          <w:color w:val="000000" w:themeColor="text1"/>
-          <w:sz w:val="28"/>
-          <w:szCs w:val="28"/>
-        </w:rPr>
-      </w:pPr>
-    </w:p>
-    <w:p>
-      <w:pPr>
-        <w:rPr>
-          <w:color w:val="000000" w:themeColor="text1"/>
-          <w:sz w:val="28"/>
-          <w:szCs w:val="28"/>
-        </w:rPr>
-      </w:pPr>
-    </w:p>
-    <w:p>
-      <w:pPr>
-        <w:rPr>
-          <w:color w:val="000000" w:themeColor="text1"/>
-          <w:sz w:val="28"/>
-          <w:szCs w:val="28"/>
-        </w:rPr>
-      </w:pPr>
-    </w:p>
-    <w:p>
-      <w:pPr>
-        <w:rPr>
-          <w:color w:val="000000" w:themeColor="text1"/>
-          <w:sz w:val="28"/>
-          <w:szCs w:val="28"/>
-        </w:rPr>
-      </w:pPr>
-    </w:p>
-    <w:p>
-      <w:pPr>
-        <w:rPr>
-          <w:color w:val="000000" w:themeColor="text1"/>
-          <w:sz w:val="28"/>
-          <w:szCs w:val="28"/>
-        </w:rPr>
-      </w:pPr>
-    </w:p>
-    <w:p>
-      <w:pPr>
-        <w:rPr>
-          <w:color w:val="000000" w:themeColor="text1"/>
-          <w:sz w:val="28"/>
-          <w:szCs w:val="28"/>
-        </w:rPr>
-      </w:pPr>
-    </w:p>
-    <w:p>
-      <w:pPr>
-        <w:rPr>
-          <w:color w:val="000000" w:themeColor="text1"/>
-          <w:sz w:val="28"/>
-          <w:szCs w:val="28"/>
-        </w:rPr>
-      </w:pPr>
-    </w:p>
-    <w:p>
-      <w:pPr>
-        <w:rPr>
-          <w:color w:val="000000" w:themeColor="text1"/>
-          <w:sz w:val="28"/>
-          <w:szCs w:val="28"/>
-        </w:rPr>
-      </w:pPr>
-    </w:p>
-    <w:p>
-      <w:pPr>
-        <w:rPr>
-          <w:color w:val="000000" w:themeColor="text1"/>
-          <w:sz w:val="28"/>
-          <w:szCs w:val="28"/>
-        </w:rPr>
-      </w:pPr>
-    </w:p>
-    <w:p>
-      <w:pPr>
-        <w:rPr>
-          <w:color w:val="000000" w:themeColor="text1"/>
-          <w:sz w:val="28"/>
-          <w:szCs w:val="28"/>
-        </w:rPr>
-      </w:pPr>
-    </w:p>
-    <w:p>
-      <w:pPr>
-        <w:rPr>
-          <w:color w:val="000000" w:themeColor="text1"/>
-          <w:sz w:val="28"/>
-          <w:szCs w:val="28"/>
-        </w:rPr>
-      </w:pPr>
-    </w:p>
-    <w:p>
-      <w:pPr>
-        <w:rPr>
-          <w:color w:val="000000" w:themeColor="text1"/>
-          <w:sz w:val="28"/>
-          <w:szCs w:val="28"/>
-        </w:rPr>
-      </w:pPr>
-    </w:p>
-    <w:p>
-      <w:pPr>
-        <w:rPr>
-          <w:color w:val="000000" w:themeColor="text1"/>
-          <w:sz w:val="28"/>
-          <w:szCs w:val="28"/>
-        </w:rPr>
-      </w:pPr>
-    </w:p>
-    <w:p>
-      <w:pPr>
-        <w:rPr>
-          <w:color w:val="000000" w:themeColor="text1"/>
-          <w:sz w:val="28"/>
-          <w:szCs w:val="28"/>
-        </w:rPr>
-      </w:pPr>
-    </w:p>
-    <w:p>
-      <w:pPr>
-        <w:rPr>
-          <w:color w:val="000000" w:themeColor="text1"/>
-          <w:sz w:val="28"/>
-          <w:szCs w:val="28"/>
-        </w:rPr>
-      </w:pPr>
-    </w:p>
-    <w:p>
-      <w:pPr>
-        <w:rPr>
-          <w:color w:val="000000" w:themeColor="text1"/>
-          <w:sz w:val="28"/>
-          <w:szCs w:val="28"/>
-        </w:rPr>
-      </w:pPr>
-    </w:p>
-    <w:p>
-      <w:pPr>
-        <w:rPr>
-          <w:color w:val="000000" w:themeColor="text1"/>
-          <w:sz w:val="28"/>
-          <w:szCs w:val="28"/>
-        </w:rPr>
-      </w:pPr>
-    </w:p>
-    <w:p>
-      <w:pPr>
-        <w:rPr>
-          <w:color w:val="000000" w:themeColor="text1"/>
-          <w:sz w:val="28"/>
-          <w:szCs w:val="28"/>
-        </w:rPr>
-      </w:pPr>
-    </w:p>
-    <w:p>
-      <w:pPr>
-        <w:rPr>
-          <w:color w:val="000000" w:themeColor="text1"/>
-          <w:sz w:val="28"/>
-          <w:szCs w:val="28"/>
-        </w:rPr>
-      </w:pPr>
-    </w:p>
-    <w:p>
-      <w:pPr>
-        <w:rPr>
-          <w:color w:val="000000" w:themeColor="text1"/>
-          <w:sz w:val="28"/>
-          <w:szCs w:val="28"/>
-        </w:rPr>
-      </w:pPr>
-    </w:p>
-    <w:p>
-      <w:pPr>
-        <w:rPr>
-          <w:color w:val="000000" w:themeColor="text1"/>
-          <w:sz w:val="28"/>
-          <w:szCs w:val="28"/>
-        </w:rPr>
-      </w:pPr>
-    </w:p>
-    <w:p>
-      <w:pPr>
-        <w:pStyle w:val="ListParagraph"/>
-        <w:rPr>
           <w:color w:val="A6A6A6" w:themeColor="background1" w:themeShade="A6"/>
         </w:rPr>
       </w:pPr>
-      <w:bookmarkStart w:id="6" w:name="_Hlk188114868"/>
       <w:r>
         <w:rPr>
           <w:color w:val="A6A6A6" w:themeColor="background1" w:themeShade="A6"/>
         </w:rPr>
         <w:lastRenderedPageBreak/>
-        <w:t>ID:3075614 , Module: FC724 , Jack Parkinson.</w:t>
-      </w:r>
-    </w:p>
-    <w:bookmarkEnd w:id="6"/>
-    <w:p>
-      <w:pPr>
-        <w:pStyle w:val="ListParagraph"/>
+        <w:t>ID:3075614 , Module: FC72</w:t>
+      </w:r>
+      <w:r>
         <w:rPr>
           <w:color w:val="A6A6A6" w:themeColor="background1" w:themeShade="A6"/>
         </w:rPr>
-      </w:pPr>
-    </w:p>
-    <w:p>
-      <w:pPr>
-        <w:pStyle w:val="ListParagraph"/>
+        <w:t>3</w:t>
+      </w:r>
+      <w:r>
         <w:rPr>
           <w:color w:val="A6A6A6" w:themeColor="background1" w:themeShade="A6"/>
         </w:rPr>
-      </w:pPr>
-    </w:p>
-    <w:p>
-      <w:pPr>
-        <w:pStyle w:val="ListParagraph"/>
+        <w:t xml:space="preserve"> , </w:t>
+      </w:r>
+      <w:r>
         <w:rPr>
           <w:color w:val="A6A6A6" w:themeColor="background1" w:themeShade="A6"/>
         </w:rPr>
-      </w:pPr>
+        <w:t>Sophie Norman</w:t>
+      </w:r>
+      <w:r>
+        <w:rPr>
+          <w:color w:val="A6A6A6" w:themeColor="background1" w:themeShade="A6"/>
+        </w:rPr>
+        <w:t>.</w:t>
+      </w:r>
     </w:p>
     <w:p>
       <w:pPr>
@@ -1725,7 +1623,7 @@
           <w:szCs w:val="32"/>
         </w:rPr>
       </w:pPr>
-      <w:bookmarkStart w:id="7" w:name="_Hlk188197359"/>
+      <w:bookmarkStart w:id="8" w:name="_Hlk188197359"/>
       <w:r>
         <w:rPr>
           <w:b/>
@@ -1736,7 +1634,7 @@
         </w:rPr>
         <w:t>Testing</w:t>
       </w:r>
-      <w:bookmarkEnd w:id="7"/>
+      <w:bookmarkEnd w:id="8"/>
       <w:r>
         <w:rPr>
           <w:b/>
@@ -1752,6 +1650,32 @@
       <w:pPr>
         <w:pStyle w:val="ListParagraph"/>
         <w:rPr>
+          <w:color w:val="000000" w:themeColor="text1"/>
+        </w:rPr>
+      </w:pPr>
+      <w:r>
+        <w:rPr>
+          <w:color w:val="000000" w:themeColor="text1"/>
+        </w:rPr>
+        <w:t xml:space="preserve">I used </w:t>
+      </w:r>
+      <w:r>
+        <w:rPr>
+          <w:color w:val="000000" w:themeColor="text1"/>
+        </w:rPr>
+        <w:t>Unit test to tests all the functions</w:t>
+      </w:r>
+      <w:r>
+        <w:rPr>
+          <w:color w:val="000000" w:themeColor="text1"/>
+        </w:rPr>
+        <w:t>.</w:t>
+      </w:r>
+    </w:p>
+    <w:p>
+      <w:pPr>
+        <w:pStyle w:val="ListParagraph"/>
+        <w:rPr>
           <w:b/>
           <w:bCs/>
           <w:color w:val="0E2841" w:themeColor="text2"/>
@@ -1763,73 +1687,6 @@
     <w:p>
       <w:pPr>
         <w:pStyle w:val="ListParagraph"/>
-        <w:numPr>
-          <w:ilvl w:val="0"/>
-          <w:numId w:val="8"/>
-        </w:numPr>
-        <w:rPr>
-          <w:b/>
-          <w:bCs/>
-          <w:color w:val="000000" w:themeColor="text1"/>
-        </w:rPr>
-      </w:pPr>
-      <w:r>
-        <w:rPr>
-          <w:b/>
-          <w:bCs/>
-          <w:color w:val="000000" w:themeColor="text1"/>
-        </w:rPr>
-        <w:t>Testing functions require user in</w:t>
-      </w:r>
-      <w:r>
-        <w:rPr>
-          <w:b/>
-          <w:bCs/>
-          <w:color w:val="000000" w:themeColor="text1"/>
-        </w:rPr>
-        <w:t>put.</w:t>
-      </w:r>
-    </w:p>
-    <w:p>
-      <w:pPr>
-        <w:pStyle w:val="ListParagraph"/>
-        <w:ind w:left="2160"/>
-        <w:rPr>
-          <w:color w:val="000000" w:themeColor="text1"/>
-        </w:rPr>
-      </w:pPr>
-      <w:r>
-        <w:rPr>
-          <w:color w:val="000000" w:themeColor="text1"/>
-        </w:rPr>
-        <w:t>Those functions are withdrawl, deposit, display balance and transfer require changing in the code to set a value for the inputs</w:t>
-      </w:r>
-      <w:r>
-        <w:rPr>
-          <w:color w:val="000000" w:themeColor="text1"/>
-        </w:rPr>
-        <w:t xml:space="preserve"> so this what I have done.</w:t>
-      </w:r>
-    </w:p>
-    <w:p>
-      <w:pPr>
-        <w:pStyle w:val="ListParagraph"/>
-        <w:rPr>
-          <w:color w:val="FF0000"/>
-        </w:rPr>
-      </w:pPr>
-    </w:p>
-    <w:p>
-      <w:pPr>
-        <w:pStyle w:val="ListParagraph"/>
-        <w:rPr>
-          <w:color w:val="000000" w:themeColor="text1"/>
-        </w:rPr>
-      </w:pPr>
-    </w:p>
-    <w:p>
-      <w:pPr>
-        <w:pStyle w:val="ListParagraph"/>
         <w:rPr>
           <w:b/>
           <w:bCs/>
@@ -1842,6 +1699,161 @@
     <w:p>
       <w:pPr>
         <w:pStyle w:val="ListParagraph"/>
+        <w:numPr>
+          <w:ilvl w:val="0"/>
+          <w:numId w:val="9"/>
+        </w:numPr>
+        <w:rPr>
+          <w:color w:val="000000" w:themeColor="text1"/>
+        </w:rPr>
+      </w:pPr>
+      <w:r>
+        <w:rPr>
+          <w:b/>
+          <w:bCs/>
+          <w:color w:val="000000" w:themeColor="text1"/>
+        </w:rPr>
+        <w:t xml:space="preserve">Testing </w:t>
+      </w:r>
+      <w:r>
+        <w:rPr>
+          <w:b/>
+          <w:bCs/>
+          <w:color w:val="000000" w:themeColor="text1"/>
+        </w:rPr>
+        <w:t>Functions in Utilities.py</w:t>
+      </w:r>
+    </w:p>
+    <w:p>
+      <w:pPr>
+        <w:rPr>
+          <w:color w:val="000000" w:themeColor="text1"/>
+        </w:rPr>
+      </w:pPr>
+      <w:r>
+        <w:rPr>
+          <w:noProof/>
+        </w:rPr>
+        <w:drawing>
+          <wp:inline distT="0" distB="0" distL="0" distR="0" wp14:anchorId="34EB4724" wp14:editId="7870E1E5">
+            <wp:extent cx="6157665" cy="3750254"/>
+            <wp:effectExtent l="0" t="0" r="0" b="3175"/>
+            <wp:docPr id="1137967641" name="Picture 1"/>
+            <wp:cNvGraphicFramePr>
+              <a:graphicFrameLocks xmlns:a="http://schemas.openxmlformats.org/drawingml/2006/main" noChangeAspect="1"/>
+            </wp:cNvGraphicFramePr>
+            <a:graphic xmlns:a="http://schemas.openxmlformats.org/drawingml/2006/main">
+              <a:graphicData uri="http://schemas.openxmlformats.org/drawingml/2006/picture">
+                <pic:pic xmlns:pic="http://schemas.openxmlformats.org/drawingml/2006/picture">
+                  <pic:nvPicPr>
+                    <pic:cNvPr id="0" name="Picture 1"/>
+                    <pic:cNvPicPr>
+                      <a:picLocks noChangeAspect="1" noChangeArrowheads="1"/>
+                    </pic:cNvPicPr>
+                  </pic:nvPicPr>
+                  <pic:blipFill>
+                    <a:blip r:embed="rId9" cstate="print">
+                      <a:extLst>
+                        <a:ext uri="{28A0092B-C50C-407E-A947-70E740481C1C}">
+                          <a14:useLocalDpi xmlns:a14="http://schemas.microsoft.com/office/drawing/2010/main" val="0"/>
+                        </a:ext>
+                      </a:extLst>
+                    </a:blip>
+                    <a:srcRect/>
+                    <a:stretch>
+                      <a:fillRect/>
+                    </a:stretch>
+                  </pic:blipFill>
+                  <pic:spPr bwMode="auto">
+                    <a:xfrm>
+                      <a:off x="0" y="0"/>
+                      <a:ext cx="6178897" cy="3763185"/>
+                    </a:xfrm>
+                    <a:prstGeom prst="rect">
+                      <a:avLst/>
+                    </a:prstGeom>
+                    <a:noFill/>
+                    <a:ln>
+                      <a:noFill/>
+                    </a:ln>
+                  </pic:spPr>
+                </pic:pic>
+              </a:graphicData>
+            </a:graphic>
+          </wp:inline>
+        </w:drawing>
+      </w:r>
+    </w:p>
+    <w:p>
+      <w:pPr>
+        <w:pStyle w:val="NormalWeb"/>
+        <w:rPr>
+          <w:rFonts w:asciiTheme="minorHAnsi" w:hAnsiTheme="minorHAnsi"/>
+          <w:b/>
+          <w:bCs/>
+          <w:color w:val="0E2841" w:themeColor="text2"/>
+          <w:sz w:val="32"/>
+          <w:szCs w:val="32"/>
+        </w:rPr>
+      </w:pPr>
+      <w:r>
+        <w:rPr>
+          <w:rFonts w:asciiTheme="minorHAnsi" w:hAnsiTheme="minorHAnsi"/>
+        </w:rPr>
+        <w:t>Testing the Utilities.py functions proceeded smoothly without any issues</w:t>
+      </w:r>
+      <w:r>
+        <w:rPr>
+          <w:rFonts w:asciiTheme="minorHAnsi" w:hAnsiTheme="minorHAnsi"/>
+        </w:rPr>
+        <w:t>. Because of their simple structure</w:t>
+      </w:r>
+      <w:r>
+        <w:rPr>
+          <w:rFonts w:asciiTheme="minorHAnsi" w:hAnsiTheme="minorHAnsi"/>
+        </w:rPr>
+        <w:t>. The only r</w:t>
+      </w:r>
+      <w:r>
+        <w:rPr>
+          <w:rFonts w:asciiTheme="minorHAnsi" w:hAnsiTheme="minorHAnsi"/>
+        </w:rPr>
+        <w:t>e</w:t>
+      </w:r>
+      <w:r>
+        <w:rPr>
+          <w:rFonts w:asciiTheme="minorHAnsi" w:hAnsiTheme="minorHAnsi"/>
+        </w:rPr>
+        <w:t>quirement was to set up an account at the beginning of the code to ensure the tests could run properly</w:t>
+      </w:r>
+      <w:r>
+        <w:rPr>
+          <w:rFonts w:asciiTheme="minorHAnsi" w:hAnsiTheme="minorHAnsi"/>
+        </w:rPr>
+        <w:t>.</w:t>
+      </w:r>
+      <w:r>
+        <w:rPr>
+          <w:rFonts w:asciiTheme="minorHAnsi" w:hAnsiTheme="minorHAnsi"/>
+        </w:rPr>
+        <w:t xml:space="preserve"> I have tested each function by considering all possible inputs, a</w:t>
+      </w:r>
+      <w:r>
+        <w:rPr>
+          <w:rFonts w:asciiTheme="minorHAnsi" w:hAnsiTheme="minorHAnsi"/>
+        </w:rPr>
+        <w:t>s</w:t>
+      </w:r>
+      <w:r>
+        <w:rPr>
+          <w:rFonts w:asciiTheme="minorHAnsi" w:hAnsiTheme="minorHAnsi"/>
+        </w:rPr>
+        <w:t>serting the expected outputs, and running unit tests to verify the results.</w:t>
+      </w:r>
+    </w:p>
+    <w:p>
+      <w:pPr>
+        <w:pStyle w:val="ListParagraph"/>
         <w:rPr>
           <w:color w:val="A6A6A6" w:themeColor="background1" w:themeShade="A6"/>
         </w:rPr>
@@ -1867,8 +1879,3065 @@
         </w:rPr>
       </w:pPr>
     </w:p>
+    <w:p>
+      <w:pPr>
+        <w:pStyle w:val="ListParagraph"/>
+        <w:rPr>
+          <w:color w:val="000000" w:themeColor="text1"/>
+          <w:sz w:val="28"/>
+          <w:szCs w:val="28"/>
+        </w:rPr>
+      </w:pPr>
+    </w:p>
+    <w:p>
+      <w:pPr>
+        <w:pStyle w:val="ListParagraph"/>
+        <w:rPr>
+          <w:color w:val="000000" w:themeColor="text1"/>
+          <w:sz w:val="28"/>
+          <w:szCs w:val="28"/>
+        </w:rPr>
+      </w:pPr>
+    </w:p>
+    <w:p>
+      <w:pPr>
+        <w:pStyle w:val="ListParagraph"/>
+        <w:rPr>
+          <w:color w:val="000000" w:themeColor="text1"/>
+          <w:sz w:val="28"/>
+          <w:szCs w:val="28"/>
+        </w:rPr>
+      </w:pPr>
+    </w:p>
+    <w:p>
+      <w:pPr>
+        <w:pStyle w:val="ListParagraph"/>
+        <w:rPr>
+          <w:color w:val="000000" w:themeColor="text1"/>
+          <w:sz w:val="28"/>
+          <w:szCs w:val="28"/>
+        </w:rPr>
+      </w:pPr>
+    </w:p>
+    <w:p>
+      <w:pPr>
+        <w:pStyle w:val="ListParagraph"/>
+        <w:rPr>
+          <w:color w:val="000000" w:themeColor="text1"/>
+          <w:sz w:val="28"/>
+          <w:szCs w:val="28"/>
+        </w:rPr>
+      </w:pPr>
+    </w:p>
+    <w:p>
+      <w:pPr>
+        <w:pStyle w:val="ListParagraph"/>
+        <w:rPr>
+          <w:color w:val="000000" w:themeColor="text1"/>
+          <w:sz w:val="28"/>
+          <w:szCs w:val="28"/>
+        </w:rPr>
+      </w:pPr>
+    </w:p>
+    <w:p>
+      <w:pPr>
+        <w:pStyle w:val="ListParagraph"/>
+        <w:rPr>
+          <w:color w:val="A6A6A6" w:themeColor="background1" w:themeShade="A6"/>
+        </w:rPr>
+      </w:pPr>
+      <w:r>
+        <w:rPr>
+          <w:color w:val="A6A6A6" w:themeColor="background1" w:themeShade="A6"/>
+        </w:rPr>
+        <w:lastRenderedPageBreak/>
+        <w:t>ID:3075614 , Module: FC72</w:t>
+      </w:r>
+      <w:r>
+        <w:rPr>
+          <w:color w:val="A6A6A6" w:themeColor="background1" w:themeShade="A6"/>
+        </w:rPr>
+        <w:t>3</w:t>
+      </w:r>
+      <w:r>
+        <w:rPr>
+          <w:color w:val="A6A6A6" w:themeColor="background1" w:themeShade="A6"/>
+        </w:rPr>
+        <w:t xml:space="preserve"> , </w:t>
+      </w:r>
+      <w:r>
+        <w:rPr>
+          <w:color w:val="A6A6A6" w:themeColor="background1" w:themeShade="A6"/>
+        </w:rPr>
+        <w:t>Sophie Norman</w:t>
+      </w:r>
+      <w:r>
+        <w:rPr>
+          <w:color w:val="A6A6A6" w:themeColor="background1" w:themeShade="A6"/>
+        </w:rPr>
+        <w:t>.</w:t>
+      </w:r>
+    </w:p>
+    <w:p>
+      <w:pPr>
+        <w:pStyle w:val="ListParagraph"/>
+        <w:rPr>
+          <w:color w:val="000000" w:themeColor="text1"/>
+          <w:sz w:val="28"/>
+          <w:szCs w:val="28"/>
+        </w:rPr>
+      </w:pPr>
+    </w:p>
+    <w:p>
+      <w:pPr>
+        <w:pStyle w:val="ListParagraph"/>
+        <w:numPr>
+          <w:ilvl w:val="0"/>
+          <w:numId w:val="9"/>
+        </w:numPr>
+        <w:rPr>
+          <w:color w:val="000000" w:themeColor="text1"/>
+        </w:rPr>
+      </w:pPr>
+      <w:bookmarkStart w:id="9" w:name="_Hlk190016131"/>
+      <w:r>
+        <w:rPr>
+          <w:b/>
+          <w:bCs/>
+          <w:color w:val="000000" w:themeColor="text1"/>
+        </w:rPr>
+        <w:t xml:space="preserve">Testing Functions in </w:t>
+      </w:r>
+      <w:r>
+        <w:rPr>
+          <w:b/>
+          <w:bCs/>
+          <w:color w:val="000000" w:themeColor="text1"/>
+        </w:rPr>
+        <w:t>BankingApp</w:t>
+      </w:r>
+      <w:r>
+        <w:rPr>
+          <w:b/>
+          <w:bCs/>
+          <w:color w:val="000000" w:themeColor="text1"/>
+        </w:rPr>
+        <w:t>.py</w:t>
+      </w:r>
+      <w:r>
+        <w:rPr>
+          <w:b/>
+          <w:bCs/>
+          <w:color w:val="000000" w:themeColor="text1"/>
+        </w:rPr>
+        <w:t>:</w:t>
+      </w:r>
+    </w:p>
+    <w:bookmarkEnd w:id="9"/>
+    <w:p>
+      <w:pPr>
+        <w:pStyle w:val="ListParagraph"/>
+        <w:rPr>
+          <w:color w:val="000000" w:themeColor="text1"/>
+        </w:rPr>
+      </w:pPr>
+      <w:r>
+        <w:rPr>
+          <w:b/>
+          <w:bCs/>
+          <w:noProof/>
+          <w:color w:val="000000" w:themeColor="text1"/>
+        </w:rPr>
+        <w:drawing>
+          <wp:inline distT="0" distB="0" distL="0" distR="0" wp14:anchorId="67669579" wp14:editId="3EF0A776">
+            <wp:extent cx="5875355" cy="3578317"/>
+            <wp:effectExtent l="0" t="0" r="0" b="3175"/>
+            <wp:docPr id="1958909896" name="Picture 2"/>
+            <wp:cNvGraphicFramePr>
+              <a:graphicFrameLocks xmlns:a="http://schemas.openxmlformats.org/drawingml/2006/main" noChangeAspect="1"/>
+            </wp:cNvGraphicFramePr>
+            <a:graphic xmlns:a="http://schemas.openxmlformats.org/drawingml/2006/main">
+              <a:graphicData uri="http://schemas.openxmlformats.org/drawingml/2006/picture">
+                <pic:pic xmlns:pic="http://schemas.openxmlformats.org/drawingml/2006/picture">
+                  <pic:nvPicPr>
+                    <pic:cNvPr id="0" name="Picture 2"/>
+                    <pic:cNvPicPr>
+                      <a:picLocks noChangeAspect="1" noChangeArrowheads="1"/>
+                    </pic:cNvPicPr>
+                  </pic:nvPicPr>
+                  <pic:blipFill>
+                    <a:blip r:embed="rId10" cstate="print">
+                      <a:extLst>
+                        <a:ext uri="{28A0092B-C50C-407E-A947-70E740481C1C}">
+                          <a14:useLocalDpi xmlns:a14="http://schemas.microsoft.com/office/drawing/2010/main" val="0"/>
+                        </a:ext>
+                      </a:extLst>
+                    </a:blip>
+                    <a:srcRect/>
+                    <a:stretch>
+                      <a:fillRect/>
+                    </a:stretch>
+                  </pic:blipFill>
+                  <pic:spPr bwMode="auto">
+                    <a:xfrm>
+                      <a:off x="0" y="0"/>
+                      <a:ext cx="5882847" cy="3582880"/>
+                    </a:xfrm>
+                    <a:prstGeom prst="rect">
+                      <a:avLst/>
+                    </a:prstGeom>
+                    <a:noFill/>
+                    <a:ln>
+                      <a:noFill/>
+                    </a:ln>
+                  </pic:spPr>
+                </pic:pic>
+              </a:graphicData>
+            </a:graphic>
+          </wp:inline>
+        </w:drawing>
+      </w:r>
+    </w:p>
+    <w:p>
+      <w:pPr>
+        <w:pStyle w:val="ListParagraph"/>
+        <w:rPr>
+          <w:color w:val="000000" w:themeColor="text1"/>
+          <w:sz w:val="28"/>
+          <w:szCs w:val="28"/>
+        </w:rPr>
+      </w:pPr>
+    </w:p>
+    <w:p>
+      <w:pPr>
+        <w:pStyle w:val="ListParagraph"/>
+        <w:rPr>
+          <w:color w:val="000000" w:themeColor="text1"/>
+        </w:rPr>
+      </w:pPr>
+      <w:r>
+        <w:rPr>
+          <w:color w:val="000000" w:themeColor="text1"/>
+        </w:rPr>
+        <w:t xml:space="preserve">The functions in banking app were hard to test because it require user input using command line. To solve this issue and run tests I took all the functions and put them in the same file of the testing(test_BankingApp.py) and modify them all to take input entered in the parameters of the functions. The withdrawal function has an option which is custom amount I could not do the same in this </w:t>
+      </w:r>
+      <w:proofErr w:type="gramStart"/>
+      <w:r>
+        <w:rPr>
+          <w:color w:val="000000" w:themeColor="text1"/>
+        </w:rPr>
+        <w:t>situation</w:t>
+      </w:r>
+      <w:proofErr w:type="gramEnd"/>
+      <w:r>
+        <w:rPr>
+          <w:color w:val="000000" w:themeColor="text1"/>
+        </w:rPr>
+        <w:t xml:space="preserve"> so I added more options that simulate the user input when user choose to withdrawal custom amount. But all the tests worked well after modifying the functions.</w:t>
+      </w:r>
+    </w:p>
+    <w:p>
+      <w:pPr>
+        <w:pStyle w:val="ListParagraph"/>
+        <w:rPr>
+          <w:color w:val="000000" w:themeColor="text1"/>
+        </w:rPr>
+      </w:pPr>
+    </w:p>
+    <w:p>
+      <w:pPr>
+        <w:pStyle w:val="ListParagraph"/>
+        <w:rPr>
+          <w:rFonts w:asciiTheme="minorHAnsi" w:hAnsiTheme="minorHAnsi"/>
+          <w:color w:val="000000" w:themeColor="text1"/>
+        </w:rPr>
+      </w:pPr>
+      <w:r>
+        <w:rPr>
+          <w:rFonts w:asciiTheme="minorHAnsi" w:hAnsiTheme="minorHAnsi"/>
+        </w:rPr>
+        <w:t xml:space="preserve">A special case I encountered while testing the </w:t>
+      </w:r>
+      <w:proofErr w:type="spellStart"/>
+      <w:r>
+        <w:rPr>
+          <w:rStyle w:val="HTMLCode"/>
+          <w:rFonts w:asciiTheme="minorHAnsi" w:eastAsia="Aptos" w:hAnsiTheme="minorHAnsi"/>
+        </w:rPr>
+        <w:t>test_add_New_accounts_to_data</w:t>
+      </w:r>
+      <w:proofErr w:type="spellEnd"/>
+      <w:r>
+        <w:rPr>
+          <w:rFonts w:asciiTheme="minorHAnsi" w:hAnsiTheme="minorHAnsi"/>
+        </w:rPr>
+        <w:t xml:space="preserve"> function required me to create an additional function to verify whether an account had already been added. This function ensures that duplicate accounts are not created and helps maintain data integrity during testing</w:t>
+      </w:r>
+    </w:p>
+    <w:p>
+      <w:pPr>
+        <w:pStyle w:val="ListParagraph"/>
+        <w:rPr>
+          <w:color w:val="000000" w:themeColor="text1"/>
+        </w:rPr>
+      </w:pPr>
+    </w:p>
+    <w:p>
+      <w:pPr>
+        <w:pStyle w:val="ListParagraph"/>
+        <w:rPr>
+          <w:color w:val="000000" w:themeColor="text1"/>
+        </w:rPr>
+      </w:pPr>
+    </w:p>
+    <w:p>
+      <w:pPr>
+        <w:pStyle w:val="ListParagraph"/>
+        <w:rPr>
+          <w:color w:val="000000" w:themeColor="text1"/>
+        </w:rPr>
+      </w:pPr>
+    </w:p>
+    <w:p>
+      <w:pPr>
+        <w:pStyle w:val="ListParagraph"/>
+        <w:rPr>
+          <w:color w:val="000000" w:themeColor="text1"/>
+        </w:rPr>
+      </w:pPr>
+    </w:p>
+    <w:p>
+      <w:pPr>
+        <w:pStyle w:val="ListParagraph"/>
+        <w:rPr>
+          <w:color w:val="000000" w:themeColor="text1"/>
+        </w:rPr>
+      </w:pPr>
+    </w:p>
+    <w:p>
+      <w:pPr>
+        <w:pStyle w:val="ListParagraph"/>
+        <w:rPr>
+          <w:color w:val="000000" w:themeColor="text1"/>
+        </w:rPr>
+      </w:pPr>
+    </w:p>
+    <w:p>
+      <w:pPr>
+        <w:pStyle w:val="ListParagraph"/>
+        <w:rPr>
+          <w:color w:val="000000" w:themeColor="text1"/>
+        </w:rPr>
+      </w:pPr>
+    </w:p>
+    <w:p>
+      <w:pPr>
+        <w:pStyle w:val="ListParagraph"/>
+        <w:rPr>
+          <w:color w:val="A6A6A6" w:themeColor="background1" w:themeShade="A6"/>
+        </w:rPr>
+      </w:pPr>
+      <w:r>
+        <w:rPr>
+          <w:color w:val="A6A6A6" w:themeColor="background1" w:themeShade="A6"/>
+        </w:rPr>
+        <w:lastRenderedPageBreak/>
+        <w:t>ID:3075614 , Module: FC72</w:t>
+      </w:r>
+      <w:r>
+        <w:rPr>
+          <w:color w:val="A6A6A6" w:themeColor="background1" w:themeShade="A6"/>
+        </w:rPr>
+        <w:t>3</w:t>
+      </w:r>
+      <w:r>
+        <w:rPr>
+          <w:color w:val="A6A6A6" w:themeColor="background1" w:themeShade="A6"/>
+        </w:rPr>
+        <w:t xml:space="preserve"> , </w:t>
+      </w:r>
+      <w:r>
+        <w:rPr>
+          <w:color w:val="A6A6A6" w:themeColor="background1" w:themeShade="A6"/>
+        </w:rPr>
+        <w:t>Sophie Norman</w:t>
+      </w:r>
+      <w:r>
+        <w:rPr>
+          <w:color w:val="A6A6A6" w:themeColor="background1" w:themeShade="A6"/>
+        </w:rPr>
+        <w:t>.</w:t>
+      </w:r>
+    </w:p>
+    <w:p>
+      <w:pPr>
+        <w:pStyle w:val="ListParagraph"/>
+        <w:rPr>
+          <w:color w:val="000000" w:themeColor="text1"/>
+        </w:rPr>
+      </w:pPr>
+    </w:p>
+    <w:p>
+      <w:pPr>
+        <w:pStyle w:val="ListParagraph"/>
+        <w:numPr>
+          <w:ilvl w:val="0"/>
+          <w:numId w:val="9"/>
+        </w:numPr>
+        <w:rPr>
+          <w:color w:val="000000" w:themeColor="text1"/>
+        </w:rPr>
+      </w:pPr>
+      <w:r>
+        <w:rPr>
+          <w:b/>
+          <w:bCs/>
+          <w:color w:val="000000" w:themeColor="text1"/>
+        </w:rPr>
+        <w:t>Bugs that I found.</w:t>
+      </w:r>
+    </w:p>
+    <w:p>
+      <w:pPr>
+        <w:pStyle w:val="ListParagraph"/>
+        <w:rPr>
+          <w:color w:val="000000" w:themeColor="text1"/>
+        </w:rPr>
+      </w:pPr>
+    </w:p>
+    <w:p>
+      <w:pPr>
+        <w:pStyle w:val="ListParagraph"/>
+        <w:rPr>
+          <w:rFonts w:asciiTheme="minorHAnsi" w:hAnsiTheme="minorHAnsi"/>
+        </w:rPr>
+      </w:pPr>
+      <w:r>
+        <w:rPr>
+          <w:rFonts w:asciiTheme="minorHAnsi" w:hAnsiTheme="minorHAnsi"/>
+        </w:rPr>
+        <w:t xml:space="preserve">I discovered a bug during testing of the transfer function, which allowed users to transfer money even when they had no funds. For example, if a user's balance was zero, they could still transfer money, causing the recipient to receive the </w:t>
+      </w:r>
+    </w:p>
+    <w:p>
+      <w:pPr>
+        <w:pStyle w:val="ListParagraph"/>
+        <w:rPr>
+          <w:rFonts w:asciiTheme="minorHAnsi" w:hAnsiTheme="minorHAnsi"/>
+        </w:rPr>
+      </w:pPr>
+    </w:p>
+    <w:p>
+      <w:pPr>
+        <w:pStyle w:val="ListParagraph"/>
+        <w:rPr>
+          <w:rFonts w:asciiTheme="minorHAnsi" w:hAnsiTheme="minorHAnsi"/>
+        </w:rPr>
+      </w:pPr>
+      <w:r>
+        <w:rPr>
+          <w:rFonts w:asciiTheme="minorHAnsi" w:hAnsiTheme="minorHAnsi"/>
+        </w:rPr>
+        <w:t xml:space="preserve">funds while the sender's balance became negative. I solved this issue by putting the function </w:t>
+      </w:r>
+      <w:r>
+        <w:rPr>
+          <w:rStyle w:val="HTMLCode"/>
+          <w:rFonts w:asciiTheme="minorHAnsi" w:eastAsia="Aptos" w:hAnsiTheme="minorHAnsi"/>
+        </w:rPr>
+        <w:t>Is_balance_sufficient()</w:t>
+      </w:r>
+      <w:r>
+        <w:rPr>
+          <w:rFonts w:asciiTheme="minorHAnsi" w:hAnsiTheme="minorHAnsi"/>
+        </w:rPr>
+        <w:t>into the transfer code.</w:t>
+      </w:r>
+    </w:p>
+    <w:p>
+      <w:pPr>
+        <w:pStyle w:val="ListParagraph"/>
+        <w:rPr>
+          <w:color w:val="000000" w:themeColor="text1"/>
+        </w:rPr>
+      </w:pPr>
+    </w:p>
+    <w:p>
+      <w:pPr>
+        <w:pStyle w:val="ListParagraph"/>
+        <w:rPr>
+          <w:rFonts w:asciiTheme="minorHAnsi" w:hAnsiTheme="minorHAnsi"/>
+        </w:rPr>
+      </w:pPr>
+      <w:r>
+        <w:rPr>
+          <w:rFonts w:asciiTheme="minorHAnsi" w:hAnsiTheme="minorHAnsi"/>
+        </w:rPr>
+        <w:t xml:space="preserve">Another bug I found was that if a user entered an incorrect password, they could reset their remaining attempts by returning to the sign-in interface before reaching the maximum of three attempts. To fix this, I stored the number of </w:t>
+      </w:r>
+      <w:proofErr w:type="gramStart"/>
+      <w:r>
+        <w:rPr>
+          <w:rFonts w:asciiTheme="minorHAnsi" w:hAnsiTheme="minorHAnsi"/>
+        </w:rPr>
+        <w:t>password</w:t>
+      </w:r>
+      <w:proofErr w:type="gramEnd"/>
+      <w:r>
+        <w:rPr>
+          <w:rFonts w:asciiTheme="minorHAnsi" w:hAnsiTheme="minorHAnsi"/>
+        </w:rPr>
+        <w:t xml:space="preserve"> attempts in the account list as </w:t>
+      </w:r>
+      <w:r>
+        <w:rPr>
+          <w:rStyle w:val="HTMLCode"/>
+          <w:rFonts w:asciiTheme="minorHAnsi" w:eastAsia="Aptos" w:hAnsiTheme="minorHAnsi"/>
+        </w:rPr>
+        <w:t>"</w:t>
+      </w:r>
+      <w:proofErr w:type="spellStart"/>
+      <w:r>
+        <w:rPr>
+          <w:rStyle w:val="HTMLCode"/>
+          <w:rFonts w:asciiTheme="minorHAnsi" w:eastAsia="Aptos" w:hAnsiTheme="minorHAnsi"/>
+        </w:rPr>
+        <w:t>Password_attempts</w:t>
+      </w:r>
+      <w:proofErr w:type="spellEnd"/>
+      <w:r>
+        <w:rPr>
+          <w:rStyle w:val="HTMLCode"/>
+          <w:rFonts w:asciiTheme="minorHAnsi" w:eastAsia="Aptos" w:hAnsiTheme="minorHAnsi"/>
+        </w:rPr>
+        <w:t>": 3</w:t>
+      </w:r>
+      <w:r>
+        <w:rPr>
+          <w:rFonts w:asciiTheme="minorHAnsi" w:hAnsiTheme="minorHAnsi"/>
+        </w:rPr>
+        <w:t>. This ensures that even if the user returns to the sign-in interface, the remaining attempts are saved.</w:t>
+      </w:r>
+    </w:p>
+    <w:p>
+      <w:pPr>
+        <w:pStyle w:val="ListParagraph"/>
+      </w:pPr>
+    </w:p>
+    <w:p>
+      <w:pPr>
+        <w:pStyle w:val="ListParagraph"/>
+        <w:numPr>
+          <w:ilvl w:val="0"/>
+          <w:numId w:val="9"/>
+        </w:numPr>
+        <w:rPr>
+          <w:color w:val="000000" w:themeColor="text1"/>
+        </w:rPr>
+      </w:pPr>
+      <w:r>
+        <w:rPr>
+          <w:b/>
+          <w:bCs/>
+          <w:color w:val="000000" w:themeColor="text1"/>
+        </w:rPr>
+        <w:t>Testing menus:</w:t>
+      </w:r>
+    </w:p>
+    <w:p>
+      <w:pPr>
+        <w:rPr>
+          <w:b/>
+          <w:bCs/>
+          <w:color w:val="000000" w:themeColor="text1"/>
+        </w:rPr>
+      </w:pPr>
+      <w:r>
+        <w:rPr>
+          <w:b/>
+          <w:bCs/>
+          <w:color w:val="000000" w:themeColor="text1"/>
+        </w:rPr>
+        <w:t xml:space="preserve">First the </w:t>
+      </w:r>
+      <w:proofErr w:type="spellStart"/>
+      <w:r>
+        <w:rPr>
+          <w:b/>
+          <w:bCs/>
+          <w:color w:val="000000" w:themeColor="text1"/>
+        </w:rPr>
+        <w:t>initial_menu</w:t>
+      </w:r>
+      <w:proofErr w:type="spellEnd"/>
+      <w:r>
+        <w:rPr>
+          <w:b/>
+          <w:bCs/>
+          <w:color w:val="000000" w:themeColor="text1"/>
+        </w:rPr>
+        <w:t>()</w:t>
+      </w:r>
+    </w:p>
+    <w:p>
+      <w:pPr>
+        <w:rPr>
+          <w:color w:val="000000" w:themeColor="text1"/>
+        </w:rPr>
+      </w:pPr>
+    </w:p>
+    <w:p>
+      <w:pPr>
+        <w:rPr>
+          <w:color w:val="000000" w:themeColor="text1"/>
+        </w:rPr>
+      </w:pPr>
+      <w:r>
+        <w:rPr>
+          <w:noProof/>
+        </w:rPr>
+        <w:drawing>
+          <wp:anchor distT="0" distB="0" distL="114300" distR="114300" simplePos="0" relativeHeight="251662336" behindDoc="0" locked="0" layoutInCell="1" allowOverlap="1" wp14:anchorId="6911EBD1" wp14:editId="3E4130EE">
+            <wp:simplePos x="0" y="0"/>
+            <wp:positionH relativeFrom="margin">
+              <wp:align>left</wp:align>
+            </wp:positionH>
+            <wp:positionV relativeFrom="paragraph">
+              <wp:posOffset>242846</wp:posOffset>
+            </wp:positionV>
+            <wp:extent cx="2279650" cy="1519555"/>
+            <wp:effectExtent l="0" t="0" r="6350" b="4445"/>
+            <wp:wrapSquare wrapText="bothSides"/>
+            <wp:docPr id="762786684" name="Picture 3" descr="A screen shot of a computer&#10;&#10;AI-generated content may be incorrect."/>
+            <wp:cNvGraphicFramePr>
+              <a:graphicFrameLocks xmlns:a="http://schemas.openxmlformats.org/drawingml/2006/main" noChangeAspect="1"/>
+            </wp:cNvGraphicFramePr>
+            <a:graphic xmlns:a="http://schemas.openxmlformats.org/drawingml/2006/main">
+              <a:graphicData uri="http://schemas.openxmlformats.org/drawingml/2006/picture">
+                <pic:pic xmlns:pic="http://schemas.openxmlformats.org/drawingml/2006/picture">
+                  <pic:nvPicPr>
+                    <pic:cNvPr id="762786684" name="Picture 3" descr="A screen shot of a computer&#10;&#10;AI-generated content may be incorrect."/>
+                    <pic:cNvPicPr>
+                      <a:picLocks noChangeAspect="1" noChangeArrowheads="1"/>
+                    </pic:cNvPicPr>
+                  </pic:nvPicPr>
+                  <pic:blipFill>
+                    <a:blip r:embed="rId11">
+                      <a:extLst>
+                        <a:ext uri="{28A0092B-C50C-407E-A947-70E740481C1C}">
+                          <a14:useLocalDpi xmlns:a14="http://schemas.microsoft.com/office/drawing/2010/main" val="0"/>
+                        </a:ext>
+                      </a:extLst>
+                    </a:blip>
+                    <a:srcRect/>
+                    <a:stretch>
+                      <a:fillRect/>
+                    </a:stretch>
+                  </pic:blipFill>
+                  <pic:spPr bwMode="auto">
+                    <a:xfrm>
+                      <a:off x="0" y="0"/>
+                      <a:ext cx="2279650" cy="1519555"/>
+                    </a:xfrm>
+                    <a:prstGeom prst="rect">
+                      <a:avLst/>
+                    </a:prstGeom>
+                    <a:noFill/>
+                    <a:ln>
+                      <a:noFill/>
+                    </a:ln>
+                  </pic:spPr>
+                </pic:pic>
+              </a:graphicData>
+            </a:graphic>
+          </wp:anchor>
+        </w:drawing>
+      </w:r>
+      <w:r>
+        <w:rPr>
+          <w:color w:val="000000" w:themeColor="text1"/>
+        </w:rPr>
+        <w:t>T</w:t>
+      </w:r>
+      <w:r>
+        <w:rPr>
+          <w:color w:val="000000" w:themeColor="text1"/>
+        </w:rPr>
+        <w:t>his is what appear  first</w:t>
+      </w:r>
+    </w:p>
+    <w:p>
+      <w:pPr>
+        <w:pStyle w:val="ListParagraph"/>
+      </w:pPr>
+      <w:r>
+        <w:t>Users can choose from three available options, and all options function correctly without any issues</w:t>
+      </w:r>
+    </w:p>
+    <w:p>
+      <w:r>
+        <w:t xml:space="preserve"> </w:t>
+      </w:r>
+    </w:p>
+    <w:p/>
+    <w:p/>
+    <w:p/>
+    <w:p/>
+    <w:p/>
+    <w:p/>
+    <w:p/>
+    <w:p/>
+    <w:p>
+      <w:pPr>
+        <w:pStyle w:val="ListParagraph"/>
+        <w:rPr>
+          <w:color w:val="A6A6A6" w:themeColor="background1" w:themeShade="A6"/>
+        </w:rPr>
+      </w:pPr>
+      <w:r>
+        <w:rPr>
+          <w:color w:val="A6A6A6" w:themeColor="background1" w:themeShade="A6"/>
+        </w:rPr>
+        <w:lastRenderedPageBreak/>
+        <w:t>ID:3075614 , Module: FC72</w:t>
+      </w:r>
+      <w:r>
+        <w:rPr>
+          <w:color w:val="A6A6A6" w:themeColor="background1" w:themeShade="A6"/>
+        </w:rPr>
+        <w:t>3</w:t>
+      </w:r>
+      <w:r>
+        <w:rPr>
+          <w:color w:val="A6A6A6" w:themeColor="background1" w:themeShade="A6"/>
+        </w:rPr>
+        <w:t xml:space="preserve"> , </w:t>
+      </w:r>
+      <w:r>
+        <w:rPr>
+          <w:color w:val="A6A6A6" w:themeColor="background1" w:themeShade="A6"/>
+        </w:rPr>
+        <w:t>Sophie Norman</w:t>
+      </w:r>
+      <w:r>
+        <w:rPr>
+          <w:color w:val="A6A6A6" w:themeColor="background1" w:themeShade="A6"/>
+        </w:rPr>
+        <w:t>.</w:t>
+      </w:r>
+    </w:p>
+    <w:p/>
+    <w:p>
+      <w:r>
+        <w:rPr>
+          <w:b/>
+          <w:bCs/>
+          <w:noProof/>
+        </w:rPr>
+        <mc:AlternateContent>
+          <mc:Choice Requires="wps">
+            <w:drawing>
+              <wp:anchor distT="0" distB="0" distL="114300" distR="114300" simplePos="0" relativeHeight="251670528" behindDoc="0" locked="0" layoutInCell="1" allowOverlap="1" wp14:anchorId="186E9CFF" wp14:editId="23300D53">
+                <wp:simplePos x="0" y="0"/>
+                <wp:positionH relativeFrom="column">
+                  <wp:posOffset>31713</wp:posOffset>
+                </wp:positionH>
+                <wp:positionV relativeFrom="paragraph">
+                  <wp:posOffset>1707232</wp:posOffset>
+                </wp:positionV>
+                <wp:extent cx="254442" cy="119269"/>
+                <wp:effectExtent l="0" t="0" r="12700" b="14605"/>
+                <wp:wrapNone/>
+                <wp:docPr id="1970346002" name="Rectangle 6"/>
+                <wp:cNvGraphicFramePr/>
+                <a:graphic xmlns:a="http://schemas.openxmlformats.org/drawingml/2006/main">
+                  <a:graphicData uri="http://schemas.microsoft.com/office/word/2010/wordprocessingShape">
+                    <wps:wsp>
+                      <wps:cNvSpPr/>
+                      <wps:spPr>
+                        <a:xfrm>
+                          <a:off x="0" y="0"/>
+                          <a:ext cx="254442" cy="119269"/>
+                        </a:xfrm>
+                        <a:prstGeom prst="rect">
+                          <a:avLst/>
+                        </a:prstGeom>
+                        <a:noFill/>
+                        <a:ln w="12700" cap="flat" cmpd="sng" algn="ctr">
+                          <a:solidFill>
+                            <a:srgbClr val="C00000"/>
+                          </a:solidFill>
+                          <a:prstDash val="solid"/>
+                          <a:miter lim="800000"/>
+                        </a:ln>
+                        <a:effectLst/>
+                      </wps:spPr>
+                      <wps:bodyPr rot="0" spcFirstLastPara="0" vertOverflow="overflow" horzOverflow="overflow" vert="horz" wrap="square" lIns="91440" tIns="45720" rIns="91440" bIns="45720" numCol="1" spcCol="0" rtlCol="0" fromWordArt="0" anchor="ctr" anchorCtr="0" forceAA="0" compatLnSpc="1">
+                        <a:prstTxWarp prst="textNoShape">
+                          <a:avLst/>
+                        </a:prstTxWarp>
+                        <a:noAutofit/>
+                      </wps:bodyPr>
+                    </wps:wsp>
+                  </a:graphicData>
+                </a:graphic>
+              </wp:anchor>
+            </w:drawing>
+          </mc:Choice>
+          <mc:Fallback>
+            <w:pict>
+              <v:rect w14:anchorId="7119D70E" id="Rectangle 6" o:spid="_x0000_s1026" style="position:absolute;margin-left:2.5pt;margin-top:134.45pt;width:20.05pt;height:9.4pt;z-index:251670528;visibility:visible;mso-wrap-style:square;mso-wrap-distance-left:9pt;mso-wrap-distance-top:0;mso-wrap-distance-right:9pt;mso-wrap-distance-bottom:0;mso-position-horizontal:absolute;mso-position-horizontal-relative:text;mso-position-vertical:absolute;mso-position-vertical-relative:text;v-text-anchor:middle" o:gfxdata="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" filled="f" strokecolor="#c00000" strokeweight="1pt"/>
+            </w:pict>
+          </mc:Fallback>
+        </mc:AlternateContent>
+      </w:r>
+      <w:r>
+        <w:rPr>
+          <w:b/>
+          <w:bCs/>
+          <w:noProof/>
+        </w:rPr>
+        <mc:AlternateContent>
+          <mc:Choice Requires="wps">
+            <w:drawing>
+              <wp:anchor distT="0" distB="0" distL="114300" distR="114300" simplePos="0" relativeHeight="251668480" behindDoc="0" locked="0" layoutInCell="1" allowOverlap="1" wp14:anchorId="6E0B96B4" wp14:editId="3EA6D01B">
+                <wp:simplePos x="0" y="0"/>
+                <wp:positionH relativeFrom="column">
+                  <wp:posOffset>52767</wp:posOffset>
+                </wp:positionH>
+                <wp:positionV relativeFrom="paragraph">
+                  <wp:posOffset>1311011</wp:posOffset>
+                </wp:positionV>
+                <wp:extent cx="560268" cy="126853"/>
+                <wp:effectExtent l="0" t="0" r="11430" b="26035"/>
+                <wp:wrapNone/>
+                <wp:docPr id="1060862103" name="Rectangle 6"/>
+                <wp:cNvGraphicFramePr/>
+                <a:graphic xmlns:a="http://schemas.openxmlformats.org/drawingml/2006/main">
+                  <a:graphicData uri="http://schemas.microsoft.com/office/word/2010/wordprocessingShape">
+                    <wps:wsp>
+                      <wps:cNvSpPr/>
+                      <wps:spPr>
+                        <a:xfrm>
+                          <a:off x="0" y="0"/>
+                          <a:ext cx="560268" cy="126853"/>
+                        </a:xfrm>
+                        <a:prstGeom prst="rect">
+                          <a:avLst/>
+                        </a:prstGeom>
+                        <a:noFill/>
+                        <a:ln w="12700" cap="flat" cmpd="sng" algn="ctr">
+                          <a:solidFill>
+                            <a:srgbClr val="C00000"/>
+                          </a:solidFill>
+                          <a:prstDash val="solid"/>
+                          <a:miter lim="800000"/>
+                        </a:ln>
+                        <a:effectLst/>
+                      </wps:spPr>
+                      <wps:bodyPr rot="0" spcFirstLastPara="0" vertOverflow="overflow" horzOverflow="overflow" vert="horz" wrap="square" lIns="91440" tIns="45720" rIns="91440" bIns="45720" numCol="1" spcCol="0" rtlCol="0" fromWordArt="0" anchor="ctr" anchorCtr="0" forceAA="0" compatLnSpc="1">
+                        <a:prstTxWarp prst="textNoShape">
+                          <a:avLst/>
+                        </a:prstTxWarp>
+                        <a:noAutofit/>
+                      </wps:bodyPr>
+                    </wps:wsp>
+                  </a:graphicData>
+                </a:graphic>
+                <wp14:sizeRelH relativeFrom="margin">
+                  <wp14:pctWidth>0</wp14:pctWidth>
+                </wp14:sizeRelH>
+                <wp14:sizeRelV relativeFrom="margin">
+                  <wp14:pctHeight>0</wp14:pctHeight>
+                </wp14:sizeRelV>
+              </wp:anchor>
+            </w:drawing>
+          </mc:Choice>
+          <mc:Fallback>
+            <w:pict>
+              <v:rect w14:anchorId="3519D9A2" id="Rectangle 6" o:spid="_x0000_s1026" style="position:absolute;margin-left:4.15pt;margin-top:103.25pt;width:44.1pt;height:10pt;z-index:251668480;visibility:visible;mso-wrap-style:square;mso-width-percent:0;mso-height-percent:0;mso-wrap-distance-left:9pt;mso-wrap-distance-top:0;mso-wrap-distance-right:9pt;mso-wrap-distance-bottom:0;mso-position-horizontal:absolute;mso-position-horizontal-relative:text;mso-position-vertical:absolute;mso-position-vertical-relative:text;mso-width-percent:0;mso-height-percent:0;mso-width-relative:margin;mso-height-relative:margin;v-text-anchor:middle" o:gfxdata="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" filled="f" strokecolor="#c00000" strokeweight="1pt"/>
+            </w:pict>
+          </mc:Fallback>
+        </mc:AlternateContent>
+      </w:r>
+      <w:r>
+        <w:rPr>
+          <w:b/>
+          <w:bCs/>
+          <w:noProof/>
+        </w:rPr>
+        <mc:AlternateContent>
+          <mc:Choice Requires="wps">
+            <w:drawing>
+              <wp:anchor distT="0" distB="0" distL="114300" distR="114300" simplePos="0" relativeHeight="251666432" behindDoc="0" locked="0" layoutInCell="1" allowOverlap="1" wp14:anchorId="6264FBBB" wp14:editId="58300BCE">
+                <wp:simplePos x="0" y="0"/>
+                <wp:positionH relativeFrom="column">
+                  <wp:posOffset>83802</wp:posOffset>
+                </wp:positionH>
+                <wp:positionV relativeFrom="paragraph">
+                  <wp:posOffset>1018764</wp:posOffset>
+                </wp:positionV>
+                <wp:extent cx="254442" cy="119269"/>
+                <wp:effectExtent l="0" t="0" r="12700" b="14605"/>
+                <wp:wrapNone/>
+                <wp:docPr id="176571644" name="Rectangle 6"/>
+                <wp:cNvGraphicFramePr/>
+                <a:graphic xmlns:a="http://schemas.openxmlformats.org/drawingml/2006/main">
+                  <a:graphicData uri="http://schemas.microsoft.com/office/word/2010/wordprocessingShape">
+                    <wps:wsp>
+                      <wps:cNvSpPr/>
+                      <wps:spPr>
+                        <a:xfrm>
+                          <a:off x="0" y="0"/>
+                          <a:ext cx="254442" cy="119269"/>
+                        </a:xfrm>
+                        <a:prstGeom prst="rect">
+                          <a:avLst/>
+                        </a:prstGeom>
+                        <a:noFill/>
+                        <a:ln w="12700" cap="flat" cmpd="sng" algn="ctr">
+                          <a:solidFill>
+                            <a:srgbClr val="C00000"/>
+                          </a:solidFill>
+                          <a:prstDash val="solid"/>
+                          <a:miter lim="800000"/>
+                        </a:ln>
+                        <a:effectLst/>
+                      </wps:spPr>
+                      <wps:bodyPr rot="0" spcFirstLastPara="0" vertOverflow="overflow" horzOverflow="overflow" vert="horz" wrap="square" lIns="91440" tIns="45720" rIns="91440" bIns="45720" numCol="1" spcCol="0" rtlCol="0" fromWordArt="0" anchor="ctr" anchorCtr="0" forceAA="0" compatLnSpc="1">
+                        <a:prstTxWarp prst="textNoShape">
+                          <a:avLst/>
+                        </a:prstTxWarp>
+                        <a:noAutofit/>
+                      </wps:bodyPr>
+                    </wps:wsp>
+                  </a:graphicData>
+                </a:graphic>
+              </wp:anchor>
+            </w:drawing>
+          </mc:Choice>
+          <mc:Fallback>
+            <w:pict>
+              <v:rect w14:anchorId="5C6B0005" id="Rectangle 6" o:spid="_x0000_s1026" style="position:absolute;margin-left:6.6pt;margin-top:80.2pt;width:20.05pt;height:9.4pt;z-index:251666432;visibility:visible;mso-wrap-style:square;mso-wrap-distance-left:9pt;mso-wrap-distance-top:0;mso-wrap-distance-right:9pt;mso-wrap-distance-bottom:0;mso-position-horizontal:absolute;mso-position-horizontal-relative:text;mso-position-vertical:absolute;mso-position-vertical-relative:text;v-text-anchor:middle" o:gfxdata="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" filled="f" strokecolor="#c00000" strokeweight="1pt"/>
+            </w:pict>
+          </mc:Fallback>
+        </mc:AlternateContent>
+      </w:r>
+      <w:r>
+        <w:rPr>
+          <w:b/>
+          <w:bCs/>
+          <w:noProof/>
+        </w:rPr>
+        <mc:AlternateContent>
+          <mc:Choice Requires="wps">
+            <w:drawing>
+              <wp:anchor distT="0" distB="0" distL="114300" distR="114300" simplePos="0" relativeHeight="251664384" behindDoc="0" locked="0" layoutInCell="1" allowOverlap="1" wp14:anchorId="6D6F7AD6" wp14:editId="06252683">
+                <wp:simplePos x="0" y="0"/>
+                <wp:positionH relativeFrom="column">
+                  <wp:posOffset>23854</wp:posOffset>
+                </wp:positionH>
+                <wp:positionV relativeFrom="paragraph">
+                  <wp:posOffset>703939</wp:posOffset>
+                </wp:positionV>
+                <wp:extent cx="254442" cy="119269"/>
+                <wp:effectExtent l="0" t="0" r="12700" b="14605"/>
+                <wp:wrapNone/>
+                <wp:docPr id="882218247" name="Rectangle 6"/>
+                <wp:cNvGraphicFramePr/>
+                <a:graphic xmlns:a="http://schemas.openxmlformats.org/drawingml/2006/main">
+                  <a:graphicData uri="http://schemas.microsoft.com/office/word/2010/wordprocessingShape">
+                    <wps:wsp>
+                      <wps:cNvSpPr/>
+                      <wps:spPr>
+                        <a:xfrm>
+                          <a:off x="0" y="0"/>
+                          <a:ext cx="254442" cy="119269"/>
+                        </a:xfrm>
+                        <a:prstGeom prst="rect">
+                          <a:avLst/>
+                        </a:prstGeom>
+                        <a:noFill/>
+                        <a:ln>
+                          <a:solidFill>
+                            <a:srgbClr val="C00000"/>
+                          </a:solidFill>
+                        </a:ln>
+                      </wps:spPr>
+                      <wps:style>
+                        <a:lnRef idx="2">
+                          <a:schemeClr val="accent1">
+                            <a:shade val="15000"/>
+                          </a:schemeClr>
+                        </a:lnRef>
+                        <a:fillRef idx="1">
+                          <a:schemeClr val="accent1"/>
+                        </a:fillRef>
+                        <a:effectRef idx="0">
+                          <a:schemeClr val="accent1"/>
+                        </a:effectRef>
+                        <a:fontRef idx="minor">
+                          <a:schemeClr val="lt1"/>
+                        </a:fontRef>
+                      </wps:style>
+                      <wps:bodyPr rot="0" spcFirstLastPara="0" vertOverflow="overflow" horzOverflow="overflow" vert="horz" wrap="square" lIns="91440" tIns="45720" rIns="91440" bIns="45720" numCol="1" spcCol="0" rtlCol="0" fromWordArt="0" anchor="ctr" anchorCtr="0" forceAA="0" compatLnSpc="1">
+                        <a:prstTxWarp prst="textNoShape">
+                          <a:avLst/>
+                        </a:prstTxWarp>
+                        <a:noAutofit/>
+                      </wps:bodyPr>
+                    </wps:wsp>
+                  </a:graphicData>
+                </a:graphic>
+              </wp:anchor>
+            </w:drawing>
+          </mc:Choice>
+          <mc:Fallback>
+            <w:pict>
+              <v:rect w14:anchorId="7E2C1D40" id="Rectangle 6" o:spid="_x0000_s1026" style="position:absolute;margin-left:1.9pt;margin-top:55.45pt;width:20.05pt;height:9.4pt;z-index:251664384;visibility:visible;mso-wrap-style:square;mso-wrap-distance-left:9pt;mso-wrap-distance-top:0;mso-wrap-distance-right:9pt;mso-wrap-distance-bottom:0;mso-position-horizontal:absolute;mso-position-horizontal-relative:text;mso-position-vertical:absolute;mso-position-vertical-relative:text;v-text-anchor:middle" o:gfxdata="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" filled="f" strokecolor="#c00000" strokeweight="1pt"/>
+            </w:pict>
+          </mc:Fallback>
+        </mc:AlternateContent>
+      </w:r>
+      <w:r>
+        <w:rPr>
+          <w:b/>
+          <w:bCs/>
+          <w:noProof/>
+        </w:rPr>
+        <w:drawing>
+          <wp:anchor distT="0" distB="0" distL="114300" distR="114300" simplePos="0" relativeHeight="251663360" behindDoc="0" locked="0" layoutInCell="1" allowOverlap="1" wp14:anchorId="1A2C5C0D" wp14:editId="3D3F8B54">
+            <wp:simplePos x="914400" y="5899868"/>
+            <wp:positionH relativeFrom="column">
+              <wp:align>left</wp:align>
+            </wp:positionH>
+            <wp:positionV relativeFrom="paragraph">
+              <wp:align>top</wp:align>
+            </wp:positionV>
+            <wp:extent cx="3975652" cy="2420709"/>
+            <wp:effectExtent l="0" t="0" r="6350" b="0"/>
+            <wp:wrapSquare wrapText="bothSides"/>
+            <wp:docPr id="920776887" name="Picture 5" descr="A screenshot of a computer&#10;&#10;AI-generated content may be incorrect."/>
+            <wp:cNvGraphicFramePr>
+              <a:graphicFrameLocks xmlns:a="http://schemas.openxmlformats.org/drawingml/2006/main" noChangeAspect="1"/>
+            </wp:cNvGraphicFramePr>
+            <a:graphic xmlns:a="http://schemas.openxmlformats.org/drawingml/2006/main">
+              <a:graphicData uri="http://schemas.openxmlformats.org/drawingml/2006/picture">
+                <pic:pic xmlns:pic="http://schemas.openxmlformats.org/drawingml/2006/picture">
+                  <pic:nvPicPr>
+                    <pic:cNvPr id="920776887" name="Picture 5" descr="A screenshot of a computer&#10;&#10;AI-generated content may be incorrect."/>
+                    <pic:cNvPicPr>
+                      <a:picLocks noChangeAspect="1" noChangeArrowheads="1"/>
+                    </pic:cNvPicPr>
+                  </pic:nvPicPr>
+                  <pic:blipFill>
+                    <a:blip r:embed="rId12" cstate="print">
+                      <a:extLst>
+                        <a:ext uri="{28A0092B-C50C-407E-A947-70E740481C1C}">
+                          <a14:useLocalDpi xmlns:a14="http://schemas.microsoft.com/office/drawing/2010/main" val="0"/>
+                        </a:ext>
+                      </a:extLst>
+                    </a:blip>
+                    <a:srcRect/>
+                    <a:stretch>
+                      <a:fillRect/>
+                    </a:stretch>
+                  </pic:blipFill>
+                  <pic:spPr bwMode="auto">
+                    <a:xfrm>
+                      <a:off x="0" y="0"/>
+                      <a:ext cx="3975652" cy="2420709"/>
+                    </a:xfrm>
+                    <a:prstGeom prst="rect">
+                      <a:avLst/>
+                    </a:prstGeom>
+                    <a:noFill/>
+                    <a:ln>
+                      <a:noFill/>
+                    </a:ln>
+                  </pic:spPr>
+                </pic:pic>
+              </a:graphicData>
+            </a:graphic>
+          </wp:anchor>
+        </w:drawing>
+      </w:r>
+      <w:r>
+        <w:t xml:space="preserve"> </w:t>
+      </w:r>
+      <w:r>
+        <w:t xml:space="preserve">If the user chooses to </w:t>
+      </w:r>
+      <w:r>
+        <w:rPr>
+          <w:b/>
+          <w:bCs/>
+        </w:rPr>
+        <w:t>sign in</w:t>
+      </w:r>
+      <w:r>
+        <w:t>, they will be prompted to enter their username, password, and the amount of money they wish to deposit</w:t>
+      </w:r>
+      <w:r>
+        <w:t xml:space="preserve">. </w:t>
+      </w:r>
+      <w:r>
+        <w:t>The menu w</w:t>
+      </w:r>
+      <w:r>
+        <w:t>orks without issues.</w:t>
+      </w:r>
+    </w:p>
+    <w:p/>
+    <w:p/>
+    <w:p/>
+    <w:p/>
+    <w:p/>
+    <w:p>
+      <w:r>
+        <w:rPr>
+          <w:noProof/>
+        </w:rPr>
+        <mc:AlternateContent>
+          <mc:Choice Requires="wps">
+            <w:drawing>
+              <wp:anchor distT="0" distB="0" distL="114300" distR="114300" simplePos="0" relativeHeight="251676672" behindDoc="0" locked="0" layoutInCell="1" allowOverlap="1" wp14:anchorId="0F9445E5" wp14:editId="2755CB46">
+                <wp:simplePos x="0" y="0"/>
+                <wp:positionH relativeFrom="margin">
+                  <wp:posOffset>-7315</wp:posOffset>
+                </wp:positionH>
+                <wp:positionV relativeFrom="paragraph">
+                  <wp:posOffset>1137717</wp:posOffset>
+                </wp:positionV>
+                <wp:extent cx="2823667" cy="336589"/>
+                <wp:effectExtent l="0" t="0" r="15240" b="25400"/>
+                <wp:wrapNone/>
+                <wp:docPr id="485921016" name="Rectangle 6"/>
+                <wp:cNvGraphicFramePr/>
+                <a:graphic xmlns:a="http://schemas.openxmlformats.org/drawingml/2006/main">
+                  <a:graphicData uri="http://schemas.microsoft.com/office/word/2010/wordprocessingShape">
+                    <wps:wsp>
+                      <wps:cNvSpPr/>
+                      <wps:spPr>
+                        <a:xfrm>
+                          <a:off x="0" y="0"/>
+                          <a:ext cx="2823667" cy="336589"/>
+                        </a:xfrm>
+                        <a:prstGeom prst="rect">
+                          <a:avLst/>
+                        </a:prstGeom>
+                        <a:noFill/>
+                        <a:ln w="12700" cap="flat" cmpd="sng" algn="ctr">
+                          <a:solidFill>
+                            <a:srgbClr val="C00000"/>
+                          </a:solidFill>
+                          <a:prstDash val="solid"/>
+                          <a:miter lim="800000"/>
+                        </a:ln>
+                        <a:effectLst/>
+                      </wps:spPr>
+                      <wps:bodyPr rot="0" spcFirstLastPara="0" vertOverflow="overflow" horzOverflow="overflow" vert="horz" wrap="square" lIns="91440" tIns="45720" rIns="91440" bIns="45720" numCol="1" spcCol="0" rtlCol="0" fromWordArt="0" anchor="ctr" anchorCtr="0" forceAA="0" compatLnSpc="1">
+                        <a:prstTxWarp prst="textNoShape">
+                          <a:avLst/>
+                        </a:prstTxWarp>
+                        <a:noAutofit/>
+                      </wps:bodyPr>
+                    </wps:wsp>
+                  </a:graphicData>
+                </a:graphic>
+                <wp14:sizeRelH relativeFrom="margin">
+                  <wp14:pctWidth>0</wp14:pctWidth>
+                </wp14:sizeRelH>
+                <wp14:sizeRelV relativeFrom="margin">
+                  <wp14:pctHeight>0</wp14:pctHeight>
+                </wp14:sizeRelV>
+              </wp:anchor>
+            </w:drawing>
+          </mc:Choice>
+          <mc:Fallback>
+            <w:pict>
+              <v:rect w14:anchorId="77D176A1" id="Rectangle 6" o:spid="_x0000_s1026" style="position:absolute;margin-left:-.6pt;margin-top:89.6pt;width:222.35pt;height:26.5pt;z-index:251676672;visibility:visible;mso-wrap-style:square;mso-width-percent:0;mso-height-percent:0;mso-wrap-distance-left:9pt;mso-wrap-distance-top:0;mso-wrap-distance-right:9pt;mso-wrap-distance-bottom:0;mso-position-horizontal:absolute;mso-position-horizontal-relative:margin;mso-position-vertical:absolute;mso-position-vertical-relative:text;mso-width-percent:0;mso-height-percent:0;mso-width-relative:margin;mso-height-relative:margin;v-text-anchor:middle" o:gfxdata="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" filled="f" strokecolor="#c00000" strokeweight="1pt">
+                <w10:wrap anchorx="margin"/>
+              </v:rect>
+            </w:pict>
+          </mc:Fallback>
+        </mc:AlternateContent>
+      </w:r>
+      <w:r>
+        <w:rPr>
+          <w:noProof/>
+        </w:rPr>
+        <mc:AlternateContent>
+          <mc:Choice Requires="wps">
+            <w:drawing>
+              <wp:anchor distT="0" distB="0" distL="114300" distR="114300" simplePos="0" relativeHeight="251674624" behindDoc="0" locked="0" layoutInCell="1" allowOverlap="1" wp14:anchorId="3B794943" wp14:editId="2A74BE0E">
+                <wp:simplePos x="0" y="0"/>
+                <wp:positionH relativeFrom="column">
+                  <wp:posOffset>29160</wp:posOffset>
+                </wp:positionH>
+                <wp:positionV relativeFrom="paragraph">
+                  <wp:posOffset>936194</wp:posOffset>
+                </wp:positionV>
+                <wp:extent cx="595223" cy="94891"/>
+                <wp:effectExtent l="0" t="0" r="14605" b="19685"/>
+                <wp:wrapNone/>
+                <wp:docPr id="1098744395" name="Rectangle 6"/>
+                <wp:cNvGraphicFramePr/>
+                <a:graphic xmlns:a="http://schemas.openxmlformats.org/drawingml/2006/main">
+                  <a:graphicData uri="http://schemas.microsoft.com/office/word/2010/wordprocessingShape">
+                    <wps:wsp>
+                      <wps:cNvSpPr/>
+                      <wps:spPr>
+                        <a:xfrm>
+                          <a:off x="0" y="0"/>
+                          <a:ext cx="595223" cy="94891"/>
+                        </a:xfrm>
+                        <a:prstGeom prst="rect">
+                          <a:avLst/>
+                        </a:prstGeom>
+                        <a:noFill/>
+                        <a:ln w="12700" cap="flat" cmpd="sng" algn="ctr">
+                          <a:solidFill>
+                            <a:srgbClr val="C00000"/>
+                          </a:solidFill>
+                          <a:prstDash val="solid"/>
+                          <a:miter lim="800000"/>
+                        </a:ln>
+                        <a:effectLst/>
+                      </wps:spPr>
+                      <wps:bodyPr rot="0" spcFirstLastPara="0" vertOverflow="overflow" horzOverflow="overflow" vert="horz" wrap="square" lIns="91440" tIns="45720" rIns="91440" bIns="45720" numCol="1" spcCol="0" rtlCol="0" fromWordArt="0" anchor="ctr" anchorCtr="0" forceAA="0" compatLnSpc="1">
+                        <a:prstTxWarp prst="textNoShape">
+                          <a:avLst/>
+                        </a:prstTxWarp>
+                        <a:noAutofit/>
+                      </wps:bodyPr>
+                    </wps:wsp>
+                  </a:graphicData>
+                </a:graphic>
+                <wp14:sizeRelH relativeFrom="margin">
+                  <wp14:pctWidth>0</wp14:pctWidth>
+                </wp14:sizeRelH>
+                <wp14:sizeRelV relativeFrom="margin">
+                  <wp14:pctHeight>0</wp14:pctHeight>
+                </wp14:sizeRelV>
+              </wp:anchor>
+            </w:drawing>
+          </mc:Choice>
+          <mc:Fallback>
+            <w:pict>
+              <v:rect w14:anchorId="3EF10B09" id="Rectangle 6" o:spid="_x0000_s1026" style="position:absolute;margin-left:2.3pt;margin-top:73.7pt;width:46.85pt;height:7.45pt;z-index:251674624;visibility:visible;mso-wrap-style:square;mso-width-percent:0;mso-height-percent:0;mso-wrap-distance-left:9pt;mso-wrap-distance-top:0;mso-wrap-distance-right:9pt;mso-wrap-distance-bottom:0;mso-position-horizontal:absolute;mso-position-horizontal-relative:text;mso-position-vertical:absolute;mso-position-vertical-relative:text;mso-width-percent:0;mso-height-percent:0;mso-width-relative:margin;mso-height-relative:margin;v-text-anchor:middle" o:gfxdata="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" filled="f" strokecolor="#c00000" strokeweight="1pt"/>
+            </w:pict>
+          </mc:Fallback>
+        </mc:AlternateContent>
+      </w:r>
+      <w:r>
+        <w:rPr>
+          <w:noProof/>
+        </w:rPr>
+        <w:drawing>
+          <wp:anchor distT="0" distB="0" distL="114300" distR="114300" simplePos="0" relativeHeight="251673600" behindDoc="0" locked="0" layoutInCell="1" allowOverlap="1" wp14:anchorId="5E59B033" wp14:editId="4EA4904A">
+            <wp:simplePos x="914400" y="914400"/>
+            <wp:positionH relativeFrom="column">
+              <wp:align>left</wp:align>
+            </wp:positionH>
+            <wp:positionV relativeFrom="paragraph">
+              <wp:align>top</wp:align>
+            </wp:positionV>
+            <wp:extent cx="2800151" cy="1708030"/>
+            <wp:effectExtent l="0" t="0" r="635" b="6985"/>
+            <wp:wrapSquare wrapText="bothSides"/>
+            <wp:docPr id="423461763" name="Picture 7" descr="A screenshot of a computer program&#10;&#10;AI-generated content may be incorrect."/>
+            <wp:cNvGraphicFramePr>
+              <a:graphicFrameLocks xmlns:a="http://schemas.openxmlformats.org/drawingml/2006/main" noChangeAspect="1"/>
+            </wp:cNvGraphicFramePr>
+            <a:graphic xmlns:a="http://schemas.openxmlformats.org/drawingml/2006/main">
+              <a:graphicData uri="http://schemas.openxmlformats.org/drawingml/2006/picture">
+                <pic:pic xmlns:pic="http://schemas.openxmlformats.org/drawingml/2006/picture">
+                  <pic:nvPicPr>
+                    <pic:cNvPr id="423461763" name="Picture 7" descr="A screenshot of a computer program&#10;&#10;AI-generated content may be incorrect."/>
+                    <pic:cNvPicPr>
+                      <a:picLocks noChangeAspect="1" noChangeArrowheads="1"/>
+                    </pic:cNvPicPr>
+                  </pic:nvPicPr>
+                  <pic:blipFill>
+                    <a:blip r:embed="rId13" cstate="print">
+                      <a:extLst>
+                        <a:ext uri="{28A0092B-C50C-407E-A947-70E740481C1C}">
+                          <a14:useLocalDpi xmlns:a14="http://schemas.microsoft.com/office/drawing/2010/main" val="0"/>
+                        </a:ext>
+                      </a:extLst>
+                    </a:blip>
+                    <a:srcRect/>
+                    <a:stretch>
+                      <a:fillRect/>
+                    </a:stretch>
+                  </pic:blipFill>
+                  <pic:spPr bwMode="auto">
+                    <a:xfrm>
+                      <a:off x="0" y="0"/>
+                      <a:ext cx="2800151" cy="1708030"/>
+                    </a:xfrm>
+                    <a:prstGeom prst="rect">
+                      <a:avLst/>
+                    </a:prstGeom>
+                    <a:noFill/>
+                    <a:ln>
+                      <a:noFill/>
+                    </a:ln>
+                  </pic:spPr>
+                </pic:pic>
+              </a:graphicData>
+            </a:graphic>
+          </wp:anchor>
+        </w:drawing>
+      </w:r>
+      <w:r>
+        <w:t xml:space="preserve"> </w:t>
+      </w:r>
+      <w:r>
+        <w:t>If the user enters a username that is already taken, a message will be displayed, prompting them to choose a different one. This process will continue until the user provides a unique username. The menu functions properly without any issues</w:t>
+      </w:r>
+      <w:r>
+        <w:t>.</w:t>
+      </w:r>
+    </w:p>
+    <w:p/>
+    <w:p>
+      <w:r>
+        <w:rPr>
+          <w:noProof/>
+        </w:rPr>
+        <w:drawing>
+          <wp:anchor distT="0" distB="0" distL="114300" distR="114300" simplePos="0" relativeHeight="251677696" behindDoc="0" locked="0" layoutInCell="1" allowOverlap="1" wp14:anchorId="61188B67" wp14:editId="69B1E435">
+            <wp:simplePos x="0" y="0"/>
+            <wp:positionH relativeFrom="margin">
+              <wp:align>left</wp:align>
+            </wp:positionH>
+            <wp:positionV relativeFrom="paragraph">
+              <wp:posOffset>599847</wp:posOffset>
+            </wp:positionV>
+            <wp:extent cx="4004945" cy="1784909"/>
+            <wp:effectExtent l="0" t="0" r="0" b="6350"/>
+            <wp:wrapSquare wrapText="bothSides"/>
+            <wp:docPr id="1879726047" name="Picture 9"/>
+            <wp:cNvGraphicFramePr>
+              <a:graphicFrameLocks xmlns:a="http://schemas.openxmlformats.org/drawingml/2006/main" noChangeAspect="1"/>
+            </wp:cNvGraphicFramePr>
+            <a:graphic xmlns:a="http://schemas.openxmlformats.org/drawingml/2006/main">
+              <a:graphicData uri="http://schemas.openxmlformats.org/drawingml/2006/picture">
+                <pic:pic xmlns:pic="http://schemas.openxmlformats.org/drawingml/2006/picture">
+                  <pic:nvPicPr>
+                    <pic:cNvPr id="0" name="Picture 7"/>
+                    <pic:cNvPicPr>
+                      <a:picLocks noChangeAspect="1" noChangeArrowheads="1"/>
+                    </pic:cNvPicPr>
+                  </pic:nvPicPr>
+                  <pic:blipFill>
+                    <a:blip r:embed="rId14" cstate="print">
+                      <a:extLst>
+                        <a:ext uri="{28A0092B-C50C-407E-A947-70E740481C1C}">
+                          <a14:useLocalDpi xmlns:a14="http://schemas.microsoft.com/office/drawing/2010/main" val="0"/>
+                        </a:ext>
+                      </a:extLst>
+                    </a:blip>
+                    <a:srcRect/>
+                    <a:stretch>
+                      <a:fillRect/>
+                    </a:stretch>
+                  </pic:blipFill>
+                  <pic:spPr bwMode="auto">
+                    <a:xfrm>
+                      <a:off x="0" y="0"/>
+                      <a:ext cx="4004945" cy="1784909"/>
+                    </a:xfrm>
+                    <a:prstGeom prst="rect">
+                      <a:avLst/>
+                    </a:prstGeom>
+                    <a:noFill/>
+                    <a:ln>
+                      <a:noFill/>
+                    </a:ln>
+                  </pic:spPr>
+                </pic:pic>
+              </a:graphicData>
+            </a:graphic>
+          </wp:anchor>
+        </w:drawing>
+      </w:r>
+    </w:p>
+    <w:p/>
+    <w:p>
+      <w:pPr>
+        <w:rPr>
+          <w:rFonts w:asciiTheme="minorHAnsi" w:hAnsiTheme="minorHAnsi"/>
+        </w:rPr>
+      </w:pPr>
+      <w:r>
+        <w:rPr>
+          <w:rFonts w:asciiTheme="minorHAnsi" w:hAnsiTheme="minorHAnsi"/>
+          <w:noProof/>
+        </w:rPr>
+        <mc:AlternateContent>
+          <mc:Choice Requires="wps">
+            <w:drawing>
+              <wp:anchor distT="0" distB="0" distL="114300" distR="114300" simplePos="0" relativeHeight="251687936" behindDoc="0" locked="0" layoutInCell="1" allowOverlap="1" wp14:anchorId="5464521B" wp14:editId="7C8FBC8F">
+                <wp:simplePos x="0" y="0"/>
+                <wp:positionH relativeFrom="column">
+                  <wp:posOffset>41376</wp:posOffset>
+                </wp:positionH>
+                <wp:positionV relativeFrom="paragraph">
+                  <wp:posOffset>1638734</wp:posOffset>
+                </wp:positionV>
+                <wp:extent cx="173777" cy="82751"/>
+                <wp:effectExtent l="0" t="0" r="17145" b="12700"/>
+                <wp:wrapNone/>
+                <wp:docPr id="271787738" name="Rectangle 6"/>
+                <wp:cNvGraphicFramePr/>
+                <a:graphic xmlns:a="http://schemas.openxmlformats.org/drawingml/2006/main">
+                  <a:graphicData uri="http://schemas.microsoft.com/office/word/2010/wordprocessingShape">
+                    <wps:wsp>
+                      <wps:cNvSpPr/>
+                      <wps:spPr>
+                        <a:xfrm>
+                          <a:off x="0" y="0"/>
+                          <a:ext cx="173777" cy="82751"/>
+                        </a:xfrm>
+                        <a:prstGeom prst="rect">
+                          <a:avLst/>
+                        </a:prstGeom>
+                        <a:noFill/>
+                        <a:ln w="12700" cap="flat" cmpd="sng" algn="ctr">
+                          <a:solidFill>
+                            <a:srgbClr val="C00000"/>
+                          </a:solidFill>
+                          <a:prstDash val="solid"/>
+                          <a:miter lim="800000"/>
+                        </a:ln>
+                        <a:effectLst/>
+                      </wps:spPr>
+                      <wps:bodyPr rot="0" spcFirstLastPara="0" vertOverflow="overflow" horzOverflow="overflow" vert="horz" wrap="square" lIns="91440" tIns="45720" rIns="91440" bIns="45720" numCol="1" spcCol="0" rtlCol="0" fromWordArt="0" anchor="ctr" anchorCtr="0" forceAA="0" compatLnSpc="1">
+                        <a:prstTxWarp prst="textNoShape">
+                          <a:avLst/>
+                        </a:prstTxWarp>
+                        <a:noAutofit/>
+                      </wps:bodyPr>
+                    </wps:wsp>
+                  </a:graphicData>
+                </a:graphic>
+                <wp14:sizeRelH relativeFrom="margin">
+                  <wp14:pctWidth>0</wp14:pctWidth>
+                </wp14:sizeRelH>
+                <wp14:sizeRelV relativeFrom="margin">
+                  <wp14:pctHeight>0</wp14:pctHeight>
+                </wp14:sizeRelV>
+              </wp:anchor>
+            </w:drawing>
+          </mc:Choice>
+          <mc:Fallback>
+            <w:pict>
+              <v:rect w14:anchorId="68C8D1FE" id="Rectangle 6" o:spid="_x0000_s1026" style="position:absolute;margin-left:3.25pt;margin-top:129.05pt;width:13.7pt;height:6.5pt;z-index:251687936;visibility:visible;mso-wrap-style:square;mso-width-percent:0;mso-height-percent:0;mso-wrap-distance-left:9pt;mso-wrap-distance-top:0;mso-wrap-distance-right:9pt;mso-wrap-distance-bottom:0;mso-position-horizontal:absolute;mso-position-horizontal-relative:text;mso-position-vertical:absolute;mso-position-vertical-relative:text;mso-width-percent:0;mso-height-percent:0;mso-width-relative:margin;mso-height-relative:margin;v-text-anchor:middle" o:gfxdata="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" filled="f" strokecolor="#c00000" strokeweight="1pt"/>
+            </w:pict>
+          </mc:Fallback>
+        </mc:AlternateContent>
+      </w:r>
+      <w:r>
+        <w:rPr>
+          <w:rFonts w:asciiTheme="minorHAnsi" w:hAnsiTheme="minorHAnsi"/>
+          <w:noProof/>
+        </w:rPr>
+        <mc:AlternateContent>
+          <mc:Choice Requires="wps">
+            <w:drawing>
+              <wp:anchor distT="0" distB="0" distL="114300" distR="114300" simplePos="0" relativeHeight="251685888" behindDoc="0" locked="0" layoutInCell="1" allowOverlap="1" wp14:anchorId="60EE9A01" wp14:editId="59E7E0E0">
+                <wp:simplePos x="0" y="0"/>
+                <wp:positionH relativeFrom="column">
+                  <wp:posOffset>53788</wp:posOffset>
+                </wp:positionH>
+                <wp:positionV relativeFrom="paragraph">
+                  <wp:posOffset>1278766</wp:posOffset>
+                </wp:positionV>
+                <wp:extent cx="256529" cy="99302"/>
+                <wp:effectExtent l="0" t="0" r="10795" b="15240"/>
+                <wp:wrapNone/>
+                <wp:docPr id="637901382" name="Rectangle 6"/>
+                <wp:cNvGraphicFramePr/>
+                <a:graphic xmlns:a="http://schemas.openxmlformats.org/drawingml/2006/main">
+                  <a:graphicData uri="http://schemas.microsoft.com/office/word/2010/wordprocessingShape">
+                    <wps:wsp>
+                      <wps:cNvSpPr/>
+                      <wps:spPr>
+                        <a:xfrm>
+                          <a:off x="0" y="0"/>
+                          <a:ext cx="256529" cy="99302"/>
+                        </a:xfrm>
+                        <a:prstGeom prst="rect">
+                          <a:avLst/>
+                        </a:prstGeom>
+                        <a:noFill/>
+                        <a:ln w="12700" cap="flat" cmpd="sng" algn="ctr">
+                          <a:solidFill>
+                            <a:srgbClr val="C00000"/>
+                          </a:solidFill>
+                          <a:prstDash val="solid"/>
+                          <a:miter lim="800000"/>
+                        </a:ln>
+                        <a:effectLst/>
+                      </wps:spPr>
+                      <wps:bodyPr rot="0" spcFirstLastPara="0" vertOverflow="overflow" horzOverflow="overflow" vert="horz" wrap="square" lIns="91440" tIns="45720" rIns="91440" bIns="45720" numCol="1" spcCol="0" rtlCol="0" fromWordArt="0" anchor="ctr" anchorCtr="0" forceAA="0" compatLnSpc="1">
+                        <a:prstTxWarp prst="textNoShape">
+                          <a:avLst/>
+                        </a:prstTxWarp>
+                        <a:noAutofit/>
+                      </wps:bodyPr>
+                    </wps:wsp>
+                  </a:graphicData>
+                </a:graphic>
+                <wp14:sizeRelH relativeFrom="margin">
+                  <wp14:pctWidth>0</wp14:pctWidth>
+                </wp14:sizeRelH>
+                <wp14:sizeRelV relativeFrom="margin">
+                  <wp14:pctHeight>0</wp14:pctHeight>
+                </wp14:sizeRelV>
+              </wp:anchor>
+            </w:drawing>
+          </mc:Choice>
+          <mc:Fallback>
+            <w:pict>
+              <v:rect w14:anchorId="65BFE833" id="Rectangle 6" o:spid="_x0000_s1026" style="position:absolute;margin-left:4.25pt;margin-top:100.7pt;width:20.2pt;height:7.8pt;z-index:251685888;visibility:visible;mso-wrap-style:square;mso-width-percent:0;mso-height-percent:0;mso-wrap-distance-left:9pt;mso-wrap-distance-top:0;mso-wrap-distance-right:9pt;mso-wrap-distance-bottom:0;mso-position-horizontal:absolute;mso-position-horizontal-relative:text;mso-position-vertical:absolute;mso-position-vertical-relative:text;mso-width-percent:0;mso-height-percent:0;mso-width-relative:margin;mso-height-relative:margin;v-text-anchor:middle" o:gfxdata="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" filled="f" strokecolor="#c00000" strokeweight="1pt"/>
+            </w:pict>
+          </mc:Fallback>
+        </mc:AlternateContent>
+      </w:r>
+      <w:r>
+        <w:rPr>
+          <w:rFonts w:asciiTheme="minorHAnsi" w:hAnsiTheme="minorHAnsi"/>
+          <w:noProof/>
+        </w:rPr>
+        <mc:AlternateContent>
+          <mc:Choice Requires="wps">
+            <w:drawing>
+              <wp:anchor distT="0" distB="0" distL="114300" distR="114300" simplePos="0" relativeHeight="251683840" behindDoc="0" locked="0" layoutInCell="1" allowOverlap="1" wp14:anchorId="6ADE57B0" wp14:editId="306E3069">
+                <wp:simplePos x="0" y="0"/>
+                <wp:positionH relativeFrom="column">
+                  <wp:posOffset>951638</wp:posOffset>
+                </wp:positionH>
+                <wp:positionV relativeFrom="paragraph">
+                  <wp:posOffset>906386</wp:posOffset>
+                </wp:positionV>
+                <wp:extent cx="422031" cy="115852"/>
+                <wp:effectExtent l="0" t="0" r="16510" b="17780"/>
+                <wp:wrapNone/>
+                <wp:docPr id="1351200099" name="Rectangle 6"/>
+                <wp:cNvGraphicFramePr/>
+                <a:graphic xmlns:a="http://schemas.openxmlformats.org/drawingml/2006/main">
+                  <a:graphicData uri="http://schemas.microsoft.com/office/word/2010/wordprocessingShape">
+                    <wps:wsp>
+                      <wps:cNvSpPr/>
+                      <wps:spPr>
+                        <a:xfrm>
+                          <a:off x="0" y="0"/>
+                          <a:ext cx="422031" cy="115852"/>
+                        </a:xfrm>
+                        <a:prstGeom prst="rect">
+                          <a:avLst/>
+                        </a:prstGeom>
+                        <a:noFill/>
+                        <a:ln w="12700" cap="flat" cmpd="sng" algn="ctr">
+                          <a:solidFill>
+                            <a:srgbClr val="C00000"/>
+                          </a:solidFill>
+                          <a:prstDash val="solid"/>
+                          <a:miter lim="800000"/>
+                        </a:ln>
+                        <a:effectLst/>
+                      </wps:spPr>
+                      <wps:bodyPr rot="0" spcFirstLastPara="0" vertOverflow="overflow" horzOverflow="overflow" vert="horz" wrap="square" lIns="91440" tIns="45720" rIns="91440" bIns="45720" numCol="1" spcCol="0" rtlCol="0" fromWordArt="0" anchor="ctr" anchorCtr="0" forceAA="0" compatLnSpc="1">
+                        <a:prstTxWarp prst="textNoShape">
+                          <a:avLst/>
+                        </a:prstTxWarp>
+                        <a:noAutofit/>
+                      </wps:bodyPr>
+                    </wps:wsp>
+                  </a:graphicData>
+                </a:graphic>
+                <wp14:sizeRelH relativeFrom="margin">
+                  <wp14:pctWidth>0</wp14:pctWidth>
+                </wp14:sizeRelH>
+                <wp14:sizeRelV relativeFrom="margin">
+                  <wp14:pctHeight>0</wp14:pctHeight>
+                </wp14:sizeRelV>
+              </wp:anchor>
+            </w:drawing>
+          </mc:Choice>
+          <mc:Fallback>
+            <w:pict>
+              <v:rect w14:anchorId="3B4370AA" id="Rectangle 6" o:spid="_x0000_s1026" style="position:absolute;margin-left:74.95pt;margin-top:71.35pt;width:33.25pt;height:9.1pt;z-index:251683840;visibility:visible;mso-wrap-style:square;mso-width-percent:0;mso-height-percent:0;mso-wrap-distance-left:9pt;mso-wrap-distance-top:0;mso-wrap-distance-right:9pt;mso-wrap-distance-bottom:0;mso-position-horizontal:absolute;mso-position-horizontal-relative:text;mso-position-vertical:absolute;mso-position-vertical-relative:text;mso-width-percent:0;mso-height-percent:0;mso-width-relative:margin;mso-height-relative:margin;v-text-anchor:middle" o:gfxdata="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" filled="f" strokecolor="#c00000" strokeweight="1pt"/>
+            </w:pict>
+          </mc:Fallback>
+        </mc:AlternateContent>
+      </w:r>
+      <w:r>
+        <w:rPr>
+          <w:rFonts w:asciiTheme="minorHAnsi" w:hAnsiTheme="minorHAnsi"/>
+          <w:noProof/>
+        </w:rPr>
+        <mc:AlternateContent>
+          <mc:Choice Requires="wps">
+            <w:drawing>
+              <wp:anchor distT="0" distB="0" distL="114300" distR="114300" simplePos="0" relativeHeight="251681792" behindDoc="0" locked="0" layoutInCell="1" allowOverlap="1" wp14:anchorId="2248E4A4" wp14:editId="2CA83066">
+                <wp:simplePos x="0" y="0"/>
+                <wp:positionH relativeFrom="column">
+                  <wp:posOffset>66202</wp:posOffset>
+                </wp:positionH>
+                <wp:positionV relativeFrom="paragraph">
+                  <wp:posOffset>542281</wp:posOffset>
+                </wp:positionV>
+                <wp:extent cx="297904" cy="103439"/>
+                <wp:effectExtent l="0" t="0" r="26035" b="11430"/>
+                <wp:wrapNone/>
+                <wp:docPr id="450113066" name="Rectangle 6"/>
+                <wp:cNvGraphicFramePr/>
+                <a:graphic xmlns:a="http://schemas.openxmlformats.org/drawingml/2006/main">
+                  <a:graphicData uri="http://schemas.microsoft.com/office/word/2010/wordprocessingShape">
+                    <wps:wsp>
+                      <wps:cNvSpPr/>
+                      <wps:spPr>
+                        <a:xfrm>
+                          <a:off x="0" y="0"/>
+                          <a:ext cx="297904" cy="103439"/>
+                        </a:xfrm>
+                        <a:prstGeom prst="rect">
+                          <a:avLst/>
+                        </a:prstGeom>
+                        <a:noFill/>
+                        <a:ln w="12700" cap="flat" cmpd="sng" algn="ctr">
+                          <a:solidFill>
+                            <a:srgbClr val="C00000"/>
+                          </a:solidFill>
+                          <a:prstDash val="solid"/>
+                          <a:miter lim="800000"/>
+                        </a:ln>
+                        <a:effectLst/>
+                      </wps:spPr>
+                      <wps:bodyPr rot="0" spcFirstLastPara="0" vertOverflow="overflow" horzOverflow="overflow" vert="horz" wrap="square" lIns="91440" tIns="45720" rIns="91440" bIns="45720" numCol="1" spcCol="0" rtlCol="0" fromWordArt="0" anchor="ctr" anchorCtr="0" forceAA="0" compatLnSpc="1">
+                        <a:prstTxWarp prst="textNoShape">
+                          <a:avLst/>
+                        </a:prstTxWarp>
+                        <a:noAutofit/>
+                      </wps:bodyPr>
+                    </wps:wsp>
+                  </a:graphicData>
+                </a:graphic>
+                <wp14:sizeRelH relativeFrom="margin">
+                  <wp14:pctWidth>0</wp14:pctWidth>
+                </wp14:sizeRelH>
+                <wp14:sizeRelV relativeFrom="margin">
+                  <wp14:pctHeight>0</wp14:pctHeight>
+                </wp14:sizeRelV>
+              </wp:anchor>
+            </w:drawing>
+          </mc:Choice>
+          <mc:Fallback>
+            <w:pict>
+              <v:rect w14:anchorId="52F6996D" id="Rectangle 6" o:spid="_x0000_s1026" style="position:absolute;margin-left:5.2pt;margin-top:42.7pt;width:23.45pt;height:8.15pt;z-index:251681792;visibility:visible;mso-wrap-style:square;mso-width-percent:0;mso-height-percent:0;mso-wrap-distance-left:9pt;mso-wrap-distance-top:0;mso-wrap-distance-right:9pt;mso-wrap-distance-bottom:0;mso-position-horizontal:absolute;mso-position-horizontal-relative:text;mso-position-vertical:absolute;mso-position-vertical-relative:text;mso-width-percent:0;mso-height-percent:0;mso-width-relative:margin;mso-height-relative:margin;v-text-anchor:middle" o:gfxdata="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" filled="f" strokecolor="#c00000" strokeweight="1pt"/>
+            </w:pict>
+          </mc:Fallback>
+        </mc:AlternateContent>
+      </w:r>
+      <w:r>
+        <w:rPr>
+          <w:rFonts w:asciiTheme="minorHAnsi" w:hAnsiTheme="minorHAnsi"/>
+          <w:noProof/>
+        </w:rPr>
+        <mc:AlternateContent>
+          <mc:Choice Requires="wps">
+            <w:drawing>
+              <wp:anchor distT="0" distB="0" distL="114300" distR="114300" simplePos="0" relativeHeight="251679744" behindDoc="0" locked="0" layoutInCell="1" allowOverlap="1" wp14:anchorId="4B7A61E9" wp14:editId="2C9608CD">
+                <wp:simplePos x="0" y="0"/>
+                <wp:positionH relativeFrom="column">
+                  <wp:posOffset>66201</wp:posOffset>
+                </wp:positionH>
+                <wp:positionV relativeFrom="paragraph">
+                  <wp:posOffset>256790</wp:posOffset>
+                </wp:positionV>
+                <wp:extent cx="384793" cy="115852"/>
+                <wp:effectExtent l="0" t="0" r="15875" b="17780"/>
+                <wp:wrapNone/>
+                <wp:docPr id="1381092345" name="Rectangle 6"/>
+                <wp:cNvGraphicFramePr/>
+                <a:graphic xmlns:a="http://schemas.openxmlformats.org/drawingml/2006/main">
+                  <a:graphicData uri="http://schemas.microsoft.com/office/word/2010/wordprocessingShape">
+                    <wps:wsp>
+                      <wps:cNvSpPr/>
+                      <wps:spPr>
+                        <a:xfrm>
+                          <a:off x="0" y="0"/>
+                          <a:ext cx="384793" cy="115852"/>
+                        </a:xfrm>
+                        <a:prstGeom prst="rect">
+                          <a:avLst/>
+                        </a:prstGeom>
+                        <a:noFill/>
+                        <a:ln w="12700" cap="flat" cmpd="sng" algn="ctr">
+                          <a:solidFill>
+                            <a:srgbClr val="C00000"/>
+                          </a:solidFill>
+                          <a:prstDash val="solid"/>
+                          <a:miter lim="800000"/>
+                        </a:ln>
+                        <a:effectLst/>
+                      </wps:spPr>
+                      <wps:bodyPr rot="0" spcFirstLastPara="0" vertOverflow="overflow" horzOverflow="overflow" vert="horz" wrap="square" lIns="91440" tIns="45720" rIns="91440" bIns="45720" numCol="1" spcCol="0" rtlCol="0" fromWordArt="0" anchor="ctr" anchorCtr="0" forceAA="0" compatLnSpc="1">
+                        <a:prstTxWarp prst="textNoShape">
+                          <a:avLst/>
+                        </a:prstTxWarp>
+                        <a:noAutofit/>
+                      </wps:bodyPr>
+                    </wps:wsp>
+                  </a:graphicData>
+                </a:graphic>
+                <wp14:sizeRelH relativeFrom="margin">
+                  <wp14:pctWidth>0</wp14:pctWidth>
+                </wp14:sizeRelH>
+                <wp14:sizeRelV relativeFrom="margin">
+                  <wp14:pctHeight>0</wp14:pctHeight>
+                </wp14:sizeRelV>
+              </wp:anchor>
+            </w:drawing>
+          </mc:Choice>
+          <mc:Fallback>
+            <w:pict>
+              <v:rect w14:anchorId="716DF64B" id="Rectangle 6" o:spid="_x0000_s1026" style="position:absolute;margin-left:5.2pt;margin-top:20.2pt;width:30.3pt;height:9.1pt;z-index:251679744;visibility:visible;mso-wrap-style:square;mso-width-percent:0;mso-height-percent:0;mso-wrap-distance-left:9pt;mso-wrap-distance-top:0;mso-wrap-distance-right:9pt;mso-wrap-distance-bottom:0;mso-position-horizontal:absolute;mso-position-horizontal-relative:text;mso-position-vertical:absolute;mso-position-vertical-relative:text;mso-width-percent:0;mso-height-percent:0;mso-width-relative:margin;mso-height-relative:margin;v-text-anchor:middle" o:gfxdata="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" filled="f" strokecolor="#c00000" strokeweight="1pt"/>
+            </w:pict>
+          </mc:Fallback>
+        </mc:AlternateContent>
+      </w:r>
+      <w:r>
+        <w:rPr>
+          <w:rFonts w:asciiTheme="minorHAnsi" w:hAnsiTheme="minorHAnsi"/>
+        </w:rPr>
+        <w:t xml:space="preserve">If a suitable username is provided, the process moves to the password entry, which must be between 8 to 16 characters. After setting the password, the user is required to enter an amount for deposit, which is validated to ensure it is a valid number. Once all inputs are correctly provided, the user gains access to the </w:t>
+      </w:r>
+      <w:proofErr w:type="spellStart"/>
+      <w:r>
+        <w:rPr>
+          <w:rStyle w:val="HTMLCode"/>
+          <w:rFonts w:asciiTheme="minorHAnsi" w:eastAsia="Aptos" w:hAnsiTheme="minorHAnsi"/>
+        </w:rPr>
+        <w:t>APP_main_interface</w:t>
+      </w:r>
+      <w:proofErr w:type="spellEnd"/>
+      <w:r>
+        <w:rPr>
+          <w:rStyle w:val="HTMLCode"/>
+          <w:rFonts w:asciiTheme="minorHAnsi" w:eastAsia="Aptos" w:hAnsiTheme="minorHAnsi"/>
+        </w:rPr>
+        <w:t>()</w:t>
+      </w:r>
+      <w:r>
+        <w:rPr>
+          <w:rFonts w:asciiTheme="minorHAnsi" w:hAnsiTheme="minorHAnsi"/>
+        </w:rPr>
+        <w:t xml:space="preserve">. The menu operates smoothly without </w:t>
+      </w:r>
+    </w:p>
+    <w:p>
+      <w:pPr>
+        <w:pStyle w:val="ListParagraph"/>
+        <w:rPr>
+          <w:color w:val="A6A6A6" w:themeColor="background1" w:themeShade="A6"/>
+        </w:rPr>
+      </w:pPr>
+      <w:r>
+        <w:rPr>
+          <w:color w:val="A6A6A6" w:themeColor="background1" w:themeShade="A6"/>
+        </w:rPr>
+        <w:lastRenderedPageBreak/>
+        <w:t>ID:3075614 , Module: FC72</w:t>
+      </w:r>
+      <w:r>
+        <w:rPr>
+          <w:color w:val="A6A6A6" w:themeColor="background1" w:themeShade="A6"/>
+        </w:rPr>
+        <w:t>3</w:t>
+      </w:r>
+      <w:r>
+        <w:rPr>
+          <w:color w:val="A6A6A6" w:themeColor="background1" w:themeShade="A6"/>
+        </w:rPr>
+        <w:t xml:space="preserve"> , </w:t>
+      </w:r>
+      <w:r>
+        <w:rPr>
+          <w:color w:val="A6A6A6" w:themeColor="background1" w:themeShade="A6"/>
+        </w:rPr>
+        <w:t>Sophie Norman</w:t>
+      </w:r>
+      <w:r>
+        <w:rPr>
+          <w:color w:val="A6A6A6" w:themeColor="background1" w:themeShade="A6"/>
+        </w:rPr>
+        <w:t>.</w:t>
+      </w:r>
+    </w:p>
+    <w:p>
+      <w:pPr>
+        <w:rPr>
+          <w:rFonts w:asciiTheme="minorHAnsi" w:hAnsiTheme="minorHAnsi"/>
+        </w:rPr>
+      </w:pPr>
+      <w:r>
+        <w:rPr>
+          <w:rFonts w:asciiTheme="minorHAnsi" w:hAnsiTheme="minorHAnsi"/>
+        </w:rPr>
+        <w:t>any issues</w:t>
+      </w:r>
+      <w:r>
+        <w:rPr>
+          <w:rFonts w:asciiTheme="minorHAnsi" w:hAnsiTheme="minorHAnsi"/>
+        </w:rPr>
+        <w:t>.</w:t>
+      </w:r>
+      <w:r>
+        <w:rPr>
+          <w:rFonts w:asciiTheme="minorHAnsi" w:hAnsiTheme="minorHAnsi"/>
+        </w:rPr>
+        <w:br w:type="textWrapping" w:clear="all"/>
+      </w:r>
+    </w:p>
+    <w:p>
+      <w:r>
+        <w:rPr>
+          <w:b/>
+          <w:bCs/>
+        </w:rPr>
+        <w:t xml:space="preserve">If user choose </w:t>
+      </w:r>
+      <w:proofErr w:type="gramStart"/>
+      <w:r>
+        <w:rPr>
+          <w:b/>
+          <w:bCs/>
+        </w:rPr>
+        <w:t>log</w:t>
+      </w:r>
+      <w:proofErr w:type="gramEnd"/>
+      <w:r>
+        <w:rPr>
+          <w:b/>
+          <w:bCs/>
+        </w:rPr>
+        <w:t xml:space="preserve"> in</w:t>
+      </w:r>
+      <w:r>
+        <w:rPr>
+          <w:b/>
+          <w:bCs/>
+        </w:rPr>
+        <w:t>:</w:t>
+      </w:r>
+    </w:p>
+    <w:p>
+      <w:r>
+        <w:rPr>
+          <w:noProof/>
+        </w:rPr>
+        <mc:AlternateContent>
+          <mc:Choice Requires="wps">
+            <w:drawing>
+              <wp:anchor distT="0" distB="0" distL="114300" distR="114300" simplePos="0" relativeHeight="251698176" behindDoc="0" locked="0" layoutInCell="1" allowOverlap="1" wp14:anchorId="33D20043" wp14:editId="3C4CED08">
+                <wp:simplePos x="0" y="0"/>
+                <wp:positionH relativeFrom="column">
+                  <wp:posOffset>91440</wp:posOffset>
+                </wp:positionH>
+                <wp:positionV relativeFrom="paragraph">
+                  <wp:posOffset>2231390</wp:posOffset>
+                </wp:positionV>
+                <wp:extent cx="659130" cy="110490"/>
+                <wp:effectExtent l="0" t="0" r="26670" b="22860"/>
+                <wp:wrapNone/>
+                <wp:docPr id="1460281810" name="Rectangle 6"/>
+                <wp:cNvGraphicFramePr/>
+                <a:graphic xmlns:a="http://schemas.openxmlformats.org/drawingml/2006/main">
+                  <a:graphicData uri="http://schemas.microsoft.com/office/word/2010/wordprocessingShape">
+                    <wps:wsp>
+                      <wps:cNvSpPr/>
+                      <wps:spPr>
+                        <a:xfrm>
+                          <a:off x="0" y="0"/>
+                          <a:ext cx="659130" cy="110490"/>
+                        </a:xfrm>
+                        <a:prstGeom prst="rect">
+                          <a:avLst/>
+                        </a:prstGeom>
+                        <a:noFill/>
+                        <a:ln w="12700" cap="flat" cmpd="sng" algn="ctr">
+                          <a:solidFill>
+                            <a:srgbClr val="C00000"/>
+                          </a:solidFill>
+                          <a:prstDash val="solid"/>
+                          <a:miter lim="800000"/>
+                        </a:ln>
+                        <a:effectLst/>
+                      </wps:spPr>
+                      <wps:bodyPr rot="0" spcFirstLastPara="0" vertOverflow="overflow" horzOverflow="overflow" vert="horz" wrap="square" lIns="91440" tIns="45720" rIns="91440" bIns="45720" numCol="1" spcCol="0" rtlCol="0" fromWordArt="0" anchor="ctr" anchorCtr="0" forceAA="0" compatLnSpc="1">
+                        <a:prstTxWarp prst="textNoShape">
+                          <a:avLst/>
+                        </a:prstTxWarp>
+                        <a:noAutofit/>
+                      </wps:bodyPr>
+                    </wps:wsp>
+                  </a:graphicData>
+                </a:graphic>
+                <wp14:sizeRelH relativeFrom="margin">
+                  <wp14:pctWidth>0</wp14:pctWidth>
+                </wp14:sizeRelH>
+                <wp14:sizeRelV relativeFrom="margin">
+                  <wp14:pctHeight>0</wp14:pctHeight>
+                </wp14:sizeRelV>
+              </wp:anchor>
+            </w:drawing>
+          </mc:Choice>
+          <mc:Fallback>
+            <w:pict>
+              <v:rect w14:anchorId="095A95B4" id="Rectangle 6" o:spid="_x0000_s1026" style="position:absolute;margin-left:7.2pt;margin-top:175.7pt;width:51.9pt;height:8.7pt;z-index:251698176;visibility:visible;mso-wrap-style:square;mso-width-percent:0;mso-height-percent:0;mso-wrap-distance-left:9pt;mso-wrap-distance-top:0;mso-wrap-distance-right:9pt;mso-wrap-distance-bottom:0;mso-position-horizontal:absolute;mso-position-horizontal-relative:text;mso-position-vertical:absolute;mso-position-vertical-relative:text;mso-width-percent:0;mso-height-percent:0;mso-width-relative:margin;mso-height-relative:margin;v-text-anchor:middle" o:gfxdata="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" filled="f" strokecolor="#c00000" strokeweight="1pt"/>
+            </w:pict>
+          </mc:Fallback>
+        </mc:AlternateContent>
+      </w:r>
+      <w:r>
+        <w:rPr>
+          <w:noProof/>
+        </w:rPr>
+        <mc:AlternateContent>
+          <mc:Choice Requires="wps">
+            <w:drawing>
+              <wp:anchor distT="0" distB="0" distL="114300" distR="114300" simplePos="0" relativeHeight="251696128" behindDoc="0" locked="0" layoutInCell="1" allowOverlap="1" wp14:anchorId="24CA8C7F" wp14:editId="392AF0E8">
+                <wp:simplePos x="0" y="0"/>
+                <wp:positionH relativeFrom="column">
+                  <wp:posOffset>963930</wp:posOffset>
+                </wp:positionH>
+                <wp:positionV relativeFrom="paragraph">
+                  <wp:posOffset>1629410</wp:posOffset>
+                </wp:positionV>
+                <wp:extent cx="605790" cy="106680"/>
+                <wp:effectExtent l="0" t="0" r="22860" b="26670"/>
+                <wp:wrapNone/>
+                <wp:docPr id="1332179479" name="Rectangle 6"/>
+                <wp:cNvGraphicFramePr/>
+                <a:graphic xmlns:a="http://schemas.openxmlformats.org/drawingml/2006/main">
+                  <a:graphicData uri="http://schemas.microsoft.com/office/word/2010/wordprocessingShape">
+                    <wps:wsp>
+                      <wps:cNvSpPr/>
+                      <wps:spPr>
+                        <a:xfrm>
+                          <a:off x="0" y="0"/>
+                          <a:ext cx="605790" cy="106680"/>
+                        </a:xfrm>
+                        <a:prstGeom prst="rect">
+                          <a:avLst/>
+                        </a:prstGeom>
+                        <a:noFill/>
+                        <a:ln w="12700" cap="flat" cmpd="sng" algn="ctr">
+                          <a:solidFill>
+                            <a:srgbClr val="C00000"/>
+                          </a:solidFill>
+                          <a:prstDash val="solid"/>
+                          <a:miter lim="800000"/>
+                        </a:ln>
+                        <a:effectLst/>
+                      </wps:spPr>
+                      <wps:bodyPr rot="0" spcFirstLastPara="0" vertOverflow="overflow" horzOverflow="overflow" vert="horz" wrap="square" lIns="91440" tIns="45720" rIns="91440" bIns="45720" numCol="1" spcCol="0" rtlCol="0" fromWordArt="0" anchor="ctr" anchorCtr="0" forceAA="0" compatLnSpc="1">
+                        <a:prstTxWarp prst="textNoShape">
+                          <a:avLst/>
+                        </a:prstTxWarp>
+                        <a:noAutofit/>
+                      </wps:bodyPr>
+                    </wps:wsp>
+                  </a:graphicData>
+                </a:graphic>
+                <wp14:sizeRelH relativeFrom="margin">
+                  <wp14:pctWidth>0</wp14:pctWidth>
+                </wp14:sizeRelH>
+                <wp14:sizeRelV relativeFrom="margin">
+                  <wp14:pctHeight>0</wp14:pctHeight>
+                </wp14:sizeRelV>
+              </wp:anchor>
+            </w:drawing>
+          </mc:Choice>
+          <mc:Fallback>
+            <w:pict>
+              <v:rect w14:anchorId="1D650B59" id="Rectangle 6" o:spid="_x0000_s1026" style="position:absolute;margin-left:75.9pt;margin-top:128.3pt;width:47.7pt;height:8.4pt;z-index:251696128;visibility:visible;mso-wrap-style:square;mso-width-percent:0;mso-height-percent:0;mso-wrap-distance-left:9pt;mso-wrap-distance-top:0;mso-wrap-distance-right:9pt;mso-wrap-distance-bottom:0;mso-position-horizontal:absolute;mso-position-horizontal-relative:text;mso-position-vertical:absolute;mso-position-vertical-relative:text;mso-width-percent:0;mso-height-percent:0;mso-width-relative:margin;mso-height-relative:margin;v-text-anchor:middle" o:gfxdata="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" filled="f" strokecolor="#c00000" strokeweight="1pt"/>
+            </w:pict>
+          </mc:Fallback>
+        </mc:AlternateContent>
+      </w:r>
+      <w:r>
+        <w:rPr>
+          <w:noProof/>
+        </w:rPr>
+        <mc:AlternateContent>
+          <mc:Choice Requires="wps">
+            <w:drawing>
+              <wp:anchor distT="0" distB="0" distL="114300" distR="114300" simplePos="0" relativeHeight="251694080" behindDoc="0" locked="0" layoutInCell="1" allowOverlap="1" wp14:anchorId="609444BD" wp14:editId="7492C4A3">
+                <wp:simplePos x="0" y="0"/>
+                <wp:positionH relativeFrom="column">
+                  <wp:posOffset>1374140</wp:posOffset>
+                </wp:positionH>
+                <wp:positionV relativeFrom="paragraph">
+                  <wp:posOffset>1198880</wp:posOffset>
+                </wp:positionV>
+                <wp:extent cx="518160" cy="129540"/>
+                <wp:effectExtent l="0" t="0" r="15240" b="22860"/>
+                <wp:wrapNone/>
+                <wp:docPr id="307755543" name="Rectangle 6"/>
+                <wp:cNvGraphicFramePr/>
+                <a:graphic xmlns:a="http://schemas.openxmlformats.org/drawingml/2006/main">
+                  <a:graphicData uri="http://schemas.microsoft.com/office/word/2010/wordprocessingShape">
+                    <wps:wsp>
+                      <wps:cNvSpPr/>
+                      <wps:spPr>
+                        <a:xfrm>
+                          <a:off x="0" y="0"/>
+                          <a:ext cx="518160" cy="129540"/>
+                        </a:xfrm>
+                        <a:prstGeom prst="rect">
+                          <a:avLst/>
+                        </a:prstGeom>
+                        <a:noFill/>
+                        <a:ln w="12700" cap="flat" cmpd="sng" algn="ctr">
+                          <a:solidFill>
+                            <a:srgbClr val="C00000"/>
+                          </a:solidFill>
+                          <a:prstDash val="solid"/>
+                          <a:miter lim="800000"/>
+                        </a:ln>
+                        <a:effectLst/>
+                      </wps:spPr>
+                      <wps:bodyPr rot="0" spcFirstLastPara="0" vertOverflow="overflow" horzOverflow="overflow" vert="horz" wrap="square" lIns="91440" tIns="45720" rIns="91440" bIns="45720" numCol="1" spcCol="0" rtlCol="0" fromWordArt="0" anchor="ctr" anchorCtr="0" forceAA="0" compatLnSpc="1">
+                        <a:prstTxWarp prst="textNoShape">
+                          <a:avLst/>
+                        </a:prstTxWarp>
+                        <a:noAutofit/>
+                      </wps:bodyPr>
+                    </wps:wsp>
+                  </a:graphicData>
+                </a:graphic>
+                <wp14:sizeRelH relativeFrom="margin">
+                  <wp14:pctWidth>0</wp14:pctWidth>
+                </wp14:sizeRelH>
+                <wp14:sizeRelV relativeFrom="margin">
+                  <wp14:pctHeight>0</wp14:pctHeight>
+                </wp14:sizeRelV>
+              </wp:anchor>
+            </w:drawing>
+          </mc:Choice>
+          <mc:Fallback>
+            <w:pict>
+              <v:rect w14:anchorId="0F89D172" id="Rectangle 6" o:spid="_x0000_s1026" style="position:absolute;margin-left:108.2pt;margin-top:94.4pt;width:40.8pt;height:10.2pt;z-index:251694080;visibility:visible;mso-wrap-style:square;mso-width-percent:0;mso-height-percent:0;mso-wrap-distance-left:9pt;mso-wrap-distance-top:0;mso-wrap-distance-right:9pt;mso-wrap-distance-bottom:0;mso-position-horizontal:absolute;mso-position-horizontal-relative:text;mso-position-vertical:absolute;mso-position-vertical-relative:text;mso-width-percent:0;mso-height-percent:0;mso-width-relative:margin;mso-height-relative:margin;v-text-anchor:middle" o:gfxdata="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" filled="f" strokecolor="#c00000" strokeweight="1pt"/>
+            </w:pict>
+          </mc:Fallback>
+        </mc:AlternateContent>
+      </w:r>
+      <w:r>
+        <w:rPr>
+          <w:noProof/>
+        </w:rPr>
+        <mc:AlternateContent>
+          <mc:Choice Requires="wps">
+            <w:drawing>
+              <wp:anchor distT="0" distB="0" distL="114300" distR="114300" simplePos="0" relativeHeight="251692032" behindDoc="0" locked="0" layoutInCell="1" allowOverlap="1" wp14:anchorId="522810B7" wp14:editId="610CD20A">
+                <wp:simplePos x="0" y="0"/>
+                <wp:positionH relativeFrom="column">
+                  <wp:posOffset>979170</wp:posOffset>
+                </wp:positionH>
+                <wp:positionV relativeFrom="paragraph">
+                  <wp:posOffset>916940</wp:posOffset>
+                </wp:positionV>
+                <wp:extent cx="461010" cy="99302"/>
+                <wp:effectExtent l="0" t="0" r="15240" b="15240"/>
+                <wp:wrapNone/>
+                <wp:docPr id="750736969" name="Rectangle 6"/>
+                <wp:cNvGraphicFramePr/>
+                <a:graphic xmlns:a="http://schemas.openxmlformats.org/drawingml/2006/main">
+                  <a:graphicData uri="http://schemas.microsoft.com/office/word/2010/wordprocessingShape">
+                    <wps:wsp>
+                      <wps:cNvSpPr/>
+                      <wps:spPr>
+                        <a:xfrm>
+                          <a:off x="0" y="0"/>
+                          <a:ext cx="461010" cy="99302"/>
+                        </a:xfrm>
+                        <a:prstGeom prst="rect">
+                          <a:avLst/>
+                        </a:prstGeom>
+                        <a:noFill/>
+                        <a:ln w="12700" cap="flat" cmpd="sng" algn="ctr">
+                          <a:solidFill>
+                            <a:srgbClr val="C00000"/>
+                          </a:solidFill>
+                          <a:prstDash val="solid"/>
+                          <a:miter lim="800000"/>
+                        </a:ln>
+                        <a:effectLst/>
+                      </wps:spPr>
+                      <wps:bodyPr rot="0" spcFirstLastPara="0" vertOverflow="overflow" horzOverflow="overflow" vert="horz" wrap="square" lIns="91440" tIns="45720" rIns="91440" bIns="45720" numCol="1" spcCol="0" rtlCol="0" fromWordArt="0" anchor="ctr" anchorCtr="0" forceAA="0" compatLnSpc="1">
+                        <a:prstTxWarp prst="textNoShape">
+                          <a:avLst/>
+                        </a:prstTxWarp>
+                        <a:noAutofit/>
+                      </wps:bodyPr>
+                    </wps:wsp>
+                  </a:graphicData>
+                </a:graphic>
+                <wp14:sizeRelH relativeFrom="margin">
+                  <wp14:pctWidth>0</wp14:pctWidth>
+                </wp14:sizeRelH>
+                <wp14:sizeRelV relativeFrom="margin">
+                  <wp14:pctHeight>0</wp14:pctHeight>
+                </wp14:sizeRelV>
+              </wp:anchor>
+            </w:drawing>
+          </mc:Choice>
+          <mc:Fallback>
+            <w:pict>
+              <v:rect w14:anchorId="4C2ED979" id="Rectangle 6" o:spid="_x0000_s1026" style="position:absolute;margin-left:77.1pt;margin-top:72.2pt;width:36.3pt;height:7.8pt;z-index:251692032;visibility:visible;mso-wrap-style:square;mso-width-percent:0;mso-height-percent:0;mso-wrap-distance-left:9pt;mso-wrap-distance-top:0;mso-wrap-distance-right:9pt;mso-wrap-distance-bottom:0;mso-position-horizontal:absolute;mso-position-horizontal-relative:text;mso-position-vertical:absolute;mso-position-vertical-relative:text;mso-width-percent:0;mso-height-percent:0;mso-width-relative:margin;mso-height-relative:margin;v-text-anchor:middle" o:gfxdata="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" filled="f" strokecolor="#c00000" strokeweight="1pt"/>
+            </w:pict>
+          </mc:Fallback>
+        </mc:AlternateContent>
+      </w:r>
+      <w:r>
+        <w:rPr>
+          <w:noProof/>
+        </w:rPr>
+        <mc:AlternateContent>
+          <mc:Choice Requires="wps">
+            <w:drawing>
+              <wp:anchor distT="0" distB="0" distL="114300" distR="114300" simplePos="0" relativeHeight="251689984" behindDoc="0" locked="0" layoutInCell="1" allowOverlap="1" wp14:anchorId="7958507E" wp14:editId="3B83B7B3">
+                <wp:simplePos x="0" y="0"/>
+                <wp:positionH relativeFrom="column">
+                  <wp:posOffset>34290</wp:posOffset>
+                </wp:positionH>
+                <wp:positionV relativeFrom="paragraph">
+                  <wp:posOffset>706120</wp:posOffset>
+                </wp:positionV>
+                <wp:extent cx="256529" cy="99302"/>
+                <wp:effectExtent l="0" t="0" r="10795" b="15240"/>
+                <wp:wrapNone/>
+                <wp:docPr id="976328590" name="Rectangle 6"/>
+                <wp:cNvGraphicFramePr/>
+                <a:graphic xmlns:a="http://schemas.openxmlformats.org/drawingml/2006/main">
+                  <a:graphicData uri="http://schemas.microsoft.com/office/word/2010/wordprocessingShape">
+                    <wps:wsp>
+                      <wps:cNvSpPr/>
+                      <wps:spPr>
+                        <a:xfrm>
+                          <a:off x="0" y="0"/>
+                          <a:ext cx="256529" cy="99302"/>
+                        </a:xfrm>
+                        <a:prstGeom prst="rect">
+                          <a:avLst/>
+                        </a:prstGeom>
+                        <a:noFill/>
+                        <a:ln w="12700" cap="flat" cmpd="sng" algn="ctr">
+                          <a:solidFill>
+                            <a:srgbClr val="C00000"/>
+                          </a:solidFill>
+                          <a:prstDash val="solid"/>
+                          <a:miter lim="800000"/>
+                        </a:ln>
+                        <a:effectLst/>
+                      </wps:spPr>
+                      <wps:bodyPr rot="0" spcFirstLastPara="0" vertOverflow="overflow" horzOverflow="overflow" vert="horz" wrap="square" lIns="91440" tIns="45720" rIns="91440" bIns="45720" numCol="1" spcCol="0" rtlCol="0" fromWordArt="0" anchor="ctr" anchorCtr="0" forceAA="0" compatLnSpc="1">
+                        <a:prstTxWarp prst="textNoShape">
+                          <a:avLst/>
+                        </a:prstTxWarp>
+                        <a:noAutofit/>
+                      </wps:bodyPr>
+                    </wps:wsp>
+                  </a:graphicData>
+                </a:graphic>
+                <wp14:sizeRelH relativeFrom="margin">
+                  <wp14:pctWidth>0</wp14:pctWidth>
+                </wp14:sizeRelH>
+                <wp14:sizeRelV relativeFrom="margin">
+                  <wp14:pctHeight>0</wp14:pctHeight>
+                </wp14:sizeRelV>
+              </wp:anchor>
+            </w:drawing>
+          </mc:Choice>
+          <mc:Fallback>
+            <w:pict>
+              <v:rect w14:anchorId="7F85F25C" id="Rectangle 6" o:spid="_x0000_s1026" style="position:absolute;margin-left:2.7pt;margin-top:55.6pt;width:20.2pt;height:7.8pt;z-index:251689984;visibility:visible;mso-wrap-style:square;mso-width-percent:0;mso-height-percent:0;mso-wrap-distance-left:9pt;mso-wrap-distance-top:0;mso-wrap-distance-right:9pt;mso-wrap-distance-bottom:0;mso-position-horizontal:absolute;mso-position-horizontal-relative:text;mso-position-vertical:absolute;mso-position-vertical-relative:text;mso-width-percent:0;mso-height-percent:0;mso-width-relative:margin;mso-height-relative:margin;v-text-anchor:middle" o:gfxdata="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" filled="f" strokecolor="#c00000" strokeweight="1pt"/>
+            </w:pict>
+          </mc:Fallback>
+        </mc:AlternateContent>
+      </w:r>
+      <w:r>
+        <w:rPr>
+          <w:b/>
+          <w:bCs/>
+          <w:noProof/>
+        </w:rPr>
+        <w:drawing>
+          <wp:inline distT="0" distB="0" distL="0" distR="0" wp14:anchorId="167128EE" wp14:editId="56141CA7">
+            <wp:extent cx="4776826" cy="2465070"/>
+            <wp:effectExtent l="0" t="0" r="5080" b="0"/>
+            <wp:docPr id="1727566420" name="Picture 10" descr="A screenshot of a computer&#10;&#10;AI-generated content may be incorrect."/>
+            <wp:cNvGraphicFramePr>
+              <a:graphicFrameLocks xmlns:a="http://schemas.openxmlformats.org/drawingml/2006/main" noChangeAspect="1"/>
+            </wp:cNvGraphicFramePr>
+            <a:graphic xmlns:a="http://schemas.openxmlformats.org/drawingml/2006/main">
+              <a:graphicData uri="http://schemas.openxmlformats.org/drawingml/2006/picture">
+                <pic:pic xmlns:pic="http://schemas.openxmlformats.org/drawingml/2006/picture">
+                  <pic:nvPicPr>
+                    <pic:cNvPr id="1727566420" name="Picture 10" descr="A screenshot of a computer&#10;&#10;AI-generated content may be incorrect."/>
+                    <pic:cNvPicPr>
+                      <a:picLocks noChangeAspect="1" noChangeArrowheads="1"/>
+                    </pic:cNvPicPr>
+                  </pic:nvPicPr>
+                  <pic:blipFill>
+                    <a:blip r:embed="rId15" cstate="print">
+                      <a:extLst>
+                        <a:ext uri="{28A0092B-C50C-407E-A947-70E740481C1C}">
+                          <a14:useLocalDpi xmlns:a14="http://schemas.microsoft.com/office/drawing/2010/main" val="0"/>
+                        </a:ext>
+                      </a:extLst>
+                    </a:blip>
+                    <a:srcRect/>
+                    <a:stretch>
+                      <a:fillRect/>
+                    </a:stretch>
+                  </pic:blipFill>
+                  <pic:spPr bwMode="auto">
+                    <a:xfrm>
+                      <a:off x="0" y="0"/>
+                      <a:ext cx="4791424" cy="2472603"/>
+                    </a:xfrm>
+                    <a:prstGeom prst="rect">
+                      <a:avLst/>
+                    </a:prstGeom>
+                    <a:noFill/>
+                    <a:ln>
+                      <a:noFill/>
+                    </a:ln>
+                  </pic:spPr>
+                </pic:pic>
+              </a:graphicData>
+            </a:graphic>
+          </wp:inline>
+        </w:drawing>
+      </w:r>
+    </w:p>
+    <w:p/>
+    <w:p>
+      <w:pPr>
+        <w:pStyle w:val="NormalWeb"/>
+        <w:rPr>
+          <w:rFonts w:asciiTheme="minorHAnsi" w:hAnsiTheme="minorHAnsi"/>
+        </w:rPr>
+      </w:pPr>
+      <w:r>
+        <w:rPr>
+          <w:rFonts w:asciiTheme="minorHAnsi" w:hAnsiTheme="minorHAnsi"/>
+        </w:rPr>
+        <w:t>After the user selects option 2, they must enter their username. If the entered username does not exist, they will be prompted to try again. For example, if the user enters 'mano133', it will be checked and found invalid, requiring them to re-enter the correct username, 'mono133'.</w:t>
+      </w:r>
+      <w:r>
+        <w:rPr>
+          <w:rFonts w:asciiTheme="minorHAnsi" w:hAnsiTheme="minorHAnsi"/>
+        </w:rPr>
+        <w:t xml:space="preserve"> </w:t>
+      </w:r>
+      <w:r>
+        <w:rPr>
+          <w:rFonts w:asciiTheme="minorHAnsi" w:hAnsiTheme="minorHAnsi"/>
+        </w:rPr>
+        <w:t xml:space="preserve">Next, the user must enter their password. If the entered password is incorrect (e.g., '123123123'), they will be asked to try again, with two attempts remaining. If the user fails all three attempts, the account will be locked. However, if they enter the correct password (e.g., '1q2w3e4r5t'), they will gain access to the </w:t>
+      </w:r>
+      <w:proofErr w:type="spellStart"/>
+      <w:r>
+        <w:rPr>
+          <w:rStyle w:val="HTMLCode"/>
+          <w:rFonts w:asciiTheme="minorHAnsi" w:hAnsiTheme="minorHAnsi"/>
+        </w:rPr>
+        <w:t>APP_main_interface</w:t>
+      </w:r>
+      <w:proofErr w:type="spellEnd"/>
+      <w:r>
+        <w:rPr>
+          <w:rStyle w:val="HTMLCode"/>
+          <w:rFonts w:asciiTheme="minorHAnsi" w:hAnsiTheme="minorHAnsi"/>
+        </w:rPr>
+        <w:t>()</w:t>
+      </w:r>
+      <w:r>
+        <w:rPr>
+          <w:rFonts w:asciiTheme="minorHAnsi" w:hAnsiTheme="minorHAnsi"/>
+        </w:rPr>
+        <w:t>.</w:t>
+      </w:r>
+    </w:p>
+    <w:p>
+      <w:pPr>
+        <w:pStyle w:val="NormalWeb"/>
+        <w:rPr>
+          <w:rFonts w:asciiTheme="minorHAnsi" w:hAnsiTheme="minorHAnsi"/>
+        </w:rPr>
+      </w:pPr>
+      <w:r>
+        <w:rPr>
+          <w:rFonts w:asciiTheme="minorHAnsi" w:hAnsiTheme="minorHAnsi"/>
+        </w:rPr>
+        <w:t>The menu functions correctly without any issues</w:t>
+      </w:r>
+    </w:p>
+    <w:p>
+      <w:pPr>
+        <w:rPr>
+          <w:b/>
+          <w:bCs/>
+        </w:rPr>
+      </w:pPr>
+    </w:p>
+    <w:p>
+      <w:pPr>
+        <w:rPr>
+          <w:b/>
+          <w:bCs/>
+        </w:rPr>
+      </w:pPr>
+    </w:p>
+    <w:p>
+      <w:pPr>
+        <w:rPr>
+          <w:b/>
+          <w:bCs/>
+        </w:rPr>
+      </w:pPr>
+    </w:p>
+    <w:p>
+      <w:pPr>
+        <w:rPr>
+          <w:b/>
+          <w:bCs/>
+        </w:rPr>
+      </w:pPr>
+    </w:p>
+    <w:p>
+      <w:pPr>
+        <w:rPr>
+          <w:b/>
+          <w:bCs/>
+        </w:rPr>
+      </w:pPr>
+    </w:p>
+    <w:p>
+      <w:pPr>
+        <w:rPr>
+          <w:b/>
+          <w:bCs/>
+        </w:rPr>
+      </w:pPr>
+    </w:p>
+    <w:p>
+      <w:pPr>
+        <w:rPr>
+          <w:b/>
+          <w:bCs/>
+        </w:rPr>
+      </w:pPr>
+    </w:p>
+    <w:p>
+      <w:pPr>
+        <w:rPr>
+          <w:b/>
+          <w:bCs/>
+        </w:rPr>
+      </w:pPr>
+    </w:p>
+    <w:p>
+      <w:pPr>
+        <w:pStyle w:val="ListParagraph"/>
+        <w:rPr>
+          <w:color w:val="A6A6A6" w:themeColor="background1" w:themeShade="A6"/>
+        </w:rPr>
+      </w:pPr>
+      <w:r>
+        <w:rPr>
+          <w:color w:val="A6A6A6" w:themeColor="background1" w:themeShade="A6"/>
+        </w:rPr>
+        <w:lastRenderedPageBreak/>
+        <w:t>ID:3075614 , Module: FC72</w:t>
+      </w:r>
+      <w:r>
+        <w:rPr>
+          <w:color w:val="A6A6A6" w:themeColor="background1" w:themeShade="A6"/>
+        </w:rPr>
+        <w:t>3</w:t>
+      </w:r>
+      <w:r>
+        <w:rPr>
+          <w:color w:val="A6A6A6" w:themeColor="background1" w:themeShade="A6"/>
+        </w:rPr>
+        <w:t xml:space="preserve"> , </w:t>
+      </w:r>
+      <w:r>
+        <w:rPr>
+          <w:color w:val="A6A6A6" w:themeColor="background1" w:themeShade="A6"/>
+        </w:rPr>
+        <w:t>Sophie Norman</w:t>
+      </w:r>
+      <w:r>
+        <w:rPr>
+          <w:color w:val="A6A6A6" w:themeColor="background1" w:themeShade="A6"/>
+        </w:rPr>
+        <w:t>.</w:t>
+      </w:r>
+    </w:p>
+    <w:p>
+      <w:pPr>
+        <w:rPr>
+          <w:b/>
+          <w:bCs/>
+        </w:rPr>
+      </w:pPr>
+    </w:p>
+    <w:p>
+      <w:pPr>
+        <w:pStyle w:val="ListParagraph"/>
+        <w:numPr>
+          <w:ilvl w:val="0"/>
+          <w:numId w:val="9"/>
+        </w:numPr>
+        <w:rPr>
+          <w:b/>
+          <w:bCs/>
+        </w:rPr>
+      </w:pPr>
+      <w:proofErr w:type="spellStart"/>
+      <w:r>
+        <w:rPr>
+          <w:b/>
+          <w:bCs/>
+        </w:rPr>
+        <w:t>App_main_interface</w:t>
+      </w:r>
+      <w:proofErr w:type="spellEnd"/>
+      <w:r>
+        <w:rPr>
+          <w:b/>
+          <w:bCs/>
+        </w:rPr>
+        <w:t>()</w:t>
+      </w:r>
+    </w:p>
+    <w:p>
+      <w:pPr>
+        <w:tabs>
+          <w:tab w:val="left" w:pos="902"/>
+        </w:tabs>
+      </w:pPr>
+      <w:r>
+        <w:rPr>
+          <w:b/>
+          <w:bCs/>
+          <w:noProof/>
+        </w:rPr>
+        <w:drawing>
+          <wp:anchor distT="0" distB="0" distL="114300" distR="114300" simplePos="0" relativeHeight="251699200" behindDoc="0" locked="0" layoutInCell="1" allowOverlap="1" wp14:anchorId="1E833137" wp14:editId="58D6AF65">
+            <wp:simplePos x="914400" y="2719346"/>
+            <wp:positionH relativeFrom="column">
+              <wp:align>left</wp:align>
+            </wp:positionH>
+            <wp:positionV relativeFrom="paragraph">
+              <wp:align>top</wp:align>
+            </wp:positionV>
+            <wp:extent cx="2299742" cy="2321781"/>
+            <wp:effectExtent l="0" t="0" r="5715" b="2540"/>
+            <wp:wrapSquare wrapText="bothSides"/>
+            <wp:docPr id="152786729" name="Picture 11" descr="A screenshot of a computer program&#10;&#10;AI-generated content may be incorrect."/>
+            <wp:cNvGraphicFramePr>
+              <a:graphicFrameLocks xmlns:a="http://schemas.openxmlformats.org/drawingml/2006/main" noChangeAspect="1"/>
+            </wp:cNvGraphicFramePr>
+            <a:graphic xmlns:a="http://schemas.openxmlformats.org/drawingml/2006/main">
+              <a:graphicData uri="http://schemas.openxmlformats.org/drawingml/2006/picture">
+                <pic:pic xmlns:pic="http://schemas.openxmlformats.org/drawingml/2006/picture">
+                  <pic:nvPicPr>
+                    <pic:cNvPr id="152786729" name="Picture 11" descr="A screenshot of a computer program&#10;&#10;AI-generated content may be incorrect."/>
+                    <pic:cNvPicPr>
+                      <a:picLocks noChangeAspect="1" noChangeArrowheads="1"/>
+                    </pic:cNvPicPr>
+                  </pic:nvPicPr>
+                  <pic:blipFill>
+                    <a:blip r:embed="rId16">
+                      <a:extLst>
+                        <a:ext uri="{28A0092B-C50C-407E-A947-70E740481C1C}">
+                          <a14:useLocalDpi xmlns:a14="http://schemas.microsoft.com/office/drawing/2010/main" val="0"/>
+                        </a:ext>
+                      </a:extLst>
+                    </a:blip>
+                    <a:srcRect/>
+                    <a:stretch>
+                      <a:fillRect/>
+                    </a:stretch>
+                  </pic:blipFill>
+                  <pic:spPr bwMode="auto">
+                    <a:xfrm>
+                      <a:off x="0" y="0"/>
+                      <a:ext cx="2299742" cy="2321781"/>
+                    </a:xfrm>
+                    <a:prstGeom prst="rect">
+                      <a:avLst/>
+                    </a:prstGeom>
+                    <a:noFill/>
+                    <a:ln>
+                      <a:noFill/>
+                    </a:ln>
+                  </pic:spPr>
+                </pic:pic>
+              </a:graphicData>
+            </a:graphic>
+          </wp:anchor>
+        </w:drawing>
+      </w:r>
+      <w:r>
+        <w:tab/>
+      </w:r>
+      <w:r>
+        <w:t>the main interface is designed to display the primary features of the app. it will continuously reappear whenever the user enters anything other than the designated service numbers. the menu functions correctly without any issues</w:t>
+      </w:r>
+      <w:r>
+        <w:t>.</w:t>
+      </w:r>
+      <w:r>
+        <w:br w:type="textWrapping" w:clear="all"/>
+      </w:r>
+    </w:p>
+    <w:p>
+      <w:pPr>
+        <w:tabs>
+          <w:tab w:val="left" w:pos="789"/>
+        </w:tabs>
+      </w:pPr>
+      <w:r>
+        <w:rPr>
+          <w:noProof/>
+        </w:rPr>
+        <w:drawing>
+          <wp:anchor distT="0" distB="0" distL="114300" distR="114300" simplePos="0" relativeHeight="251700224" behindDoc="0" locked="0" layoutInCell="1" allowOverlap="1" wp14:anchorId="73E6802E" wp14:editId="742F817C">
+            <wp:simplePos x="914400" y="5359179"/>
+            <wp:positionH relativeFrom="column">
+              <wp:align>left</wp:align>
+            </wp:positionH>
+            <wp:positionV relativeFrom="paragraph">
+              <wp:align>top</wp:align>
+            </wp:positionV>
+            <wp:extent cx="2266122" cy="1375066"/>
+            <wp:effectExtent l="0" t="0" r="1270" b="0"/>
+            <wp:wrapSquare wrapText="bothSides"/>
+            <wp:docPr id="667255469" name="Picture 12" descr="A screen shot of a computer&#10;&#10;AI-generated content may be incorrect."/>
+            <wp:cNvGraphicFramePr>
+              <a:graphicFrameLocks xmlns:a="http://schemas.openxmlformats.org/drawingml/2006/main" noChangeAspect="1"/>
+            </wp:cNvGraphicFramePr>
+            <a:graphic xmlns:a="http://schemas.openxmlformats.org/drawingml/2006/main">
+              <a:graphicData uri="http://schemas.openxmlformats.org/drawingml/2006/picture">
+                <pic:pic xmlns:pic="http://schemas.openxmlformats.org/drawingml/2006/picture">
+                  <pic:nvPicPr>
+                    <pic:cNvPr id="667255469" name="Picture 12" descr="A screen shot of a computer&#10;&#10;AI-generated content may be incorrect."/>
+                    <pic:cNvPicPr>
+                      <a:picLocks noChangeAspect="1" noChangeArrowheads="1"/>
+                    </pic:cNvPicPr>
+                  </pic:nvPicPr>
+                  <pic:blipFill>
+                    <a:blip r:embed="rId17">
+                      <a:extLst>
+                        <a:ext uri="{28A0092B-C50C-407E-A947-70E740481C1C}">
+                          <a14:useLocalDpi xmlns:a14="http://schemas.microsoft.com/office/drawing/2010/main" val="0"/>
+                        </a:ext>
+                      </a:extLst>
+                    </a:blip>
+                    <a:srcRect/>
+                    <a:stretch>
+                      <a:fillRect/>
+                    </a:stretch>
+                  </pic:blipFill>
+                  <pic:spPr bwMode="auto">
+                    <a:xfrm>
+                      <a:off x="0" y="0"/>
+                      <a:ext cx="2266122" cy="1375066"/>
+                    </a:xfrm>
+                    <a:prstGeom prst="rect">
+                      <a:avLst/>
+                    </a:prstGeom>
+                    <a:noFill/>
+                    <a:ln>
+                      <a:noFill/>
+                    </a:ln>
+                  </pic:spPr>
+                </pic:pic>
+              </a:graphicData>
+            </a:graphic>
+          </wp:anchor>
+        </w:drawing>
+      </w:r>
+      <w:r>
+        <w:tab/>
+      </w:r>
+      <w:r>
+        <w:t>when the user selects the withdrawal option, they will be prompted to enter a valid amount. this prompt will keep appearing until the user provides a correct value. any invalid input will be rejected. the functionality works as expected</w:t>
+      </w:r>
+      <w:r>
+        <w:t>.</w:t>
+      </w:r>
+    </w:p>
+    <w:p/>
+    <w:p/>
+    <w:p/>
+    <w:p/>
+    <w:p/>
+    <w:p/>
+    <w:p/>
+    <w:p/>
+    <w:p/>
+    <w:p/>
+    <w:p/>
+    <w:p/>
+    <w:p/>
+    <w:p>
+      <w:pPr>
+        <w:pStyle w:val="ListParagraph"/>
+        <w:rPr>
+          <w:color w:val="A6A6A6" w:themeColor="background1" w:themeShade="A6"/>
+        </w:rPr>
+      </w:pPr>
+      <w:r>
+        <w:rPr>
+          <w:color w:val="A6A6A6" w:themeColor="background1" w:themeShade="A6"/>
+        </w:rPr>
+        <w:lastRenderedPageBreak/>
+        <w:t>ID:3075614 , Module: FC72</w:t>
+      </w:r>
+      <w:r>
+        <w:rPr>
+          <w:color w:val="A6A6A6" w:themeColor="background1" w:themeShade="A6"/>
+        </w:rPr>
+        <w:t>3</w:t>
+      </w:r>
+      <w:r>
+        <w:rPr>
+          <w:color w:val="A6A6A6" w:themeColor="background1" w:themeShade="A6"/>
+        </w:rPr>
+        <w:t xml:space="preserve"> , </w:t>
+      </w:r>
+      <w:r>
+        <w:rPr>
+          <w:color w:val="A6A6A6" w:themeColor="background1" w:themeShade="A6"/>
+        </w:rPr>
+        <w:t>Sophie Norman</w:t>
+      </w:r>
+      <w:r>
+        <w:rPr>
+          <w:color w:val="A6A6A6" w:themeColor="background1" w:themeShade="A6"/>
+        </w:rPr>
+        <w:t>.</w:t>
+      </w:r>
+    </w:p>
+    <w:p>
+      <w:r>
+        <w:br w:type="textWrapping" w:clear="all"/>
+      </w:r>
+      <w:r>
+        <w:rPr>
+          <w:noProof/>
+        </w:rPr>
+        <w:drawing>
+          <wp:inline distT="0" distB="0" distL="0" distR="0" wp14:anchorId="3AC73D0A" wp14:editId="745B2820">
+            <wp:extent cx="3188473" cy="2037001"/>
+            <wp:effectExtent l="0" t="0" r="0" b="1905"/>
+            <wp:docPr id="264398246" name="Picture 13" descr="A screenshot of a computer program&#10;&#10;AI-generated content may be incorrect."/>
+            <wp:cNvGraphicFramePr>
+              <a:graphicFrameLocks xmlns:a="http://schemas.openxmlformats.org/drawingml/2006/main" noChangeAspect="1"/>
+            </wp:cNvGraphicFramePr>
+            <a:graphic xmlns:a="http://schemas.openxmlformats.org/drawingml/2006/main">
+              <a:graphicData uri="http://schemas.openxmlformats.org/drawingml/2006/picture">
+                <pic:pic xmlns:pic="http://schemas.openxmlformats.org/drawingml/2006/picture">
+                  <pic:nvPicPr>
+                    <pic:cNvPr id="264398246" name="Picture 13" descr="A screenshot of a computer program&#10;&#10;AI-generated content may be incorrect."/>
+                    <pic:cNvPicPr>
+                      <a:picLocks noChangeAspect="1" noChangeArrowheads="1"/>
+                    </pic:cNvPicPr>
+                  </pic:nvPicPr>
+                  <pic:blipFill>
+                    <a:blip r:embed="rId18">
+                      <a:extLst>
+                        <a:ext uri="{28A0092B-C50C-407E-A947-70E740481C1C}">
+                          <a14:useLocalDpi xmlns:a14="http://schemas.microsoft.com/office/drawing/2010/main" val="0"/>
+                        </a:ext>
+                      </a:extLst>
+                    </a:blip>
+                    <a:srcRect/>
+                    <a:stretch>
+                      <a:fillRect/>
+                    </a:stretch>
+                  </pic:blipFill>
+                  <pic:spPr bwMode="auto">
+                    <a:xfrm>
+                      <a:off x="0" y="0"/>
+                      <a:ext cx="3198141" cy="2043178"/>
+                    </a:xfrm>
+                    <a:prstGeom prst="rect">
+                      <a:avLst/>
+                    </a:prstGeom>
+                    <a:noFill/>
+                    <a:ln>
+                      <a:noFill/>
+                    </a:ln>
+                  </pic:spPr>
+                </pic:pic>
+              </a:graphicData>
+            </a:graphic>
+          </wp:inline>
+        </w:drawing>
+      </w:r>
+    </w:p>
+    <w:p>
+      <w:r>
+        <w:t>Deposit menu working fine and it does not accept anything but positive numbers</w:t>
+      </w:r>
+      <w:r>
+        <w:t>.</w:t>
+      </w:r>
+    </w:p>
+    <w:p/>
+    <w:p>
+      <w:r>
+        <w:rPr>
+          <w:noProof/>
+        </w:rPr>
+        <w:drawing>
+          <wp:anchor distT="0" distB="0" distL="114300" distR="114300" simplePos="0" relativeHeight="251701248" behindDoc="0" locked="0" layoutInCell="1" allowOverlap="1" wp14:anchorId="54EFA5A0" wp14:editId="112B8F04">
+            <wp:simplePos x="914400" y="1232452"/>
+            <wp:positionH relativeFrom="column">
+              <wp:align>left</wp:align>
+            </wp:positionH>
+            <wp:positionV relativeFrom="paragraph">
+              <wp:align>top</wp:align>
+            </wp:positionV>
+            <wp:extent cx="3108960" cy="997584"/>
+            <wp:effectExtent l="0" t="0" r="0" b="0"/>
+            <wp:wrapSquare wrapText="bothSides"/>
+            <wp:docPr id="853440852" name="Picture 14"/>
+            <wp:cNvGraphicFramePr>
+              <a:graphicFrameLocks xmlns:a="http://schemas.openxmlformats.org/drawingml/2006/main" noChangeAspect="1"/>
+            </wp:cNvGraphicFramePr>
+            <a:graphic xmlns:a="http://schemas.openxmlformats.org/drawingml/2006/main">
+              <a:graphicData uri="http://schemas.openxmlformats.org/drawingml/2006/picture">
+                <pic:pic xmlns:pic="http://schemas.openxmlformats.org/drawingml/2006/picture">
+                  <pic:nvPicPr>
+                    <pic:cNvPr id="0" name="Picture 12"/>
+                    <pic:cNvPicPr>
+                      <a:picLocks noChangeAspect="1" noChangeArrowheads="1"/>
+                    </pic:cNvPicPr>
+                  </pic:nvPicPr>
+                  <pic:blipFill>
+                    <a:blip r:embed="rId19">
+                      <a:extLst>
+                        <a:ext uri="{28A0092B-C50C-407E-A947-70E740481C1C}">
+                          <a14:useLocalDpi xmlns:a14="http://schemas.microsoft.com/office/drawing/2010/main" val="0"/>
+                        </a:ext>
+                      </a:extLst>
+                    </a:blip>
+                    <a:srcRect/>
+                    <a:stretch>
+                      <a:fillRect/>
+                    </a:stretch>
+                  </pic:blipFill>
+                  <pic:spPr bwMode="auto">
+                    <a:xfrm>
+                      <a:off x="0" y="0"/>
+                      <a:ext cx="3108960" cy="997584"/>
+                    </a:xfrm>
+                    <a:prstGeom prst="rect">
+                      <a:avLst/>
+                    </a:prstGeom>
+                    <a:noFill/>
+                    <a:ln>
+                      <a:noFill/>
+                    </a:ln>
+                  </pic:spPr>
+                </pic:pic>
+              </a:graphicData>
+            </a:graphic>
+          </wp:anchor>
+        </w:drawing>
+      </w:r>
+      <w:r>
+        <w:t xml:space="preserve">This is what appear when you Display the balance the menu in terms if display balance working </w:t>
+      </w:r>
+      <w:r>
+        <w:t>correctly</w:t>
+      </w:r>
+      <w:r>
+        <w:t>.</w:t>
+      </w:r>
+    </w:p>
+    <w:p/>
+    <w:p/>
+    <w:p>
+      <w:r>
+        <w:rPr>
+          <w:noProof/>
+        </w:rPr>
+        <w:drawing>
+          <wp:inline distT="0" distB="0" distL="0" distR="0" wp14:anchorId="41A70C64" wp14:editId="378EC0EB">
+            <wp:extent cx="5725160" cy="1781175"/>
+            <wp:effectExtent l="0" t="0" r="8890" b="9525"/>
+            <wp:docPr id="1324412281" name="Picture 15"/>
+            <wp:cNvGraphicFramePr>
+              <a:graphicFrameLocks xmlns:a="http://schemas.openxmlformats.org/drawingml/2006/main" noChangeAspect="1"/>
+            </wp:cNvGraphicFramePr>
+            <a:graphic xmlns:a="http://schemas.openxmlformats.org/drawingml/2006/main">
+              <a:graphicData uri="http://schemas.openxmlformats.org/drawingml/2006/picture">
+                <pic:pic xmlns:pic="http://schemas.openxmlformats.org/drawingml/2006/picture">
+                  <pic:nvPicPr>
+                    <pic:cNvPr id="0" name="Picture 13"/>
+                    <pic:cNvPicPr>
+                      <a:picLocks noChangeAspect="1" noChangeArrowheads="1"/>
+                    </pic:cNvPicPr>
+                  </pic:nvPicPr>
+                  <pic:blipFill>
+                    <a:blip r:embed="rId20">
+                      <a:extLst>
+                        <a:ext uri="{28A0092B-C50C-407E-A947-70E740481C1C}">
+                          <a14:useLocalDpi xmlns:a14="http://schemas.microsoft.com/office/drawing/2010/main" val="0"/>
+                        </a:ext>
+                      </a:extLst>
+                    </a:blip>
+                    <a:srcRect/>
+                    <a:stretch>
+                      <a:fillRect/>
+                    </a:stretch>
+                  </pic:blipFill>
+                  <pic:spPr bwMode="auto">
+                    <a:xfrm>
+                      <a:off x="0" y="0"/>
+                      <a:ext cx="5725160" cy="1781175"/>
+                    </a:xfrm>
+                    <a:prstGeom prst="rect">
+                      <a:avLst/>
+                    </a:prstGeom>
+                    <a:noFill/>
+                    <a:ln>
+                      <a:noFill/>
+                    </a:ln>
+                  </pic:spPr>
+                </pic:pic>
+              </a:graphicData>
+            </a:graphic>
+          </wp:inline>
+        </w:drawing>
+      </w:r>
+    </w:p>
+    <w:p>
+      <w:r>
+        <w:t xml:space="preserve">when the user selects the transfer option, they must enter the recipient's username. if the entered username does not exist, they will be prompted to try again until a valid username is provided. after entering a correct username, the user specifies the amount to transfer. if the entered amount (e.g., 120 </w:t>
+      </w:r>
+      <w:r>
+        <w:t>GBP</w:t>
+      </w:r>
+      <w:r>
+        <w:t>) exceeds the available balance, a message appears informing them of insufficient funds. the menu functions correctly without any issues</w:t>
+      </w:r>
+      <w:r>
+        <w:t>.</w:t>
+      </w:r>
+      <w:r>
+        <w:br w:type="textWrapping" w:clear="all"/>
+      </w:r>
+    </w:p>
+    <w:p/>
+    <w:p/>
+    <w:p>
+      <w:pPr>
+        <w:pStyle w:val="ListParagraph"/>
+        <w:rPr>
+          <w:color w:val="A6A6A6" w:themeColor="background1" w:themeShade="A6"/>
+        </w:rPr>
+      </w:pPr>
+      <w:r>
+        <w:rPr>
+          <w:color w:val="A6A6A6" w:themeColor="background1" w:themeShade="A6"/>
+        </w:rPr>
+        <w:lastRenderedPageBreak/>
+        <w:t>ID:3075614 , Module: FC72</w:t>
+      </w:r>
+      <w:r>
+        <w:rPr>
+          <w:color w:val="A6A6A6" w:themeColor="background1" w:themeShade="A6"/>
+        </w:rPr>
+        <w:t>3</w:t>
+      </w:r>
+      <w:r>
+        <w:rPr>
+          <w:color w:val="A6A6A6" w:themeColor="background1" w:themeShade="A6"/>
+        </w:rPr>
+        <w:t xml:space="preserve"> , </w:t>
+      </w:r>
+      <w:r>
+        <w:rPr>
+          <w:color w:val="A6A6A6" w:themeColor="background1" w:themeShade="A6"/>
+        </w:rPr>
+        <w:t>Sophie Norman</w:t>
+      </w:r>
+      <w:r>
+        <w:rPr>
+          <w:color w:val="A6A6A6" w:themeColor="background1" w:themeShade="A6"/>
+        </w:rPr>
+        <w:t>.</w:t>
+      </w:r>
+    </w:p>
+    <w:p/>
+    <w:p/>
+    <w:p>
+      <w:pPr>
+        <w:pStyle w:val="ListParagraph"/>
+      </w:pPr>
+    </w:p>
+    <w:p>
+      <w:pPr>
+        <w:pStyle w:val="ListParagraph"/>
+        <w:numPr>
+          <w:ilvl w:val="0"/>
+          <w:numId w:val="9"/>
+        </w:numPr>
+        <w:rPr>
+          <w:color w:val="000000" w:themeColor="text1"/>
+        </w:rPr>
+      </w:pPr>
+      <w:bookmarkStart w:id="10" w:name="_Hlk190017899"/>
+      <w:r>
+        <w:rPr>
+          <w:b/>
+          <w:bCs/>
+          <w:color w:val="000000" w:themeColor="text1"/>
+        </w:rPr>
+        <w:t>Conclusion of testing</w:t>
+      </w:r>
+    </w:p>
+    <w:bookmarkEnd w:id="10"/>
+    <w:p>
+      <w:pPr>
+        <w:pStyle w:val="ListParagraph"/>
+        <w:rPr>
+          <w:rFonts w:asciiTheme="minorHAnsi" w:hAnsiTheme="minorHAnsi"/>
+          <w:color w:val="000000" w:themeColor="text1"/>
+        </w:rPr>
+      </w:pPr>
+      <w:r>
+        <w:rPr>
+          <w:rFonts w:asciiTheme="minorHAnsi" w:hAnsiTheme="minorHAnsi"/>
+        </w:rPr>
+        <w:t xml:space="preserve">I got 14 </w:t>
+      </w:r>
+      <w:r>
+        <w:rPr>
+          <w:rFonts w:asciiTheme="minorHAnsi" w:hAnsiTheme="minorHAnsi"/>
+        </w:rPr>
+        <w:t>tests</w:t>
+      </w:r>
+      <w:r>
+        <w:rPr>
+          <w:rFonts w:asciiTheme="minorHAnsi" w:hAnsiTheme="minorHAnsi"/>
+        </w:rPr>
+        <w:t xml:space="preserve"> with 53 cases tested. Most of the tests did go very smoothly, with out any issues. The function required user inputs have been changed to simulate user inputs and to test it in many situations. One function required </w:t>
+      </w:r>
+      <w:proofErr w:type="spellStart"/>
+      <w:proofErr w:type="gramStart"/>
+      <w:r>
+        <w:rPr>
+          <w:rFonts w:asciiTheme="minorHAnsi" w:hAnsiTheme="minorHAnsi"/>
+        </w:rPr>
+        <w:t>a</w:t>
+      </w:r>
+      <w:proofErr w:type="spellEnd"/>
+      <w:proofErr w:type="gramEnd"/>
+      <w:r>
+        <w:rPr>
+          <w:rFonts w:asciiTheme="minorHAnsi" w:hAnsiTheme="minorHAnsi"/>
+        </w:rPr>
+        <w:t xml:space="preserve"> additional function to</w:t>
+      </w:r>
+      <w:r>
+        <w:rPr>
+          <w:rFonts w:asciiTheme="minorHAnsi" w:hAnsiTheme="minorHAnsi"/>
+        </w:rPr>
+        <w:t xml:space="preserve"> help</w:t>
+      </w:r>
+      <w:r>
+        <w:rPr>
+          <w:rFonts w:asciiTheme="minorHAnsi" w:hAnsiTheme="minorHAnsi"/>
+        </w:rPr>
+        <w:t xml:space="preserve"> test</w:t>
+      </w:r>
+      <w:r>
+        <w:rPr>
+          <w:rFonts w:asciiTheme="minorHAnsi" w:hAnsiTheme="minorHAnsi"/>
+        </w:rPr>
+        <w:t>ing it</w:t>
+      </w:r>
+      <w:r>
+        <w:rPr>
+          <w:rFonts w:asciiTheme="minorHAnsi" w:hAnsiTheme="minorHAnsi"/>
+        </w:rPr>
+        <w:t xml:space="preserve">. I could not test the menus like main app interface and initial menu, because of their complexity when it comes to user inputs possibilities. </w:t>
+      </w:r>
+      <w:proofErr w:type="gramStart"/>
+      <w:r>
+        <w:rPr>
+          <w:rFonts w:asciiTheme="minorHAnsi" w:hAnsiTheme="minorHAnsi"/>
+        </w:rPr>
+        <w:t>So</w:t>
+      </w:r>
+      <w:proofErr w:type="gramEnd"/>
+      <w:r>
+        <w:rPr>
+          <w:rFonts w:asciiTheme="minorHAnsi" w:hAnsiTheme="minorHAnsi"/>
+        </w:rPr>
+        <w:t xml:space="preserve"> I did test them by entering value</w:t>
+      </w:r>
+      <w:r>
+        <w:rPr>
+          <w:rFonts w:asciiTheme="minorHAnsi" w:hAnsiTheme="minorHAnsi"/>
+        </w:rPr>
+        <w:t xml:space="preserve">s and test the menu’s options. </w:t>
+      </w:r>
+    </w:p>
+    <w:p>
+      <w:pPr>
+        <w:pStyle w:val="ListParagraph"/>
+      </w:pPr>
+    </w:p>
+    <w:p>
+      <w:pPr>
+        <w:pStyle w:val="ListParagraph"/>
+      </w:pPr>
+    </w:p>
+    <w:p>
+      <w:pPr>
+        <w:pStyle w:val="ListParagraph"/>
+      </w:pPr>
+    </w:p>
+    <w:p>
+      <w:pPr>
+        <w:pStyle w:val="ListParagraph"/>
+        <w:rPr>
+          <w:color w:val="000000" w:themeColor="text1"/>
+        </w:rPr>
+      </w:pPr>
+    </w:p>
     <w:sectPr>
-      <w:headerReference w:type="default" r:id="rId9"/>
+      <w:headerReference w:type="default" r:id="rId21"/>
       <w:pgSz w:w="11906" w:h="16838"/>
       <w:pgMar w:top="1440" w:right="1440" w:bottom="1440" w:left="1440" w:header="720" w:footer="720" w:gutter="0"/>
       <w:cols w:space="720"/>
@@ -2717,6 +5786,119 @@
     </w:lvl>
   </w:abstractNum>
   <w:abstractNum w:abstractNumId="7" w15:restartNumberingAfterBreak="0">
+    <w:nsid w:val="68D159DE"/>
+    <w:multiLevelType w:val="hybridMultilevel"/>
+    <w:tmpl w:val="27D8DEC0"/>
+    <w:lvl w:ilvl="0" w:tplc="08090001">
+      <w:start w:val="1"/>
+      <w:numFmt w:val="bullet"/>
+      <w:lvlText w:val=""/>
+      <w:lvlJc w:val="left"/>
+      <w:pPr>
+        <w:ind w:left="720" w:hanging="360"/>
+      </w:pPr>
+      <w:rPr>
+        <w:rFonts w:ascii="Symbol" w:hAnsi="Symbol" w:hint="default"/>
+      </w:rPr>
+    </w:lvl>
+    <w:lvl w:ilvl="1" w:tplc="08090003" w:tentative="1">
+      <w:start w:val="1"/>
+      <w:numFmt w:val="bullet"/>
+      <w:lvlText w:val="o"/>
+      <w:lvlJc w:val="left"/>
+      <w:pPr>
+        <w:ind w:left="1440" w:hanging="360"/>
+      </w:pPr>
+      <w:rPr>
+        <w:rFonts w:ascii="Courier New" w:hAnsi="Courier New" w:cs="Courier New" w:hint="default"/>
+      </w:rPr>
+    </w:lvl>
+    <w:lvl w:ilvl="2" w:tplc="08090005" w:tentative="1">
+      <w:start w:val="1"/>
+      <w:numFmt w:val="bullet"/>
+      <w:lvlText w:val=""/>
+      <w:lvlJc w:val="left"/>
+      <w:pPr>
+        <w:ind w:left="2160" w:hanging="360"/>
+      </w:pPr>
+      <w:rPr>
+        <w:rFonts w:ascii="Wingdings" w:hAnsi="Wingdings" w:hint="default"/>
+      </w:rPr>
+    </w:lvl>
+    <w:lvl w:ilvl="3" w:tplc="08090001" w:tentative="1">
+      <w:start w:val="1"/>
+      <w:numFmt w:val="bullet"/>
+      <w:lvlText w:val=""/>
+      <w:lvlJc w:val="left"/>
+      <w:pPr>
+        <w:ind w:left="2880" w:hanging="360"/>
+      </w:pPr>
+      <w:rPr>
+        <w:rFonts w:ascii="Symbol" w:hAnsi="Symbol" w:hint="default"/>
+      </w:rPr>
+    </w:lvl>
+    <w:lvl w:ilvl="4" w:tplc="08090003" w:tentative="1">
+      <w:start w:val="1"/>
+      <w:numFmt w:val="bullet"/>
+      <w:lvlText w:val="o"/>
+      <w:lvlJc w:val="left"/>
+      <w:pPr>
+        <w:ind w:left="3600" w:hanging="360"/>
+      </w:pPr>
+      <w:rPr>
+        <w:rFonts w:ascii="Courier New" w:hAnsi="Courier New" w:cs="Courier New" w:hint="default"/>
+      </w:rPr>
+    </w:lvl>
+    <w:lvl w:ilvl="5" w:tplc="08090005" w:tentative="1">
+      <w:start w:val="1"/>
+      <w:numFmt w:val="bullet"/>
+      <w:lvlText w:val=""/>
+      <w:lvlJc w:val="left"/>
+      <w:pPr>
+        <w:ind w:left="4320" w:hanging="360"/>
+      </w:pPr>
+      <w:rPr>
+        <w:rFonts w:ascii="Wingdings" w:hAnsi="Wingdings" w:hint="default"/>
+      </w:rPr>
+    </w:lvl>
+    <w:lvl w:ilvl="6" w:tplc="08090001" w:tentative="1">
+      <w:start w:val="1"/>
+      <w:numFmt w:val="bullet"/>
+      <w:lvlText w:val=""/>
+      <w:lvlJc w:val="left"/>
+      <w:pPr>
+        <w:ind w:left="5040" w:hanging="360"/>
+      </w:pPr>
+      <w:rPr>
+        <w:rFonts w:ascii="Symbol" w:hAnsi="Symbol" w:hint="default"/>
+      </w:rPr>
+    </w:lvl>
+    <w:lvl w:ilvl="7" w:tplc="08090003" w:tentative="1">
+      <w:start w:val="1"/>
+      <w:numFmt w:val="bullet"/>
+      <w:lvlText w:val="o"/>
+      <w:lvlJc w:val="left"/>
+      <w:pPr>
+        <w:ind w:left="5760" w:hanging="360"/>
+      </w:pPr>
+      <w:rPr>
+        <w:rFonts w:ascii="Courier New" w:hAnsi="Courier New" w:cs="Courier New" w:hint="default"/>
+      </w:rPr>
+    </w:lvl>
+    <w:lvl w:ilvl="8" w:tplc="08090005" w:tentative="1">
+      <w:start w:val="1"/>
+      <w:numFmt w:val="bullet"/>
+      <w:lvlText w:val=""/>
+      <w:lvlJc w:val="left"/>
+      <w:pPr>
+        <w:ind w:left="6480" w:hanging="360"/>
+      </w:pPr>
+      <w:rPr>
+        <w:rFonts w:ascii="Wingdings" w:hAnsi="Wingdings" w:hint="default"/>
+      </w:rPr>
+    </w:lvl>
+  </w:abstractNum>
+  <w:abstractNum w:abstractNumId="8" w15:restartNumberingAfterBreak="0">
     <w:nsid w:val="7C824839"/>
     <w:multiLevelType w:val="hybridMultilevel"/>
     <w:tmpl w:val="08E6B626"/>
@@ -2830,7 +6012,7 @@
     </w:lvl>
   </w:abstractNum>
   <w:num w:numId="1" w16cid:durableId="1745879823">
-    <w:abstractNumId w:val="7"/>
+    <w:abstractNumId w:val="8"/>
   </w:num>
   <w:num w:numId="2" w16cid:durableId="203100587">
     <w:abstractNumId w:val="0"/>
@@ -2852,6 +6034,9 @@
   </w:num>
   <w:num w:numId="8" w16cid:durableId="1022785899">
     <w:abstractNumId w:val="6"/>
+  </w:num>
+  <w:num w:numId="9" w16cid:durableId="1831404099">
+    <w:abstractNumId w:val="7"/>
   </w:num>
 </w:numbering>
 </file>
@@ -3717,6 +6902,71 @@
     <w:uiPriority w:val="99"/>
     <w:rsid w:val="007D2D14"/>
   </w:style>
+  <w:style w:type="character" w:styleId="Hyperlink">
+    <w:name w:val="Hyperlink"/>
+    <w:basedOn w:val="DefaultParagraphFont"/>
+    <w:uiPriority w:val="99"/>
+    <w:unhideWhenUsed/>
+    <w:rsid w:val="001B4039"/>
+    <w:rPr>
+      <w:color w:val="467886" w:themeColor="hyperlink"/>
+      <w:u w:val="single"/>
+    </w:rPr>
+  </w:style>
+  <w:style w:type="character" w:styleId="UnresolvedMention">
+    <w:name w:val="Unresolved Mention"/>
+    <w:basedOn w:val="DefaultParagraphFont"/>
+    <w:uiPriority w:val="99"/>
+    <w:semiHidden/>
+    <w:unhideWhenUsed/>
+    <w:rsid w:val="001B4039"/>
+    <w:rPr>
+      <w:color w:val="605E5C"/>
+      <w:shd w:val="clear" w:color="auto" w:fill="E1DFDD"/>
+    </w:rPr>
+  </w:style>
+  <w:style w:type="character" w:styleId="FollowedHyperlink">
+    <w:name w:val="FollowedHyperlink"/>
+    <w:basedOn w:val="DefaultParagraphFont"/>
+    <w:uiPriority w:val="99"/>
+    <w:semiHidden/>
+    <w:unhideWhenUsed/>
+    <w:rsid w:val="001B4039"/>
+    <w:rPr>
+      <w:color w:val="96607D" w:themeColor="followedHyperlink"/>
+      <w:u w:val="single"/>
+    </w:rPr>
+  </w:style>
+  <w:style w:type="paragraph" w:styleId="NormalWeb">
+    <w:name w:val="Normal (Web)"/>
+    <w:basedOn w:val="Normal"/>
+    <w:uiPriority w:val="99"/>
+    <w:unhideWhenUsed/>
+    <w:rsid w:val="001B4039"/>
+    <w:pPr>
+      <w:suppressAutoHyphens w:val="0"/>
+      <w:autoSpaceDN/>
+      <w:spacing w:before="100" w:beforeAutospacing="1" w:after="100" w:afterAutospacing="1" w:line="240" w:lineRule="auto"/>
+    </w:pPr>
+    <w:rPr>
+      <w:rFonts w:ascii="Times New Roman" w:eastAsia="Times New Roman" w:hAnsi="Times New Roman" w:cs="Times New Roman"/>
+      <w:kern w:val="0"/>
+      <w:lang w:eastAsia="en-GB"/>
+    </w:rPr>
+  </w:style>
+  <w:style w:type="character" w:styleId="HTMLCode">
+    <w:name w:val="HTML Code"/>
+    <w:basedOn w:val="DefaultParagraphFont"/>
+    <w:uiPriority w:val="99"/>
+    <w:semiHidden/>
+    <w:unhideWhenUsed/>
+    <w:rsid w:val="00F412C9"/>
+    <w:rPr>
+      <w:rFonts w:ascii="Courier New" w:eastAsia="Times New Roman" w:hAnsi="Courier New" w:cs="Courier New"/>
+      <w:sz w:val="20"/>
+      <w:szCs w:val="20"/>
+    </w:rPr>
+  </w:style>
 </w:styles>
 </file>
 

</xml_diff>